<commit_message>
Identify DAB source paper in questionnaire appendix and references
Co-Authored-By: Claude Sonnet 5.5 <noreply@anthropic.com>
Claude-Session: https://claude.ai/code/session_0117HPg2G3CcnRnb2QXnVBy9
</commit_message>
<xml_diff>
--- a/questionnaire-v3-en.docx
+++ b/questionnaire-v3-en.docx
@@ -26472,7 +26472,7 @@
                 <w:szCs w:val="19"/>
                 <w:rtl w:val="false"/>
               </w:rPr>
-              <w:t xml:space="preserve">Questionnaire appendix (user-supplied image) — source paper not identified; based on Otley &amp; Pierce (1996) and Kelley &amp; Margheim (1990)</w:t>
+              <w:t xml:space="preserve">Paino, Thani &amp; Syed Ahmad, "Attitudes toward dysfunctional audit behaviour: the effect of budget emphasis, leadership behaviour, and effectiveness of audit review" (questionnaire appendix); based on Otley &amp; Pierce (1996) and Kelley &amp; Margheim (1990)</w:t>
             </w:r>
           </w:p>
         </w:tc>
@@ -26574,7 +26574,7 @@
                 <w:szCs w:val="19"/>
                 <w:rtl w:val="false"/>
               </w:rPr>
-              <w:t xml:space="preserve">Identify source paper</w:t>
+              <w:t xml:space="preserve">Confirm year, journal and full author list</w:t>
             </w:r>
           </w:p>
         </w:tc>
@@ -31093,6 +31093,21 @@
           <w:szCs w:val="20"/>
         </w:rPr>
         <w:t xml:space="preserve">Otley, D. T., &amp; Pierce, B. J. (1996). Auditor time budget pressure: Consequences and antecedents. Accounting, Auditing &amp; Accountability Journal, 9(1), 31–58. https://doi.org/10.1108/09513579610109969</w:t>
+      </w:r>
+    </w:p>
+    <w:p>
+      <w:pPr>
+        <w:bidi w:val="false"/>
+        <w:spacing w:after="80"/>
+        <w:ind w:left="360" w:hanging="360"/>
+      </w:pPr>
+      <w:r>
+        <w:rPr>
+          <w:rFonts w:ascii="Arial" w:cs="Arial" w:eastAsia="Arial" w:hAnsi="Arial"/>
+          <w:sz w:val="20"/>
+          <w:szCs w:val="20"/>
+        </w:rPr>
+        <w:t xml:space="preserve">Paino, H., Thani, A., &amp; Syed Ahmad, S. I. Z. (year ?). Attitudes toward dysfunctional audit behaviour: The effect of budget emphasis, leadership behaviour, and effectiveness of audit review. [Journal, volume and pages to be confirmed; probably Malaysian Accounting Review] (?)</w:t>
       </w:r>
     </w:p>
     <w:p>

</xml_diff>

<commit_message>
Update verification status for Edmondson and CBI; correct Tsunogaya title
Co-Authored-By: Claude Sonnet 5.5 <noreply@anthropic.com>
Claude-Session: https://claude.ai/code/session_0117HPg2G3CcnRnb2QXnVBy9
</commit_message>
<xml_diff>
--- a/questionnaire-v3-en.docx
+++ b/questionnaire-v3-en.docx
@@ -26892,7 +26892,7 @@
                 <w:szCs w:val="19"/>
                 <w:rtl w:val="false"/>
               </w:rPr>
-              <w:t xml:space="preserve">Unverified; from my knowledge. Secondary sources: 7 items, items 1, 3, 5 reversed, 5- or 7-point</w:t>
+              <w:t xml:space="preserve">Wording and reverse keys (1, 3, 5) match your report of the paper's appendix (Survey Scales and Item Correlations). Secondhand. Replacing "team" with "audit team" is an adaptation and must be reported as such. Response scale not given in the report</w:t>
             </w:r>
           </w:p>
         </w:tc>
@@ -26926,7 +26926,7 @@
                 <w:szCs w:val="19"/>
                 <w:rtl w:val="false"/>
               </w:rPr>
-              <w:t xml:space="preserve">Match to appendix</w:t>
+              <w:t xml:space="preserve">Report adaptation; confirm response scale in the paper</w:t>
             </w:r>
           </w:p>
         </w:tc>
@@ -27244,7 +27244,7 @@
                 <w:szCs w:val="19"/>
                 <w:rtl w:val="false"/>
               </w:rPr>
-              <w:t xml:space="preserve">Unverified; two items confirmed by secondary sources; free-to-use only per secondary sources</w:t>
+              <w:t xml:space="preserve">All 7 work-related items match the EMERGE (UCSD) university version you supplied; the reverse-keyed item is the "energy for family and friends" item (EX7). Response options per item (frequency vs intensity) are not confirmed; we use frequency anchors for all seven. Source is a university re-publication, not the 2005 table</w:t>
             </w:r>
           </w:p>
         </w:tc>
@@ -27278,7 +27278,7 @@
                 <w:szCs w:val="19"/>
                 <w:rtl w:val="false"/>
               </w:rPr>
-              <w:t xml:space="preserve">Match; check terms</w:t>
+              <w:t xml:space="preserve">Match options to the 2005 paper; check terms</w:t>
             </w:r>
           </w:p>
         </w:tc>
@@ -28002,7 +28002,7 @@
           <w:szCs w:val="22"/>
           <w:rtl w:val="false"/>
         </w:rPr>
-        <w:t xml:space="preserve">Reverse-keyed items: OC2, OC4, OC5; AC3, AC4, AC5; TS1, TS3, TS5; MI3, MI4; EX7 (to be confirmed); V2c. Lencioni is used only as a conceptual framework; measurement uses psychological safety and conflict (only "trust" overlaps with Lencioni). Psychological capital was dropped; the "matched buffering" proposal awaits your decision.</w:t>
+        <w:t xml:space="preserve">Reverse-keyed items: OC2, OC4, OC5; AC3, AC4, AC5; TS1, TS3, TS5; MI3, MI4; EX7; V2c. Lencioni is used only as a conceptual framework; measurement uses psychological safety and conflict (only "trust" overlaps with Lencioni). Psychological capital was dropped; the "matched buffering" proposal awaits your decision.</w:t>
       </w:r>
     </w:p>
     <w:p>
@@ -31137,7 +31137,7 @@
           <w:sz w:val="20"/>
           <w:szCs w:val="20"/>
         </w:rPr>
-        <w:t xml:space="preserve">Tsunogaya, N., Sugahara, S., &amp; Chand, P. (2017). The impact of social influence pressures, commitment and personality on dysfunctional audit behavior. Journal of International Accounting Research, 16(3), 17–34. (title end ?)</w:t>
+        <w:t xml:space="preserve">Tsunogaya, N., Sugahara, S., &amp; Chand, P. (2017). The impact of social influence pressures, commitment, and personality on judgments by auditors: Evidence from Japan. Journal of International Accounting Research, 16(3), 17–34. (title as given in your note; ?)</w:t>
       </w:r>
     </w:p>
     <w:sectPr>

</xml_diff>

<commit_message>
Use verified Otley & Pierce time-budget, fee-influence and URT items; identify DAB source
Co-Authored-By: Claude Sonnet 5.5 <noreply@anthropic.com>
Claude-Session: https://claude.ai/code/session_0117HPg2G3CcnRnb2QXnVBy9
</commit_message>
<xml_diff>
--- a/questionnaire-v3-en.docx
+++ b/questionnaire-v3-en.docx
@@ -1061,6 +1061,11 @@
       </w:r>
     </w:p>
     <w:p>
+      <w:r>
+        <w:br w:type="page"/>
+      </w:r>
+    </w:p>
+    <w:p>
       <w:pPr>
         <w:pStyle w:val="Heading2"/>
         <w:keepNext/>
@@ -1077,7 +1082,7 @@
           <w:szCs w:val="25"/>
           <w:rtl w:val="false"/>
         </w:rPr>
-        <w:t xml:space="preserve">Time pressure on the reference engagement</w:t>
+        <w:t xml:space="preserve">Time budget on the reference engagement</w:t>
       </w:r>
     </w:p>
     <w:p>
@@ -1094,7 +1099,7 @@
           <w:szCs w:val="22"/>
           <w:rtl w:val="false"/>
         </w:rPr>
-        <w:t xml:space="preserve">TB1. On the reference engagement, how much pressure from the time budget did you experience?</w:t>
+        <w:t xml:space="preserve">BT1. In general, were the time budgets for the jobs you worked on in the reference engagement:</w:t>
       </w:r>
     </w:p>
     <w:p>
@@ -1109,7 +1114,7 @@
           <w:szCs w:val="22"/>
           <w:rtl w:val="false"/>
         </w:rPr>
-        <w:t xml:space="preserve">☐ Not at all  ☐ A little  ☐ Moderately  ☐ A lot  ☐ Very much  ☐ No defined time budget / do not know</w:t>
+        <w:t xml:space="preserve">☐ Very easy to attain  ☐ Attainable with reasonable effort  ☐ Attainable with considerable effort  ☐ Very tight, practically unattainable  ☐ Impossible to achieve</w:t>
       </w:r>
     </w:p>
     <w:p>
@@ -1126,7 +1131,7 @@
           <w:szCs w:val="22"/>
           <w:rtl w:val="false"/>
         </w:rPr>
-        <w:t xml:space="preserve">TB2. On the reference engagement, how much pressure from the report deadline did you experience?</w:t>
+        <w:t xml:space="preserve">BT2. How often do you achieve your time budgets?</w:t>
       </w:r>
     </w:p>
     <w:p>
@@ -1141,7 +1146,7 @@
           <w:szCs w:val="22"/>
           <w:rtl w:val="false"/>
         </w:rPr>
-        <w:t xml:space="preserve">☐ Not at all  ☐ A little  ☐ Moderately  ☐ A lot  ☐ Very much  ☐ Was not aware of the deadline</w:t>
+        <w:t xml:space="preserve">☐ Nearly always  ☐ Often  ☐ Sometimes  ☐ Rarely  ☐ Never  ☐ Prefer not to answer</w:t>
       </w:r>
     </w:p>
     <w:p>
@@ -1158,7 +1163,7 @@
           <w:szCs w:val="22"/>
           <w:rtl w:val="false"/>
         </w:rPr>
-        <w:t xml:space="preserve">TB3. Given the work required, how adequate was the time budget set for the engagement?</w:t>
+        <w:t xml:space="preserve">BT3. If you did not under-report any time, how often would you meet budget?</w:t>
       </w:r>
     </w:p>
     <w:p>
@@ -1173,7 +1178,7 @@
           <w:szCs w:val="22"/>
           <w:rtl w:val="false"/>
         </w:rPr>
-        <w:t xml:space="preserve">☐ 1 – Completely inadequate  ☐ 2  ☐ 3  ☐ 4  ☐ 5  ☐ 6  ☐ 7 – Completely adequate  ☐ No defined time budget / do not know</w:t>
+        <w:t xml:space="preserve">☐ Nearly always  ☐ Often  ☐ Sometimes  ☐ Rarely  ☐ Never  ☐ Prefer not to answer</w:t>
       </w:r>
     </w:p>
     <w:p>
@@ -1184,30 +1189,1043 @@
       <w:r>
         <w:rPr>
           <w:rFonts w:ascii="Arial" w:cs="Arial" w:eastAsia="Arial" w:hAnsi="Arial"/>
-          <w:b/>
-          <w:bCs/>
-          <w:sz w:val="22"/>
-          <w:szCs w:val="22"/>
+          <w:sz w:val="20"/>
+          <w:szCs w:val="20"/>
           <w:rtl w:val="false"/>
         </w:rPr>
-        <w:t xml:space="preserve">IN1. On the reference engagement, how far could you raise your findings and professional judgements independently of the client's wishes?</w:t>
+        <w:t xml:space="preserve">To what extent do each of the following influence the time budgets which are set for your clients? 1 = Not at all … 5 = Very great</w:t>
       </w:r>
     </w:p>
-    <w:p>
-      <w:pPr>
-        <w:bidi w:val="false"/>
-        <w:spacing w:after="100" w:line="300"/>
-      </w:pPr>
-      <w:r>
-        <w:rPr>
-          <w:rFonts w:ascii="Arial" w:cs="Arial" w:eastAsia="Arial" w:hAnsi="Arial"/>
-          <w:sz w:val="22"/>
-          <w:szCs w:val="22"/>
-          <w:rtl w:val="false"/>
-        </w:rPr>
-        <w:t xml:space="preserve">☐ 1 – Not at all  ☐ 2  ☐ 3  ☐ 4  ☐ 5  ☐ 6  ☐ 7 – Completely  ☐ Prefer not to answer</w:t>
-      </w:r>
-    </w:p>
+    <w:tbl>
+      <w:tblPr>
+        <w:bidiVisual w:val="false"/>
+        <w:tblW w:type="dxa" w:w="9500"/>
+        <w:tblBorders>
+          <w:top w:val="single" w:color="auto" w:sz="4"/>
+          <w:left w:val="single" w:color="auto" w:sz="4"/>
+          <w:bottom w:val="single" w:color="auto" w:sz="4"/>
+          <w:right w:val="single" w:color="auto" w:sz="4"/>
+          <w:insideH w:val="single" w:color="auto" w:sz="4"/>
+          <w:insideV w:val="single" w:color="auto" w:sz="4"/>
+        </w:tblBorders>
+      </w:tblPr>
+      <w:tblGrid>
+        <w:gridCol w:w="650"/>
+        <w:gridCol w:w="5650"/>
+        <w:gridCol w:w="640"/>
+        <w:gridCol w:w="640"/>
+        <w:gridCol w:w="640"/>
+        <w:gridCol w:w="640"/>
+        <w:gridCol w:w="640"/>
+      </w:tblGrid>
+      <w:tr>
+        <w:trPr>
+          <w:cantSplit/>
+          <w:tblHeader/>
+        </w:trPr>
+        <w:tc>
+          <w:tcPr>
+            <w:tcW w:type="dxa" w:w="650"/>
+            <w:tcBorders>
+              <w:top w:val="single" w:color="A6A6A6" w:sz="4"/>
+              <w:left w:val="single" w:color="A6A6A6" w:sz="4"/>
+              <w:bottom w:val="single" w:color="A6A6A6" w:sz="4"/>
+              <w:right w:val="single" w:color="A6A6A6" w:sz="4"/>
+            </w:tcBorders>
+            <w:shd w:fill="D9E2F3" w:color="auto" w:val="clear"/>
+            <w:tcMar>
+              <w:top w:type="dxa" w:w="50"/>
+              <w:left w:type="dxa" w:w="60"/>
+              <w:bottom w:type="dxa" w:w="50"/>
+              <w:right w:type="dxa" w:w="60"/>
+            </w:tcMar>
+          </w:tcPr>
+          <w:p>
+            <w:pPr>
+              <w:bidi w:val="false"/>
+              <w:spacing w:after="0" w:line="260"/>
+              <w:jc w:val="center"/>
+            </w:pPr>
+            <w:r>
+              <w:rPr>
+                <w:rFonts w:ascii="Arial" w:cs="Arial" w:eastAsia="Arial" w:hAnsi="Arial"/>
+                <w:b/>
+                <w:bCs/>
+                <w:sz w:val="19"/>
+                <w:szCs w:val="19"/>
+                <w:rtl w:val="false"/>
+              </w:rPr>
+              <w:t xml:space="preserve"/>
+            </w:r>
+          </w:p>
+        </w:tc>
+        <w:tc>
+          <w:tcPr>
+            <w:tcW w:type="dxa" w:w="5650"/>
+            <w:tcBorders>
+              <w:top w:val="single" w:color="A6A6A6" w:sz="4"/>
+              <w:left w:val="single" w:color="A6A6A6" w:sz="4"/>
+              <w:bottom w:val="single" w:color="A6A6A6" w:sz="4"/>
+              <w:right w:val="single" w:color="A6A6A6" w:sz="4"/>
+            </w:tcBorders>
+            <w:shd w:fill="D9E2F3" w:color="auto" w:val="clear"/>
+            <w:tcMar>
+              <w:top w:type="dxa" w:w="50"/>
+              <w:left w:type="dxa" w:w="60"/>
+              <w:bottom w:type="dxa" w:w="50"/>
+              <w:right w:type="dxa" w:w="60"/>
+            </w:tcMar>
+          </w:tcPr>
+          <w:p>
+            <w:pPr>
+              <w:bidi w:val="false"/>
+              <w:spacing w:after="0" w:line="260"/>
+            </w:pPr>
+            <w:r>
+              <w:rPr>
+                <w:rFonts w:ascii="Arial" w:cs="Arial" w:eastAsia="Arial" w:hAnsi="Arial"/>
+                <w:b/>
+                <w:bCs/>
+                <w:sz w:val="19"/>
+                <w:szCs w:val="19"/>
+                <w:rtl w:val="false"/>
+              </w:rPr>
+              <w:t xml:space="preserve">Statement</w:t>
+            </w:r>
+          </w:p>
+        </w:tc>
+        <w:tc>
+          <w:tcPr>
+            <w:tcW w:type="dxa" w:w="640"/>
+            <w:tcBorders>
+              <w:top w:val="single" w:color="A6A6A6" w:sz="4"/>
+              <w:left w:val="single" w:color="A6A6A6" w:sz="4"/>
+              <w:bottom w:val="single" w:color="A6A6A6" w:sz="4"/>
+              <w:right w:val="single" w:color="A6A6A6" w:sz="4"/>
+            </w:tcBorders>
+            <w:shd w:fill="D9E2F3" w:color="auto" w:val="clear"/>
+            <w:tcMar>
+              <w:top w:type="dxa" w:w="50"/>
+              <w:left w:type="dxa" w:w="60"/>
+              <w:bottom w:type="dxa" w:w="50"/>
+              <w:right w:type="dxa" w:w="60"/>
+            </w:tcMar>
+          </w:tcPr>
+          <w:p>
+            <w:pPr>
+              <w:bidi w:val="false"/>
+              <w:spacing w:after="0" w:line="260"/>
+              <w:jc w:val="center"/>
+            </w:pPr>
+            <w:r>
+              <w:rPr>
+                <w:rFonts w:ascii="Arial" w:cs="Arial" w:eastAsia="Arial" w:hAnsi="Arial"/>
+                <w:b/>
+                <w:bCs/>
+                <w:sz w:val="15"/>
+                <w:szCs w:val="15"/>
+                <w:rtl w:val="false"/>
+              </w:rPr>
+              <w:t xml:space="preserve">1</w:t>
+            </w:r>
+          </w:p>
+        </w:tc>
+        <w:tc>
+          <w:tcPr>
+            <w:tcW w:type="dxa" w:w="640"/>
+            <w:tcBorders>
+              <w:top w:val="single" w:color="A6A6A6" w:sz="4"/>
+              <w:left w:val="single" w:color="A6A6A6" w:sz="4"/>
+              <w:bottom w:val="single" w:color="A6A6A6" w:sz="4"/>
+              <w:right w:val="single" w:color="A6A6A6" w:sz="4"/>
+            </w:tcBorders>
+            <w:shd w:fill="D9E2F3" w:color="auto" w:val="clear"/>
+            <w:tcMar>
+              <w:top w:type="dxa" w:w="50"/>
+              <w:left w:type="dxa" w:w="60"/>
+              <w:bottom w:type="dxa" w:w="50"/>
+              <w:right w:type="dxa" w:w="60"/>
+            </w:tcMar>
+          </w:tcPr>
+          <w:p>
+            <w:pPr>
+              <w:bidi w:val="false"/>
+              <w:spacing w:after="0" w:line="260"/>
+              <w:jc w:val="center"/>
+            </w:pPr>
+            <w:r>
+              <w:rPr>
+                <w:rFonts w:ascii="Arial" w:cs="Arial" w:eastAsia="Arial" w:hAnsi="Arial"/>
+                <w:b/>
+                <w:bCs/>
+                <w:sz w:val="15"/>
+                <w:szCs w:val="15"/>
+                <w:rtl w:val="false"/>
+              </w:rPr>
+              <w:t xml:space="preserve">2</w:t>
+            </w:r>
+          </w:p>
+        </w:tc>
+        <w:tc>
+          <w:tcPr>
+            <w:tcW w:type="dxa" w:w="640"/>
+            <w:tcBorders>
+              <w:top w:val="single" w:color="A6A6A6" w:sz="4"/>
+              <w:left w:val="single" w:color="A6A6A6" w:sz="4"/>
+              <w:bottom w:val="single" w:color="A6A6A6" w:sz="4"/>
+              <w:right w:val="single" w:color="A6A6A6" w:sz="4"/>
+            </w:tcBorders>
+            <w:shd w:fill="D9E2F3" w:color="auto" w:val="clear"/>
+            <w:tcMar>
+              <w:top w:type="dxa" w:w="50"/>
+              <w:left w:type="dxa" w:w="60"/>
+              <w:bottom w:type="dxa" w:w="50"/>
+              <w:right w:type="dxa" w:w="60"/>
+            </w:tcMar>
+          </w:tcPr>
+          <w:p>
+            <w:pPr>
+              <w:bidi w:val="false"/>
+              <w:spacing w:after="0" w:line="260"/>
+              <w:jc w:val="center"/>
+            </w:pPr>
+            <w:r>
+              <w:rPr>
+                <w:rFonts w:ascii="Arial" w:cs="Arial" w:eastAsia="Arial" w:hAnsi="Arial"/>
+                <w:b/>
+                <w:bCs/>
+                <w:sz w:val="15"/>
+                <w:szCs w:val="15"/>
+                <w:rtl w:val="false"/>
+              </w:rPr>
+              <w:t xml:space="preserve">3</w:t>
+            </w:r>
+          </w:p>
+        </w:tc>
+        <w:tc>
+          <w:tcPr>
+            <w:tcW w:type="dxa" w:w="640"/>
+            <w:tcBorders>
+              <w:top w:val="single" w:color="A6A6A6" w:sz="4"/>
+              <w:left w:val="single" w:color="A6A6A6" w:sz="4"/>
+              <w:bottom w:val="single" w:color="A6A6A6" w:sz="4"/>
+              <w:right w:val="single" w:color="A6A6A6" w:sz="4"/>
+            </w:tcBorders>
+            <w:shd w:fill="D9E2F3" w:color="auto" w:val="clear"/>
+            <w:tcMar>
+              <w:top w:type="dxa" w:w="50"/>
+              <w:left w:type="dxa" w:w="60"/>
+              <w:bottom w:type="dxa" w:w="50"/>
+              <w:right w:type="dxa" w:w="60"/>
+            </w:tcMar>
+          </w:tcPr>
+          <w:p>
+            <w:pPr>
+              <w:bidi w:val="false"/>
+              <w:spacing w:after="0" w:line="260"/>
+              <w:jc w:val="center"/>
+            </w:pPr>
+            <w:r>
+              <w:rPr>
+                <w:rFonts w:ascii="Arial" w:cs="Arial" w:eastAsia="Arial" w:hAnsi="Arial"/>
+                <w:b/>
+                <w:bCs/>
+                <w:sz w:val="15"/>
+                <w:szCs w:val="15"/>
+                <w:rtl w:val="false"/>
+              </w:rPr>
+              <w:t xml:space="preserve">4</w:t>
+            </w:r>
+          </w:p>
+        </w:tc>
+        <w:tc>
+          <w:tcPr>
+            <w:tcW w:type="dxa" w:w="640"/>
+            <w:tcBorders>
+              <w:top w:val="single" w:color="A6A6A6" w:sz="4"/>
+              <w:left w:val="single" w:color="A6A6A6" w:sz="4"/>
+              <w:bottom w:val="single" w:color="A6A6A6" w:sz="4"/>
+              <w:right w:val="single" w:color="A6A6A6" w:sz="4"/>
+            </w:tcBorders>
+            <w:shd w:fill="D9E2F3" w:color="auto" w:val="clear"/>
+            <w:tcMar>
+              <w:top w:type="dxa" w:w="50"/>
+              <w:left w:type="dxa" w:w="60"/>
+              <w:bottom w:type="dxa" w:w="50"/>
+              <w:right w:type="dxa" w:w="60"/>
+            </w:tcMar>
+          </w:tcPr>
+          <w:p>
+            <w:pPr>
+              <w:bidi w:val="false"/>
+              <w:spacing w:after="0" w:line="260"/>
+              <w:jc w:val="center"/>
+            </w:pPr>
+            <w:r>
+              <w:rPr>
+                <w:rFonts w:ascii="Arial" w:cs="Arial" w:eastAsia="Arial" w:hAnsi="Arial"/>
+                <w:b/>
+                <w:bCs/>
+                <w:sz w:val="15"/>
+                <w:szCs w:val="15"/>
+                <w:rtl w:val="false"/>
+              </w:rPr>
+              <w:t xml:space="preserve">5</w:t>
+            </w:r>
+          </w:p>
+        </w:tc>
+      </w:tr>
+      <w:tr>
+        <w:trPr>
+          <w:cantSplit/>
+          <w:tblHeader w:val="false"/>
+        </w:trPr>
+        <w:tc>
+          <w:tcPr>
+            <w:tcW w:type="dxa" w:w="650"/>
+            <w:tcBorders>
+              <w:top w:val="single" w:color="A6A6A6" w:sz="4"/>
+              <w:left w:val="single" w:color="A6A6A6" w:sz="4"/>
+              <w:bottom w:val="single" w:color="A6A6A6" w:sz="4"/>
+              <w:right w:val="single" w:color="A6A6A6" w:sz="4"/>
+            </w:tcBorders>
+            <w:tcMar>
+              <w:top w:type="dxa" w:w="50"/>
+              <w:left w:type="dxa" w:w="60"/>
+              <w:bottom w:type="dxa" w:w="50"/>
+              <w:right w:type="dxa" w:w="60"/>
+            </w:tcMar>
+          </w:tcPr>
+          <w:p>
+            <w:pPr>
+              <w:bidi w:val="false"/>
+              <w:spacing w:after="0" w:line="260"/>
+              <w:jc w:val="center"/>
+            </w:pPr>
+            <w:r>
+              <w:rPr>
+                <w:rFonts w:ascii="Arial" w:cs="Arial" w:eastAsia="Arial" w:hAnsi="Arial"/>
+                <w:b w:val="false"/>
+                <w:bCs w:val="false"/>
+                <w:sz w:val="19"/>
+                <w:szCs w:val="19"/>
+                <w:rtl w:val="false"/>
+              </w:rPr>
+              <w:t xml:space="preserve">FI1</w:t>
+            </w:r>
+          </w:p>
+        </w:tc>
+        <w:tc>
+          <w:tcPr>
+            <w:tcW w:type="dxa" w:w="5650"/>
+            <w:tcBorders>
+              <w:top w:val="single" w:color="A6A6A6" w:sz="4"/>
+              <w:left w:val="single" w:color="A6A6A6" w:sz="4"/>
+              <w:bottom w:val="single" w:color="A6A6A6" w:sz="4"/>
+              <w:right w:val="single" w:color="A6A6A6" w:sz="4"/>
+            </w:tcBorders>
+            <w:tcMar>
+              <w:top w:type="dxa" w:w="50"/>
+              <w:left w:type="dxa" w:w="60"/>
+              <w:bottom w:type="dxa" w:w="50"/>
+              <w:right w:type="dxa" w:w="60"/>
+            </w:tcMar>
+          </w:tcPr>
+          <w:p>
+            <w:pPr>
+              <w:bidi w:val="false"/>
+              <w:spacing w:after="0" w:line="260"/>
+            </w:pPr>
+            <w:r>
+              <w:rPr>
+                <w:rFonts w:ascii="Arial" w:cs="Arial" w:eastAsia="Arial" w:hAnsi="Arial"/>
+                <w:b w:val="false"/>
+                <w:bCs w:val="false"/>
+                <w:sz w:val="19"/>
+                <w:szCs w:val="19"/>
+                <w:rtl w:val="false"/>
+              </w:rPr>
+              <w:t xml:space="preserve">Last year's reported actual</w:t>
+            </w:r>
+          </w:p>
+        </w:tc>
+        <w:tc>
+          <w:tcPr>
+            <w:tcW w:type="dxa" w:w="640"/>
+            <w:tcBorders>
+              <w:top w:val="single" w:color="A6A6A6" w:sz="4"/>
+              <w:left w:val="single" w:color="A6A6A6" w:sz="4"/>
+              <w:bottom w:val="single" w:color="A6A6A6" w:sz="4"/>
+              <w:right w:val="single" w:color="A6A6A6" w:sz="4"/>
+            </w:tcBorders>
+            <w:tcMar>
+              <w:top w:type="dxa" w:w="50"/>
+              <w:left w:type="dxa" w:w="60"/>
+              <w:bottom w:type="dxa" w:w="50"/>
+              <w:right w:type="dxa" w:w="60"/>
+            </w:tcMar>
+          </w:tcPr>
+          <w:p>
+            <w:pPr>
+              <w:bidi w:val="false"/>
+              <w:spacing w:after="0" w:line="260"/>
+              <w:jc w:val="center"/>
+            </w:pPr>
+            <w:r>
+              <w:rPr>
+                <w:rFonts w:ascii="Arial" w:cs="Arial" w:eastAsia="Arial" w:hAnsi="Arial"/>
+                <w:b w:val="false"/>
+                <w:bCs w:val="false"/>
+                <w:sz w:val="19"/>
+                <w:szCs w:val="19"/>
+                <w:rtl w:val="false"/>
+              </w:rPr>
+              <w:t xml:space="preserve">☐</w:t>
+            </w:r>
+          </w:p>
+        </w:tc>
+        <w:tc>
+          <w:tcPr>
+            <w:tcW w:type="dxa" w:w="640"/>
+            <w:tcBorders>
+              <w:top w:val="single" w:color="A6A6A6" w:sz="4"/>
+              <w:left w:val="single" w:color="A6A6A6" w:sz="4"/>
+              <w:bottom w:val="single" w:color="A6A6A6" w:sz="4"/>
+              <w:right w:val="single" w:color="A6A6A6" w:sz="4"/>
+            </w:tcBorders>
+            <w:tcMar>
+              <w:top w:type="dxa" w:w="50"/>
+              <w:left w:type="dxa" w:w="60"/>
+              <w:bottom w:type="dxa" w:w="50"/>
+              <w:right w:type="dxa" w:w="60"/>
+            </w:tcMar>
+          </w:tcPr>
+          <w:p>
+            <w:pPr>
+              <w:bidi w:val="false"/>
+              <w:spacing w:after="0" w:line="260"/>
+              <w:jc w:val="center"/>
+            </w:pPr>
+            <w:r>
+              <w:rPr>
+                <w:rFonts w:ascii="Arial" w:cs="Arial" w:eastAsia="Arial" w:hAnsi="Arial"/>
+                <w:b w:val="false"/>
+                <w:bCs w:val="false"/>
+                <w:sz w:val="19"/>
+                <w:szCs w:val="19"/>
+                <w:rtl w:val="false"/>
+              </w:rPr>
+              <w:t xml:space="preserve">☐</w:t>
+            </w:r>
+          </w:p>
+        </w:tc>
+        <w:tc>
+          <w:tcPr>
+            <w:tcW w:type="dxa" w:w="640"/>
+            <w:tcBorders>
+              <w:top w:val="single" w:color="A6A6A6" w:sz="4"/>
+              <w:left w:val="single" w:color="A6A6A6" w:sz="4"/>
+              <w:bottom w:val="single" w:color="A6A6A6" w:sz="4"/>
+              <w:right w:val="single" w:color="A6A6A6" w:sz="4"/>
+            </w:tcBorders>
+            <w:tcMar>
+              <w:top w:type="dxa" w:w="50"/>
+              <w:left w:type="dxa" w:w="60"/>
+              <w:bottom w:type="dxa" w:w="50"/>
+              <w:right w:type="dxa" w:w="60"/>
+            </w:tcMar>
+          </w:tcPr>
+          <w:p>
+            <w:pPr>
+              <w:bidi w:val="false"/>
+              <w:spacing w:after="0" w:line="260"/>
+              <w:jc w:val="center"/>
+            </w:pPr>
+            <w:r>
+              <w:rPr>
+                <w:rFonts w:ascii="Arial" w:cs="Arial" w:eastAsia="Arial" w:hAnsi="Arial"/>
+                <w:b w:val="false"/>
+                <w:bCs w:val="false"/>
+                <w:sz w:val="19"/>
+                <w:szCs w:val="19"/>
+                <w:rtl w:val="false"/>
+              </w:rPr>
+              <w:t xml:space="preserve">☐</w:t>
+            </w:r>
+          </w:p>
+        </w:tc>
+        <w:tc>
+          <w:tcPr>
+            <w:tcW w:type="dxa" w:w="640"/>
+            <w:tcBorders>
+              <w:top w:val="single" w:color="A6A6A6" w:sz="4"/>
+              <w:left w:val="single" w:color="A6A6A6" w:sz="4"/>
+              <w:bottom w:val="single" w:color="A6A6A6" w:sz="4"/>
+              <w:right w:val="single" w:color="A6A6A6" w:sz="4"/>
+            </w:tcBorders>
+            <w:tcMar>
+              <w:top w:type="dxa" w:w="50"/>
+              <w:left w:type="dxa" w:w="60"/>
+              <w:bottom w:type="dxa" w:w="50"/>
+              <w:right w:type="dxa" w:w="60"/>
+            </w:tcMar>
+          </w:tcPr>
+          <w:p>
+            <w:pPr>
+              <w:bidi w:val="false"/>
+              <w:spacing w:after="0" w:line="260"/>
+              <w:jc w:val="center"/>
+            </w:pPr>
+            <w:r>
+              <w:rPr>
+                <w:rFonts w:ascii="Arial" w:cs="Arial" w:eastAsia="Arial" w:hAnsi="Arial"/>
+                <w:b w:val="false"/>
+                <w:bCs w:val="false"/>
+                <w:sz w:val="19"/>
+                <w:szCs w:val="19"/>
+                <w:rtl w:val="false"/>
+              </w:rPr>
+              <w:t xml:space="preserve">☐</w:t>
+            </w:r>
+          </w:p>
+        </w:tc>
+        <w:tc>
+          <w:tcPr>
+            <w:tcW w:type="dxa" w:w="640"/>
+            <w:tcBorders>
+              <w:top w:val="single" w:color="A6A6A6" w:sz="4"/>
+              <w:left w:val="single" w:color="A6A6A6" w:sz="4"/>
+              <w:bottom w:val="single" w:color="A6A6A6" w:sz="4"/>
+              <w:right w:val="single" w:color="A6A6A6" w:sz="4"/>
+            </w:tcBorders>
+            <w:tcMar>
+              <w:top w:type="dxa" w:w="50"/>
+              <w:left w:type="dxa" w:w="60"/>
+              <w:bottom w:type="dxa" w:w="50"/>
+              <w:right w:type="dxa" w:w="60"/>
+            </w:tcMar>
+          </w:tcPr>
+          <w:p>
+            <w:pPr>
+              <w:bidi w:val="false"/>
+              <w:spacing w:after="0" w:line="260"/>
+              <w:jc w:val="center"/>
+            </w:pPr>
+            <w:r>
+              <w:rPr>
+                <w:rFonts w:ascii="Arial" w:cs="Arial" w:eastAsia="Arial" w:hAnsi="Arial"/>
+                <w:b w:val="false"/>
+                <w:bCs w:val="false"/>
+                <w:sz w:val="19"/>
+                <w:szCs w:val="19"/>
+                <w:rtl w:val="false"/>
+              </w:rPr>
+              <w:t xml:space="preserve">☐</w:t>
+            </w:r>
+          </w:p>
+        </w:tc>
+      </w:tr>
+      <w:tr>
+        <w:trPr>
+          <w:cantSplit/>
+          <w:tblHeader w:val="false"/>
+        </w:trPr>
+        <w:tc>
+          <w:tcPr>
+            <w:tcW w:type="dxa" w:w="650"/>
+            <w:tcBorders>
+              <w:top w:val="single" w:color="A6A6A6" w:sz="4"/>
+              <w:left w:val="single" w:color="A6A6A6" w:sz="4"/>
+              <w:bottom w:val="single" w:color="A6A6A6" w:sz="4"/>
+              <w:right w:val="single" w:color="A6A6A6" w:sz="4"/>
+            </w:tcBorders>
+            <w:tcMar>
+              <w:top w:type="dxa" w:w="50"/>
+              <w:left w:type="dxa" w:w="60"/>
+              <w:bottom w:type="dxa" w:w="50"/>
+              <w:right w:type="dxa" w:w="60"/>
+            </w:tcMar>
+          </w:tcPr>
+          <w:p>
+            <w:pPr>
+              <w:bidi w:val="false"/>
+              <w:spacing w:after="0" w:line="260"/>
+              <w:jc w:val="center"/>
+            </w:pPr>
+            <w:r>
+              <w:rPr>
+                <w:rFonts w:ascii="Arial" w:cs="Arial" w:eastAsia="Arial" w:hAnsi="Arial"/>
+                <w:b w:val="false"/>
+                <w:bCs w:val="false"/>
+                <w:sz w:val="19"/>
+                <w:szCs w:val="19"/>
+                <w:rtl w:val="false"/>
+              </w:rPr>
+              <w:t xml:space="preserve">FI2</w:t>
+            </w:r>
+          </w:p>
+        </w:tc>
+        <w:tc>
+          <w:tcPr>
+            <w:tcW w:type="dxa" w:w="5650"/>
+            <w:tcBorders>
+              <w:top w:val="single" w:color="A6A6A6" w:sz="4"/>
+              <w:left w:val="single" w:color="A6A6A6" w:sz="4"/>
+              <w:bottom w:val="single" w:color="A6A6A6" w:sz="4"/>
+              <w:right w:val="single" w:color="A6A6A6" w:sz="4"/>
+            </w:tcBorders>
+            <w:tcMar>
+              <w:top w:type="dxa" w:w="50"/>
+              <w:left w:type="dxa" w:w="60"/>
+              <w:bottom w:type="dxa" w:w="50"/>
+              <w:right w:type="dxa" w:w="60"/>
+            </w:tcMar>
+          </w:tcPr>
+          <w:p>
+            <w:pPr>
+              <w:bidi w:val="false"/>
+              <w:spacing w:after="0" w:line="260"/>
+            </w:pPr>
+            <w:r>
+              <w:rPr>
+                <w:rFonts w:ascii="Arial" w:cs="Arial" w:eastAsia="Arial" w:hAnsi="Arial"/>
+                <w:b w:val="false"/>
+                <w:bCs w:val="false"/>
+                <w:sz w:val="19"/>
+                <w:szCs w:val="19"/>
+                <w:rtl w:val="false"/>
+              </w:rPr>
+              <w:t xml:space="preserve">Estimated time to complete audit programme</w:t>
+            </w:r>
+          </w:p>
+        </w:tc>
+        <w:tc>
+          <w:tcPr>
+            <w:tcW w:type="dxa" w:w="640"/>
+            <w:tcBorders>
+              <w:top w:val="single" w:color="A6A6A6" w:sz="4"/>
+              <w:left w:val="single" w:color="A6A6A6" w:sz="4"/>
+              <w:bottom w:val="single" w:color="A6A6A6" w:sz="4"/>
+              <w:right w:val="single" w:color="A6A6A6" w:sz="4"/>
+            </w:tcBorders>
+            <w:tcMar>
+              <w:top w:type="dxa" w:w="50"/>
+              <w:left w:type="dxa" w:w="60"/>
+              <w:bottom w:type="dxa" w:w="50"/>
+              <w:right w:type="dxa" w:w="60"/>
+            </w:tcMar>
+          </w:tcPr>
+          <w:p>
+            <w:pPr>
+              <w:bidi w:val="false"/>
+              <w:spacing w:after="0" w:line="260"/>
+              <w:jc w:val="center"/>
+            </w:pPr>
+            <w:r>
+              <w:rPr>
+                <w:rFonts w:ascii="Arial" w:cs="Arial" w:eastAsia="Arial" w:hAnsi="Arial"/>
+                <w:b w:val="false"/>
+                <w:bCs w:val="false"/>
+                <w:sz w:val="19"/>
+                <w:szCs w:val="19"/>
+                <w:rtl w:val="false"/>
+              </w:rPr>
+              <w:t xml:space="preserve">☐</w:t>
+            </w:r>
+          </w:p>
+        </w:tc>
+        <w:tc>
+          <w:tcPr>
+            <w:tcW w:type="dxa" w:w="640"/>
+            <w:tcBorders>
+              <w:top w:val="single" w:color="A6A6A6" w:sz="4"/>
+              <w:left w:val="single" w:color="A6A6A6" w:sz="4"/>
+              <w:bottom w:val="single" w:color="A6A6A6" w:sz="4"/>
+              <w:right w:val="single" w:color="A6A6A6" w:sz="4"/>
+            </w:tcBorders>
+            <w:tcMar>
+              <w:top w:type="dxa" w:w="50"/>
+              <w:left w:type="dxa" w:w="60"/>
+              <w:bottom w:type="dxa" w:w="50"/>
+              <w:right w:type="dxa" w:w="60"/>
+            </w:tcMar>
+          </w:tcPr>
+          <w:p>
+            <w:pPr>
+              <w:bidi w:val="false"/>
+              <w:spacing w:after="0" w:line="260"/>
+              <w:jc w:val="center"/>
+            </w:pPr>
+            <w:r>
+              <w:rPr>
+                <w:rFonts w:ascii="Arial" w:cs="Arial" w:eastAsia="Arial" w:hAnsi="Arial"/>
+                <w:b w:val="false"/>
+                <w:bCs w:val="false"/>
+                <w:sz w:val="19"/>
+                <w:szCs w:val="19"/>
+                <w:rtl w:val="false"/>
+              </w:rPr>
+              <w:t xml:space="preserve">☐</w:t>
+            </w:r>
+          </w:p>
+        </w:tc>
+        <w:tc>
+          <w:tcPr>
+            <w:tcW w:type="dxa" w:w="640"/>
+            <w:tcBorders>
+              <w:top w:val="single" w:color="A6A6A6" w:sz="4"/>
+              <w:left w:val="single" w:color="A6A6A6" w:sz="4"/>
+              <w:bottom w:val="single" w:color="A6A6A6" w:sz="4"/>
+              <w:right w:val="single" w:color="A6A6A6" w:sz="4"/>
+            </w:tcBorders>
+            <w:tcMar>
+              <w:top w:type="dxa" w:w="50"/>
+              <w:left w:type="dxa" w:w="60"/>
+              <w:bottom w:type="dxa" w:w="50"/>
+              <w:right w:type="dxa" w:w="60"/>
+            </w:tcMar>
+          </w:tcPr>
+          <w:p>
+            <w:pPr>
+              <w:bidi w:val="false"/>
+              <w:spacing w:after="0" w:line="260"/>
+              <w:jc w:val="center"/>
+            </w:pPr>
+            <w:r>
+              <w:rPr>
+                <w:rFonts w:ascii="Arial" w:cs="Arial" w:eastAsia="Arial" w:hAnsi="Arial"/>
+                <w:b w:val="false"/>
+                <w:bCs w:val="false"/>
+                <w:sz w:val="19"/>
+                <w:szCs w:val="19"/>
+                <w:rtl w:val="false"/>
+              </w:rPr>
+              <w:t xml:space="preserve">☐</w:t>
+            </w:r>
+          </w:p>
+        </w:tc>
+        <w:tc>
+          <w:tcPr>
+            <w:tcW w:type="dxa" w:w="640"/>
+            <w:tcBorders>
+              <w:top w:val="single" w:color="A6A6A6" w:sz="4"/>
+              <w:left w:val="single" w:color="A6A6A6" w:sz="4"/>
+              <w:bottom w:val="single" w:color="A6A6A6" w:sz="4"/>
+              <w:right w:val="single" w:color="A6A6A6" w:sz="4"/>
+            </w:tcBorders>
+            <w:tcMar>
+              <w:top w:type="dxa" w:w="50"/>
+              <w:left w:type="dxa" w:w="60"/>
+              <w:bottom w:type="dxa" w:w="50"/>
+              <w:right w:type="dxa" w:w="60"/>
+            </w:tcMar>
+          </w:tcPr>
+          <w:p>
+            <w:pPr>
+              <w:bidi w:val="false"/>
+              <w:spacing w:after="0" w:line="260"/>
+              <w:jc w:val="center"/>
+            </w:pPr>
+            <w:r>
+              <w:rPr>
+                <w:rFonts w:ascii="Arial" w:cs="Arial" w:eastAsia="Arial" w:hAnsi="Arial"/>
+                <w:b w:val="false"/>
+                <w:bCs w:val="false"/>
+                <w:sz w:val="19"/>
+                <w:szCs w:val="19"/>
+                <w:rtl w:val="false"/>
+              </w:rPr>
+              <w:t xml:space="preserve">☐</w:t>
+            </w:r>
+          </w:p>
+        </w:tc>
+        <w:tc>
+          <w:tcPr>
+            <w:tcW w:type="dxa" w:w="640"/>
+            <w:tcBorders>
+              <w:top w:val="single" w:color="A6A6A6" w:sz="4"/>
+              <w:left w:val="single" w:color="A6A6A6" w:sz="4"/>
+              <w:bottom w:val="single" w:color="A6A6A6" w:sz="4"/>
+              <w:right w:val="single" w:color="A6A6A6" w:sz="4"/>
+            </w:tcBorders>
+            <w:tcMar>
+              <w:top w:type="dxa" w:w="50"/>
+              <w:left w:type="dxa" w:w="60"/>
+              <w:bottom w:type="dxa" w:w="50"/>
+              <w:right w:type="dxa" w:w="60"/>
+            </w:tcMar>
+          </w:tcPr>
+          <w:p>
+            <w:pPr>
+              <w:bidi w:val="false"/>
+              <w:spacing w:after="0" w:line="260"/>
+              <w:jc w:val="center"/>
+            </w:pPr>
+            <w:r>
+              <w:rPr>
+                <w:rFonts w:ascii="Arial" w:cs="Arial" w:eastAsia="Arial" w:hAnsi="Arial"/>
+                <w:b w:val="false"/>
+                <w:bCs w:val="false"/>
+                <w:sz w:val="19"/>
+                <w:szCs w:val="19"/>
+                <w:rtl w:val="false"/>
+              </w:rPr>
+              <w:t xml:space="preserve">☐</w:t>
+            </w:r>
+          </w:p>
+        </w:tc>
+      </w:tr>
+      <w:tr>
+        <w:trPr>
+          <w:cantSplit/>
+          <w:tblHeader w:val="false"/>
+        </w:trPr>
+        <w:tc>
+          <w:tcPr>
+            <w:tcW w:type="dxa" w:w="650"/>
+            <w:tcBorders>
+              <w:top w:val="single" w:color="A6A6A6" w:sz="4"/>
+              <w:left w:val="single" w:color="A6A6A6" w:sz="4"/>
+              <w:bottom w:val="single" w:color="A6A6A6" w:sz="4"/>
+              <w:right w:val="single" w:color="A6A6A6" w:sz="4"/>
+            </w:tcBorders>
+            <w:tcMar>
+              <w:top w:type="dxa" w:w="50"/>
+              <w:left w:type="dxa" w:w="60"/>
+              <w:bottom w:type="dxa" w:w="50"/>
+              <w:right w:type="dxa" w:w="60"/>
+            </w:tcMar>
+          </w:tcPr>
+          <w:p>
+            <w:pPr>
+              <w:bidi w:val="false"/>
+              <w:spacing w:after="0" w:line="260"/>
+              <w:jc w:val="center"/>
+            </w:pPr>
+            <w:r>
+              <w:rPr>
+                <w:rFonts w:ascii="Arial" w:cs="Arial" w:eastAsia="Arial" w:hAnsi="Arial"/>
+                <w:b w:val="false"/>
+                <w:bCs w:val="false"/>
+                <w:sz w:val="19"/>
+                <w:szCs w:val="19"/>
+                <w:rtl w:val="false"/>
+              </w:rPr>
+              <w:t xml:space="preserve">FI3</w:t>
+            </w:r>
+          </w:p>
+        </w:tc>
+        <w:tc>
+          <w:tcPr>
+            <w:tcW w:type="dxa" w:w="5650"/>
+            <w:tcBorders>
+              <w:top w:val="single" w:color="A6A6A6" w:sz="4"/>
+              <w:left w:val="single" w:color="A6A6A6" w:sz="4"/>
+              <w:bottom w:val="single" w:color="A6A6A6" w:sz="4"/>
+              <w:right w:val="single" w:color="A6A6A6" w:sz="4"/>
+            </w:tcBorders>
+            <w:tcMar>
+              <w:top w:type="dxa" w:w="50"/>
+              <w:left w:type="dxa" w:w="60"/>
+              <w:bottom w:type="dxa" w:w="50"/>
+              <w:right w:type="dxa" w:w="60"/>
+            </w:tcMar>
+          </w:tcPr>
+          <w:p>
+            <w:pPr>
+              <w:bidi w:val="false"/>
+              <w:spacing w:after="0" w:line="260"/>
+            </w:pPr>
+            <w:r>
+              <w:rPr>
+                <w:rFonts w:ascii="Arial" w:cs="Arial" w:eastAsia="Arial" w:hAnsi="Arial"/>
+                <w:b w:val="false"/>
+                <w:bCs w:val="false"/>
+                <w:sz w:val="19"/>
+                <w:szCs w:val="19"/>
+                <w:rtl w:val="false"/>
+              </w:rPr>
+              <w:t xml:space="preserve">Fees expected by clients</w:t>
+            </w:r>
+          </w:p>
+        </w:tc>
+        <w:tc>
+          <w:tcPr>
+            <w:tcW w:type="dxa" w:w="640"/>
+            <w:tcBorders>
+              <w:top w:val="single" w:color="A6A6A6" w:sz="4"/>
+              <w:left w:val="single" w:color="A6A6A6" w:sz="4"/>
+              <w:bottom w:val="single" w:color="A6A6A6" w:sz="4"/>
+              <w:right w:val="single" w:color="A6A6A6" w:sz="4"/>
+            </w:tcBorders>
+            <w:tcMar>
+              <w:top w:type="dxa" w:w="50"/>
+              <w:left w:type="dxa" w:w="60"/>
+              <w:bottom w:type="dxa" w:w="50"/>
+              <w:right w:type="dxa" w:w="60"/>
+            </w:tcMar>
+          </w:tcPr>
+          <w:p>
+            <w:pPr>
+              <w:bidi w:val="false"/>
+              <w:spacing w:after="0" w:line="260"/>
+              <w:jc w:val="center"/>
+            </w:pPr>
+            <w:r>
+              <w:rPr>
+                <w:rFonts w:ascii="Arial" w:cs="Arial" w:eastAsia="Arial" w:hAnsi="Arial"/>
+                <w:b w:val="false"/>
+                <w:bCs w:val="false"/>
+                <w:sz w:val="19"/>
+                <w:szCs w:val="19"/>
+                <w:rtl w:val="false"/>
+              </w:rPr>
+              <w:t xml:space="preserve">☐</w:t>
+            </w:r>
+          </w:p>
+        </w:tc>
+        <w:tc>
+          <w:tcPr>
+            <w:tcW w:type="dxa" w:w="640"/>
+            <w:tcBorders>
+              <w:top w:val="single" w:color="A6A6A6" w:sz="4"/>
+              <w:left w:val="single" w:color="A6A6A6" w:sz="4"/>
+              <w:bottom w:val="single" w:color="A6A6A6" w:sz="4"/>
+              <w:right w:val="single" w:color="A6A6A6" w:sz="4"/>
+            </w:tcBorders>
+            <w:tcMar>
+              <w:top w:type="dxa" w:w="50"/>
+              <w:left w:type="dxa" w:w="60"/>
+              <w:bottom w:type="dxa" w:w="50"/>
+              <w:right w:type="dxa" w:w="60"/>
+            </w:tcMar>
+          </w:tcPr>
+          <w:p>
+            <w:pPr>
+              <w:bidi w:val="false"/>
+              <w:spacing w:after="0" w:line="260"/>
+              <w:jc w:val="center"/>
+            </w:pPr>
+            <w:r>
+              <w:rPr>
+                <w:rFonts w:ascii="Arial" w:cs="Arial" w:eastAsia="Arial" w:hAnsi="Arial"/>
+                <w:b w:val="false"/>
+                <w:bCs w:val="false"/>
+                <w:sz w:val="19"/>
+                <w:szCs w:val="19"/>
+                <w:rtl w:val="false"/>
+              </w:rPr>
+              <w:t xml:space="preserve">☐</w:t>
+            </w:r>
+          </w:p>
+        </w:tc>
+        <w:tc>
+          <w:tcPr>
+            <w:tcW w:type="dxa" w:w="640"/>
+            <w:tcBorders>
+              <w:top w:val="single" w:color="A6A6A6" w:sz="4"/>
+              <w:left w:val="single" w:color="A6A6A6" w:sz="4"/>
+              <w:bottom w:val="single" w:color="A6A6A6" w:sz="4"/>
+              <w:right w:val="single" w:color="A6A6A6" w:sz="4"/>
+            </w:tcBorders>
+            <w:tcMar>
+              <w:top w:type="dxa" w:w="50"/>
+              <w:left w:type="dxa" w:w="60"/>
+              <w:bottom w:type="dxa" w:w="50"/>
+              <w:right w:type="dxa" w:w="60"/>
+            </w:tcMar>
+          </w:tcPr>
+          <w:p>
+            <w:pPr>
+              <w:bidi w:val="false"/>
+              <w:spacing w:after="0" w:line="260"/>
+              <w:jc w:val="center"/>
+            </w:pPr>
+            <w:r>
+              <w:rPr>
+                <w:rFonts w:ascii="Arial" w:cs="Arial" w:eastAsia="Arial" w:hAnsi="Arial"/>
+                <w:b w:val="false"/>
+                <w:bCs w:val="false"/>
+                <w:sz w:val="19"/>
+                <w:szCs w:val="19"/>
+                <w:rtl w:val="false"/>
+              </w:rPr>
+              <w:t xml:space="preserve">☐</w:t>
+            </w:r>
+          </w:p>
+        </w:tc>
+        <w:tc>
+          <w:tcPr>
+            <w:tcW w:type="dxa" w:w="640"/>
+            <w:tcBorders>
+              <w:top w:val="single" w:color="A6A6A6" w:sz="4"/>
+              <w:left w:val="single" w:color="A6A6A6" w:sz="4"/>
+              <w:bottom w:val="single" w:color="A6A6A6" w:sz="4"/>
+              <w:right w:val="single" w:color="A6A6A6" w:sz="4"/>
+            </w:tcBorders>
+            <w:tcMar>
+              <w:top w:type="dxa" w:w="50"/>
+              <w:left w:type="dxa" w:w="60"/>
+              <w:bottom w:type="dxa" w:w="50"/>
+              <w:right w:type="dxa" w:w="60"/>
+            </w:tcMar>
+          </w:tcPr>
+          <w:p>
+            <w:pPr>
+              <w:bidi w:val="false"/>
+              <w:spacing w:after="0" w:line="260"/>
+              <w:jc w:val="center"/>
+            </w:pPr>
+            <w:r>
+              <w:rPr>
+                <w:rFonts w:ascii="Arial" w:cs="Arial" w:eastAsia="Arial" w:hAnsi="Arial"/>
+                <w:b w:val="false"/>
+                <w:bCs w:val="false"/>
+                <w:sz w:val="19"/>
+                <w:szCs w:val="19"/>
+                <w:rtl w:val="false"/>
+              </w:rPr>
+              <w:t xml:space="preserve">☐</w:t>
+            </w:r>
+          </w:p>
+        </w:tc>
+        <w:tc>
+          <w:tcPr>
+            <w:tcW w:type="dxa" w:w="640"/>
+            <w:tcBorders>
+              <w:top w:val="single" w:color="A6A6A6" w:sz="4"/>
+              <w:left w:val="single" w:color="A6A6A6" w:sz="4"/>
+              <w:bottom w:val="single" w:color="A6A6A6" w:sz="4"/>
+              <w:right w:val="single" w:color="A6A6A6" w:sz="4"/>
+            </w:tcBorders>
+            <w:tcMar>
+              <w:top w:type="dxa" w:w="50"/>
+              <w:left w:type="dxa" w:w="60"/>
+              <w:bottom w:type="dxa" w:w="50"/>
+              <w:right w:type="dxa" w:w="60"/>
+            </w:tcMar>
+          </w:tcPr>
+          <w:p>
+            <w:pPr>
+              <w:bidi w:val="false"/>
+              <w:spacing w:after="0" w:line="260"/>
+              <w:jc w:val="center"/>
+            </w:pPr>
+            <w:r>
+              <w:rPr>
+                <w:rFonts w:ascii="Arial" w:cs="Arial" w:eastAsia="Arial" w:hAnsi="Arial"/>
+                <w:b w:val="false"/>
+                <w:bCs w:val="false"/>
+                <w:sz w:val="19"/>
+                <w:szCs w:val="19"/>
+                <w:rtl w:val="false"/>
+              </w:rPr>
+              <w:t xml:space="preserve">☐</w:t>
+            </w:r>
+          </w:p>
+        </w:tc>
+      </w:tr>
+    </w:tbl>
     <w:p>
       <w:r>
         <w:br w:type="page"/>
@@ -16703,7 +17721,7 @@
                 <w:szCs w:val="19"/>
                 <w:rtl w:val="false"/>
               </w:rPr>
-              <w:t xml:space="preserve">Recorded less time than actually worked.</w:t>
+              <w:t xml:space="preserve">Recorded less time than actually worked in order to meet budget.</w:t>
             </w:r>
           </w:p>
         </w:tc>
@@ -19017,7 +20035,7 @@
                 <w:szCs w:val="19"/>
                 <w:rtl w:val="false"/>
               </w:rPr>
-              <w:t xml:space="preserve">Recorded less time than I actually worked.</w:t>
+              <w:t xml:space="preserve">To meet budget, I worked on my personal time without recording the hours.</w:t>
             </w:r>
           </w:p>
         </w:tc>
@@ -19337,7 +20355,7 @@
                 <w:szCs w:val="19"/>
                 <w:rtl w:val="false"/>
               </w:rPr>
-              <w:t xml:space="preserve">To avoid friction with the client, I played down or did not raise a finding or adjustment.</w:t>
+              <w:t xml:space="preserve">To meet budget, I shifted part of my time to non-chargeable codes.</w:t>
             </w:r>
           </w:p>
         </w:tc>
@@ -26472,7 +27490,7 @@
                 <w:szCs w:val="19"/>
                 <w:rtl w:val="false"/>
               </w:rPr>
-              <w:t xml:space="preserve">Paino, Thani &amp; Syed Ahmad, "Attitudes toward dysfunctional audit behaviour: the effect of budget emphasis, leadership behaviour, and effectiveness of audit review" (questionnaire appendix); based on Otley &amp; Pierce (1996) and Kelley &amp; Margheim (1990)</w:t>
+              <w:t xml:space="preserve">Otley &amp; Pierce (1996), Appendix questions 6 and 7 (based on Alderman &amp; Deitrick 1982; Kelley &amp; Margheim 1987, 1990). The same behaviours are used by Paino, Thani &amp; Syed Ahmad</w:t>
             </w:r>
           </w:p>
         </w:tc>
@@ -26540,7 +27558,7 @@
                 <w:szCs w:val="19"/>
                 <w:rtl w:val="false"/>
               </w:rPr>
-              <w:t xml:space="preserve">VERIFIED: five behaviours verbatim. Scale NA = 5 … N = 1. Source reference period was "past year"; adapted to "reference engagement"</w:t>
+              <w:t xml:space="preserve">VERIFIED: five behaviours verbatim. The percentages in your image (37, 41, 29, 33, 26 and 28%) match Otley &amp; Pierce's text exactly, so the image comes from that paper. Scale Nearly always = 5 … Never = 1. Source reference period was "past year"; adapted to "reference engagement"</w:t>
             </w:r>
           </w:p>
         </w:tc>
@@ -26574,7 +27592,7 @@
                 <w:szCs w:val="19"/>
                 <w:rtl w:val="false"/>
               </w:rPr>
-              <w:t xml:space="preserve">Confirm year, journal and full author list</w:t>
+              <w:t xml:space="preserve">Cite Paino as a later application</w:t>
             </w:r>
           </w:p>
         </w:tc>
@@ -26614,7 +27632,7 @@
                 <w:szCs w:val="19"/>
                 <w:rtl w:val="false"/>
               </w:rPr>
-              <w:t xml:space="preserve">Added DAB items</w:t>
+              <w:t xml:space="preserve">Under-reporting of time (URT)</w:t>
             </w:r>
           </w:p>
         </w:tc>
@@ -26648,7 +27666,7 @@
                 <w:szCs w:val="19"/>
                 <w:rtl w:val="false"/>
               </w:rPr>
-              <w:t xml:space="preserve">Researcher-made</w:t>
+              <w:t xml:space="preserve">Otley &amp; Pierce (1996), Table VIII (after Kelley &amp; Seiler 1982) and the dysfunctional-behaviour section</w:t>
             </w:r>
           </w:p>
         </w:tc>
@@ -26716,7 +27734,7 @@
                 <w:szCs w:val="19"/>
                 <w:rtl w:val="false"/>
               </w:rPr>
-              <w:t xml:space="preserve">Unverified: under-recording time (DB6/PN6); accommodating the client (DB7)</w:t>
+              <w:t xml:space="preserve">Structure VERIFIED: URT measured by a direct question and a question about "seniors in general"; two Table VIII responses ("working on personal time", "shift time to non-chargeable") are table labels. Full wording of DB6, DB7, PN6 is mine</w:t>
             </w:r>
           </w:p>
         </w:tc>
@@ -26750,7 +27768,7 @@
                 <w:szCs w:val="19"/>
                 <w:rtl w:val="false"/>
               </w:rPr>
-              <w:t xml:space="preserve">Analyse separately from the 5-item core</w:t>
+              <w:t xml:space="preserve">Match wording to paper; permission</w:t>
             </w:r>
           </w:p>
         </w:tc>
@@ -27846,7 +28864,7 @@
                 <w:szCs w:val="19"/>
                 <w:rtl w:val="false"/>
               </w:rPr>
-              <w:t xml:space="preserve">Time pressure</w:t>
+              <w:t xml:space="preserve">Time-budget pressure</w:t>
             </w:r>
           </w:p>
         </w:tc>
@@ -27880,7 +28898,7 @@
                 <w:szCs w:val="19"/>
                 <w:rtl w:val="false"/>
               </w:rPr>
-              <w:t xml:space="preserve">TB1–TB3 from your draft</w:t>
+              <w:t xml:space="preserve">Otley &amp; Pierce (1996), Table II (Q1 after Kelley &amp; Seiler 1982 and Kelley &amp; Margheim 1990; Q2–Q3 their own)</w:t>
             </w:r>
           </w:p>
         </w:tc>
@@ -27948,7 +28966,7 @@
                 <w:szCs w:val="19"/>
                 <w:rtl w:val="false"/>
               </w:rPr>
-              <w:t xml:space="preserve">Not a published instrument</w:t>
+              <w:t xml:space="preserve">VERIFIED: wording and options (5 to 1). Correlations 0.64–0.67; composite alpha 0.85 (per your text). Q3 presupposes under-reporting and is sensitive</w:t>
             </w:r>
           </w:p>
         </w:tc>
@@ -27982,7 +29000,183 @@
                 <w:szCs w:val="19"/>
                 <w:rtl w:val="false"/>
               </w:rPr>
-              <w:t xml:space="preserve">Replace after matching</w:t>
+              <w:t xml:space="preserve">Wording changed from "last year" to "reference engagement"; adaptation</w:t>
+            </w:r>
+          </w:p>
+        </w:tc>
+      </w:tr>
+      <w:tr>
+        <w:trPr>
+          <w:cantSplit/>
+          <w:tblHeader w:val="false"/>
+        </w:trPr>
+        <w:tc>
+          <w:tcPr>
+            <w:tcW w:type="dxa" w:w="1500"/>
+            <w:tcBorders>
+              <w:top w:val="single" w:color="A6A6A6" w:sz="4"/>
+              <w:left w:val="single" w:color="A6A6A6" w:sz="4"/>
+              <w:bottom w:val="single" w:color="A6A6A6" w:sz="4"/>
+              <w:right w:val="single" w:color="A6A6A6" w:sz="4"/>
+            </w:tcBorders>
+            <w:tcMar>
+              <w:top w:type="dxa" w:w="50"/>
+              <w:left w:type="dxa" w:w="60"/>
+              <w:bottom w:type="dxa" w:w="50"/>
+              <w:right w:type="dxa" w:w="60"/>
+            </w:tcMar>
+          </w:tcPr>
+          <w:p>
+            <w:pPr>
+              <w:bidi w:val="false"/>
+              <w:spacing w:after="0" w:line="260"/>
+            </w:pPr>
+            <w:r>
+              <w:rPr>
+                <w:rFonts w:ascii="Arial" w:cs="Arial" w:eastAsia="Arial" w:hAnsi="Arial"/>
+                <w:b w:val="false"/>
+                <w:bCs w:val="false"/>
+                <w:sz w:val="19"/>
+                <w:szCs w:val="19"/>
+                <w:rtl w:val="false"/>
+              </w:rPr>
+              <w:t xml:space="preserve">Influence over time budgets (client fee expectation)</w:t>
+            </w:r>
+          </w:p>
+        </w:tc>
+        <w:tc>
+          <w:tcPr>
+            <w:tcW w:type="dxa" w:w="2200"/>
+            <w:tcBorders>
+              <w:top w:val="single" w:color="A6A6A6" w:sz="4"/>
+              <w:left w:val="single" w:color="A6A6A6" w:sz="4"/>
+              <w:bottom w:val="single" w:color="A6A6A6" w:sz="4"/>
+              <w:right w:val="single" w:color="A6A6A6" w:sz="4"/>
+            </w:tcBorders>
+            <w:tcMar>
+              <w:top w:type="dxa" w:w="50"/>
+              <w:left w:type="dxa" w:w="60"/>
+              <w:bottom w:type="dxa" w:w="50"/>
+              <w:right w:type="dxa" w:w="60"/>
+            </w:tcMar>
+          </w:tcPr>
+          <w:p>
+            <w:pPr>
+              <w:bidi w:val="false"/>
+              <w:spacing w:after="0" w:line="260"/>
+            </w:pPr>
+            <w:r>
+              <w:rPr>
+                <w:rFonts w:ascii="Arial" w:cs="Arial" w:eastAsia="Arial" w:hAnsi="Arial"/>
+                <w:b w:val="false"/>
+                <w:bCs w:val="false"/>
+                <w:sz w:val="19"/>
+                <w:szCs w:val="19"/>
+                <w:rtl w:val="false"/>
+              </w:rPr>
+              <w:t xml:space="preserve">Otley &amp; Pierce (1996), Table IV</w:t>
+            </w:r>
+          </w:p>
+        </w:tc>
+        <w:tc>
+          <w:tcPr>
+            <w:tcW w:type="dxa" w:w="800"/>
+            <w:tcBorders>
+              <w:top w:val="single" w:color="A6A6A6" w:sz="4"/>
+              <w:left w:val="single" w:color="A6A6A6" w:sz="4"/>
+              <w:bottom w:val="single" w:color="A6A6A6" w:sz="4"/>
+              <w:right w:val="single" w:color="A6A6A6" w:sz="4"/>
+            </w:tcBorders>
+            <w:tcMar>
+              <w:top w:type="dxa" w:w="50"/>
+              <w:left w:type="dxa" w:w="60"/>
+              <w:bottom w:type="dxa" w:w="50"/>
+              <w:right w:type="dxa" w:w="60"/>
+            </w:tcMar>
+          </w:tcPr>
+          <w:p>
+            <w:pPr>
+              <w:bidi w:val="false"/>
+              <w:spacing w:after="0" w:line="260"/>
+            </w:pPr>
+            <w:r>
+              <w:rPr>
+                <w:rFonts w:ascii="Arial" w:cs="Arial" w:eastAsia="Arial" w:hAnsi="Arial"/>
+                <w:b w:val="false"/>
+                <w:bCs w:val="false"/>
+                <w:sz w:val="19"/>
+                <w:szCs w:val="19"/>
+                <w:rtl w:val="false"/>
+              </w:rPr>
+              <w:t xml:space="preserve">3</w:t>
+            </w:r>
+          </w:p>
+        </w:tc>
+        <w:tc>
+          <w:tcPr>
+            <w:tcW w:type="dxa" w:w="3000"/>
+            <w:tcBorders>
+              <w:top w:val="single" w:color="A6A6A6" w:sz="4"/>
+              <w:left w:val="single" w:color="A6A6A6" w:sz="4"/>
+              <w:bottom w:val="single" w:color="A6A6A6" w:sz="4"/>
+              <w:right w:val="single" w:color="A6A6A6" w:sz="4"/>
+            </w:tcBorders>
+            <w:tcMar>
+              <w:top w:type="dxa" w:w="50"/>
+              <w:left w:type="dxa" w:w="60"/>
+              <w:bottom w:type="dxa" w:w="50"/>
+              <w:right w:type="dxa" w:w="60"/>
+            </w:tcMar>
+          </w:tcPr>
+          <w:p>
+            <w:pPr>
+              <w:bidi w:val="false"/>
+              <w:spacing w:after="0" w:line="260"/>
+            </w:pPr>
+            <w:r>
+              <w:rPr>
+                <w:rFonts w:ascii="Arial" w:cs="Arial" w:eastAsia="Arial" w:hAnsi="Arial"/>
+                <w:b w:val="false"/>
+                <w:bCs w:val="false"/>
+                <w:sz w:val="19"/>
+                <w:szCs w:val="19"/>
+                <w:rtl w:val="false"/>
+              </w:rPr>
+              <w:t xml:space="preserve">VERIFIED: question and three options, 1–5. "Fees expected by clients" can indicate client pressure</w:t>
+            </w:r>
+          </w:p>
+        </w:tc>
+        <w:tc>
+          <w:tcPr>
+            <w:tcW w:type="dxa" w:w="2000"/>
+            <w:tcBorders>
+              <w:top w:val="single" w:color="A6A6A6" w:sz="4"/>
+              <w:left w:val="single" w:color="A6A6A6" w:sz="4"/>
+              <w:bottom w:val="single" w:color="A6A6A6" w:sz="4"/>
+              <w:right w:val="single" w:color="A6A6A6" w:sz="4"/>
+            </w:tcBorders>
+            <w:tcMar>
+              <w:top w:type="dxa" w:w="50"/>
+              <w:left w:type="dxa" w:w="60"/>
+              <w:bottom w:type="dxa" w:w="50"/>
+              <w:right w:type="dxa" w:w="60"/>
+            </w:tcMar>
+          </w:tcPr>
+          <w:p>
+            <w:pPr>
+              <w:bidi w:val="false"/>
+              <w:spacing w:after="0" w:line="260"/>
+            </w:pPr>
+            <w:r>
+              <w:rPr>
+                <w:rFonts w:ascii="Arial" w:cs="Arial" w:eastAsia="Arial" w:hAnsi="Arial"/>
+                <w:b w:val="false"/>
+                <w:bCs w:val="false"/>
+                <w:sz w:val="19"/>
+                <w:szCs w:val="19"/>
+                <w:rtl w:val="false"/>
+              </w:rPr>
+              <w:t xml:space="preserve">Useful for Paper 2</w:t>
             </w:r>
           </w:p>
         </w:tc>
@@ -30607,7 +31801,7 @@
                 <w:szCs w:val="19"/>
                 <w:rtl w:val="false"/>
               </w:rPr>
-              <w:t xml:space="preserve">Time pressure</w:t>
+              <w:t xml:space="preserve">Time-budget pressure</w:t>
             </w:r>
           </w:p>
         </w:tc>
@@ -30641,7 +31835,7 @@
                 <w:szCs w:val="19"/>
                 <w:rtl w:val="false"/>
               </w:rPr>
-              <w:t xml:space="preserve">TB1–TB3</w:t>
+              <w:t xml:space="preserve">BT1–BT3</w:t>
             </w:r>
           </w:p>
         </w:tc>
@@ -30709,7 +31903,7 @@
                 <w:szCs w:val="19"/>
                 <w:rtl w:val="false"/>
               </w:rPr>
-              <w:t xml:space="preserve">5- &amp; 7-pt</w:t>
+              <w:t xml:space="preserve">5-pt</w:t>
             </w:r>
           </w:p>
         </w:tc>
@@ -30777,7 +31971,217 @@
                 <w:szCs w:val="19"/>
                 <w:rtl w:val="false"/>
               </w:rPr>
-              <w:t xml:space="preserve">z; TB3 reversed</w:t>
+              <w:t xml:space="preserve">Mean composite (reported alpha .85); BT1: 5 = easy … 1 = impossible</w:t>
+            </w:r>
+          </w:p>
+        </w:tc>
+      </w:tr>
+      <w:tr>
+        <w:trPr>
+          <w:cantSplit/>
+          <w:tblHeader w:val="false"/>
+        </w:trPr>
+        <w:tc>
+          <w:tcPr>
+            <w:tcW w:type="dxa" w:w="1700"/>
+            <w:tcBorders>
+              <w:top w:val="single" w:color="A6A6A6" w:sz="4"/>
+              <w:left w:val="single" w:color="A6A6A6" w:sz="4"/>
+              <w:bottom w:val="single" w:color="A6A6A6" w:sz="4"/>
+              <w:right w:val="single" w:color="A6A6A6" w:sz="4"/>
+            </w:tcBorders>
+            <w:tcMar>
+              <w:top w:type="dxa" w:w="50"/>
+              <w:left w:type="dxa" w:w="60"/>
+              <w:bottom w:type="dxa" w:w="50"/>
+              <w:right w:type="dxa" w:w="60"/>
+            </w:tcMar>
+          </w:tcPr>
+          <w:p>
+            <w:pPr>
+              <w:bidi w:val="false"/>
+              <w:spacing w:after="0" w:line="260"/>
+            </w:pPr>
+            <w:r>
+              <w:rPr>
+                <w:rFonts w:ascii="Arial" w:cs="Arial" w:eastAsia="Arial" w:hAnsi="Arial"/>
+                <w:b w:val="false"/>
+                <w:bCs w:val="false"/>
+                <w:sz w:val="19"/>
+                <w:szCs w:val="19"/>
+                <w:rtl w:val="false"/>
+              </w:rPr>
+              <w:t xml:space="preserve">Influence over budgets</w:t>
+            </w:r>
+          </w:p>
+        </w:tc>
+        <w:tc>
+          <w:tcPr>
+            <w:tcW w:type="dxa" w:w="1700"/>
+            <w:tcBorders>
+              <w:top w:val="single" w:color="A6A6A6" w:sz="4"/>
+              <w:left w:val="single" w:color="A6A6A6" w:sz="4"/>
+              <w:bottom w:val="single" w:color="A6A6A6" w:sz="4"/>
+              <w:right w:val="single" w:color="A6A6A6" w:sz="4"/>
+            </w:tcBorders>
+            <w:tcMar>
+              <w:top w:type="dxa" w:w="50"/>
+              <w:left w:type="dxa" w:w="60"/>
+              <w:bottom w:type="dxa" w:w="50"/>
+              <w:right w:type="dxa" w:w="60"/>
+            </w:tcMar>
+          </w:tcPr>
+          <w:p>
+            <w:pPr>
+              <w:bidi w:val="false"/>
+              <w:spacing w:after="0" w:line="260"/>
+            </w:pPr>
+            <w:r>
+              <w:rPr>
+                <w:rFonts w:ascii="Arial" w:cs="Arial" w:eastAsia="Arial" w:hAnsi="Arial"/>
+                <w:b w:val="false"/>
+                <w:bCs w:val="false"/>
+                <w:sz w:val="19"/>
+                <w:szCs w:val="19"/>
+                <w:rtl w:val="false"/>
+              </w:rPr>
+              <w:t xml:space="preserve">FI1–FI3</w:t>
+            </w:r>
+          </w:p>
+        </w:tc>
+        <w:tc>
+          <w:tcPr>
+            <w:tcW w:type="dxa" w:w="700"/>
+            <w:tcBorders>
+              <w:top w:val="single" w:color="A6A6A6" w:sz="4"/>
+              <w:left w:val="single" w:color="A6A6A6" w:sz="4"/>
+              <w:bottom w:val="single" w:color="A6A6A6" w:sz="4"/>
+              <w:right w:val="single" w:color="A6A6A6" w:sz="4"/>
+            </w:tcBorders>
+            <w:tcMar>
+              <w:top w:type="dxa" w:w="50"/>
+              <w:left w:type="dxa" w:w="60"/>
+              <w:bottom w:type="dxa" w:w="50"/>
+              <w:right w:type="dxa" w:w="60"/>
+            </w:tcMar>
+          </w:tcPr>
+          <w:p>
+            <w:pPr>
+              <w:bidi w:val="false"/>
+              <w:spacing w:after="0" w:line="260"/>
+            </w:pPr>
+            <w:r>
+              <w:rPr>
+                <w:rFonts w:ascii="Arial" w:cs="Arial" w:eastAsia="Arial" w:hAnsi="Arial"/>
+                <w:b w:val="false"/>
+                <w:bCs w:val="false"/>
+                <w:sz w:val="19"/>
+                <w:szCs w:val="19"/>
+                <w:rtl w:val="false"/>
+              </w:rPr>
+              <w:t xml:space="preserve">3</w:t>
+            </w:r>
+          </w:p>
+        </w:tc>
+        <w:tc>
+          <w:tcPr>
+            <w:tcW w:type="dxa" w:w="1700"/>
+            <w:tcBorders>
+              <w:top w:val="single" w:color="A6A6A6" w:sz="4"/>
+              <w:left w:val="single" w:color="A6A6A6" w:sz="4"/>
+              <w:bottom w:val="single" w:color="A6A6A6" w:sz="4"/>
+              <w:right w:val="single" w:color="A6A6A6" w:sz="4"/>
+            </w:tcBorders>
+            <w:tcMar>
+              <w:top w:type="dxa" w:w="50"/>
+              <w:left w:type="dxa" w:w="60"/>
+              <w:bottom w:type="dxa" w:w="50"/>
+              <w:right w:type="dxa" w:w="60"/>
+            </w:tcMar>
+          </w:tcPr>
+          <w:p>
+            <w:pPr>
+              <w:bidi w:val="false"/>
+              <w:spacing w:after="0" w:line="260"/>
+            </w:pPr>
+            <w:r>
+              <w:rPr>
+                <w:rFonts w:ascii="Arial" w:cs="Arial" w:eastAsia="Arial" w:hAnsi="Arial"/>
+                <w:b w:val="false"/>
+                <w:bCs w:val="false"/>
+                <w:sz w:val="19"/>
+                <w:szCs w:val="19"/>
+                <w:rtl w:val="false"/>
+              </w:rPr>
+              <w:t xml:space="preserve">5-pt</w:t>
+            </w:r>
+          </w:p>
+        </w:tc>
+        <w:tc>
+          <w:tcPr>
+            <w:tcW w:type="dxa" w:w="1700"/>
+            <w:tcBorders>
+              <w:top w:val="single" w:color="A6A6A6" w:sz="4"/>
+              <w:left w:val="single" w:color="A6A6A6" w:sz="4"/>
+              <w:bottom w:val="single" w:color="A6A6A6" w:sz="4"/>
+              <w:right w:val="single" w:color="A6A6A6" w:sz="4"/>
+            </w:tcBorders>
+            <w:tcMar>
+              <w:top w:type="dxa" w:w="50"/>
+              <w:left w:type="dxa" w:w="60"/>
+              <w:bottom w:type="dxa" w:w="50"/>
+              <w:right w:type="dxa" w:w="60"/>
+            </w:tcMar>
+          </w:tcPr>
+          <w:p>
+            <w:pPr>
+              <w:bidi w:val="false"/>
+              <w:spacing w:after="0" w:line="260"/>
+            </w:pPr>
+            <w:r>
+              <w:rPr>
+                <w:rFonts w:ascii="Arial" w:cs="Arial" w:eastAsia="Arial" w:hAnsi="Arial"/>
+                <w:b w:val="false"/>
+                <w:bCs w:val="false"/>
+                <w:sz w:val="19"/>
+                <w:szCs w:val="19"/>
+                <w:rtl w:val="false"/>
+              </w:rPr>
+              <w:t xml:space="preserve">Individual</w:t>
+            </w:r>
+          </w:p>
+        </w:tc>
+        <w:tc>
+          <w:tcPr>
+            <w:tcW w:type="dxa" w:w="2000"/>
+            <w:tcBorders>
+              <w:top w:val="single" w:color="A6A6A6" w:sz="4"/>
+              <w:left w:val="single" w:color="A6A6A6" w:sz="4"/>
+              <w:bottom w:val="single" w:color="A6A6A6" w:sz="4"/>
+              <w:right w:val="single" w:color="A6A6A6" w:sz="4"/>
+            </w:tcBorders>
+            <w:tcMar>
+              <w:top w:type="dxa" w:w="50"/>
+              <w:left w:type="dxa" w:w="60"/>
+              <w:bottom w:type="dxa" w:w="50"/>
+              <w:right w:type="dxa" w:w="60"/>
+            </w:tcMar>
+          </w:tcPr>
+          <w:p>
+            <w:pPr>
+              <w:bidi w:val="false"/>
+              <w:spacing w:after="0" w:line="260"/>
+            </w:pPr>
+            <w:r>
+              <w:rPr>
+                <w:rFonts w:ascii="Arial" w:cs="Arial" w:eastAsia="Arial" w:hAnsi="Arial"/>
+                <w:b w:val="false"/>
+                <w:bCs w:val="false"/>
+                <w:sz w:val="19"/>
+                <w:szCs w:val="19"/>
+                <w:rtl w:val="false"/>
+              </w:rPr>
+              <w:t xml:space="preserve">FI3 = fee-expectation pressure</w:t>
             </w:r>
           </w:p>
         </w:tc>

</xml_diff>

<commit_message>
Apply verified Jehn, Aquino & Reed, CBI response types and Edmondson scale to questionnaire
Co-Authored-By: Claude Sonnet 5.5 <noreply@anthropic.com>
Claude-Session: https://claude.ai/code/session_0117HPg2G3CcnRnb2QXnVBy9
</commit_message>
<xml_diff>
--- a/questionnaire-v3-en.docx
+++ b/questionnaire-v3-en.docx
@@ -2280,7 +2280,7 @@
           <w:szCs w:val="19"/>
           <w:rtl w:val="false"/>
         </w:rPr>
-        <w:t xml:space="preserve">1 = Strongly disagree … 4 = Neither … 7 = Strongly agree</w:t>
+        <w:t xml:space="preserve">1 = Very inaccurate … 7 = Very accurate</w:t>
       </w:r>
     </w:p>
     <w:tbl>
@@ -4894,7 +4894,7 @@
           <w:szCs w:val="20"/>
           <w:rtl w:val="false"/>
         </w:rPr>
-        <w:t xml:space="preserve">Instructions: about the same team and engagement, answer on this scale: 1 = None/Never … 5 = A lot</w:t>
+        <w:t xml:space="preserve">Instructions: about the same team and engagement, answer on this scale: 1 = None … 5 = A lot</w:t>
       </w:r>
     </w:p>
     <w:tbl>
@@ -10571,7 +10571,7 @@
                 <w:szCs w:val="19"/>
                 <w:rtl w:val="false"/>
               </w:rPr>
-              <w:t xml:space="preserve">Placeholder: "Obedience pressure" scale</w:t>
+              <w:t xml:space="preserve">Placeholder: "Obedience pressure"</w:t>
             </w:r>
           </w:p>
         </w:tc>
@@ -10611,7 +10611,7 @@
                 <w:szCs w:val="19"/>
                 <w:rtl w:val="false"/>
               </w:rPr>
-              <w:t xml:space="preserve">[4–6 items from Lord &amp; DeZoort (2001) or Tsunogaya et al. (2017); the item wording is not yet available to me. To be inserted when the text is obtained.]</w:t>
+              <w:t xml:space="preserve">[In the literature obedience pressure is usually manipulated through scenarios (DeZoort &amp; Lord 1994; Lord &amp; DeZoort 2001), not measured with a multi-item scale. If Tsunogaya et al. also has no self-report scale, Situation 2 (the client situation) takes its place and this block is deleted.]</w:t>
             </w:r>
           </w:p>
         </w:tc>
@@ -10654,7 +10654,7 @@
           <w:szCs w:val="20"/>
           <w:rtl w:val="false"/>
         </w:rPr>
-        <w:t xml:space="preserve">Instructions: think about the period you worked on the reference engagement and say how often you experienced each state. 1 = Never/almost never … 5 = Always</w:t>
+        <w:t xml:space="preserve">Instructions: think about the period you worked on the reference engagement. Answer the first three questions by degree and the next four by frequency.</w:t>
       </w:r>
     </w:p>
     <w:tbl>
@@ -10672,12 +10672,12 @@
       </w:tblPr>
       <w:tblGrid>
         <w:gridCol w:w="650"/>
-        <w:gridCol w:w="5650"/>
-        <w:gridCol w:w="640"/>
-        <w:gridCol w:w="640"/>
-        <w:gridCol w:w="640"/>
-        <w:gridCol w:w="640"/>
-        <w:gridCol w:w="640"/>
+        <w:gridCol w:w="3850"/>
+        <w:gridCol w:w="1000"/>
+        <w:gridCol w:w="1000"/>
+        <w:gridCol w:w="1000"/>
+        <w:gridCol w:w="1000"/>
+        <w:gridCol w:w="1000"/>
       </w:tblGrid>
       <w:tr>
         <w:trPr>
@@ -10722,7 +10722,7 @@
         </w:tc>
         <w:tc>
           <w:tcPr>
-            <w:tcW w:type="dxa" w:w="5650"/>
+            <w:tcW w:type="dxa" w:w="3850"/>
             <w:tcBorders>
               <w:top w:val="single" w:color="A6A6A6" w:sz="4"/>
               <w:left w:val="single" w:color="A6A6A6" w:sz="4"/>
@@ -10757,7 +10757,7 @@
         </w:tc>
         <w:tc>
           <w:tcPr>
-            <w:tcW w:type="dxa" w:w="640"/>
+            <w:tcW w:type="dxa" w:w="1000"/>
             <w:tcBorders>
               <w:top w:val="single" w:color="A6A6A6" w:sz="4"/>
               <w:left w:val="single" w:color="A6A6A6" w:sz="4"/>
@@ -10787,13 +10787,13 @@
                 <w:szCs w:val="15"/>
                 <w:rtl w:val="false"/>
               </w:rPr>
-              <w:t xml:space="preserve">1</w:t>
-            </w:r>
-          </w:p>
-        </w:tc>
-        <w:tc>
-          <w:tcPr>
-            <w:tcW w:type="dxa" w:w="640"/>
+              <w:t xml:space="preserve">To a very low degree</w:t>
+            </w:r>
+          </w:p>
+        </w:tc>
+        <w:tc>
+          <w:tcPr>
+            <w:tcW w:type="dxa" w:w="1000"/>
             <w:tcBorders>
               <w:top w:val="single" w:color="A6A6A6" w:sz="4"/>
               <w:left w:val="single" w:color="A6A6A6" w:sz="4"/>
@@ -10823,13 +10823,13 @@
                 <w:szCs w:val="15"/>
                 <w:rtl w:val="false"/>
               </w:rPr>
-              <w:t xml:space="preserve">2</w:t>
-            </w:r>
-          </w:p>
-        </w:tc>
-        <w:tc>
-          <w:tcPr>
-            <w:tcW w:type="dxa" w:w="640"/>
+              <w:t xml:space="preserve">To a low degree</w:t>
+            </w:r>
+          </w:p>
+        </w:tc>
+        <w:tc>
+          <w:tcPr>
+            <w:tcW w:type="dxa" w:w="1000"/>
             <w:tcBorders>
               <w:top w:val="single" w:color="A6A6A6" w:sz="4"/>
               <w:left w:val="single" w:color="A6A6A6" w:sz="4"/>
@@ -10859,13 +10859,13 @@
                 <w:szCs w:val="15"/>
                 <w:rtl w:val="false"/>
               </w:rPr>
-              <w:t xml:space="preserve">3</w:t>
-            </w:r>
-          </w:p>
-        </w:tc>
-        <w:tc>
-          <w:tcPr>
-            <w:tcW w:type="dxa" w:w="640"/>
+              <w:t xml:space="preserve">Somewhat</w:t>
+            </w:r>
+          </w:p>
+        </w:tc>
+        <w:tc>
+          <w:tcPr>
+            <w:tcW w:type="dxa" w:w="1000"/>
             <w:tcBorders>
               <w:top w:val="single" w:color="A6A6A6" w:sz="4"/>
               <w:left w:val="single" w:color="A6A6A6" w:sz="4"/>
@@ -10895,13 +10895,13 @@
                 <w:szCs w:val="15"/>
                 <w:rtl w:val="false"/>
               </w:rPr>
-              <w:t xml:space="preserve">4</w:t>
-            </w:r>
-          </w:p>
-        </w:tc>
-        <w:tc>
-          <w:tcPr>
-            <w:tcW w:type="dxa" w:w="640"/>
+              <w:t xml:space="preserve">To a high degree</w:t>
+            </w:r>
+          </w:p>
+        </w:tc>
+        <w:tc>
+          <w:tcPr>
+            <w:tcW w:type="dxa" w:w="1000"/>
             <w:tcBorders>
               <w:top w:val="single" w:color="A6A6A6" w:sz="4"/>
               <w:left w:val="single" w:color="A6A6A6" w:sz="4"/>
@@ -10931,7 +10931,7 @@
                 <w:szCs w:val="15"/>
                 <w:rtl w:val="false"/>
               </w:rPr>
-              <w:t xml:space="preserve">5</w:t>
+              <w:t xml:space="preserve">To a very high degree</w:t>
             </w:r>
           </w:p>
         </w:tc>
@@ -10978,181 +10978,181 @@
         </w:tc>
         <w:tc>
           <w:tcPr>
-            <w:tcW w:type="dxa" w:w="5650"/>
-            <w:tcBorders>
-              <w:top w:val="single" w:color="A6A6A6" w:sz="4"/>
-              <w:left w:val="single" w:color="A6A6A6" w:sz="4"/>
-              <w:bottom w:val="single" w:color="A6A6A6" w:sz="4"/>
-              <w:right w:val="single" w:color="A6A6A6" w:sz="4"/>
-            </w:tcBorders>
-            <w:tcMar>
-              <w:top w:type="dxa" w:w="50"/>
-              <w:left w:type="dxa" w:w="60"/>
-              <w:bottom w:type="dxa" w:w="50"/>
-              <w:right w:type="dxa" w:w="60"/>
-            </w:tcMar>
-          </w:tcPr>
-          <w:p>
-            <w:pPr>
-              <w:bidi w:val="false"/>
-              <w:spacing w:after="0" w:line="260"/>
-            </w:pPr>
-            <w:r>
-              <w:rPr>
-                <w:rFonts w:ascii="Arial" w:cs="Arial" w:eastAsia="Arial" w:hAnsi="Arial"/>
-                <w:b w:val="false"/>
-                <w:bCs w:val="false"/>
-                <w:sz w:val="19"/>
-                <w:szCs w:val="19"/>
-                <w:rtl w:val="false"/>
-              </w:rPr>
-              <w:t xml:space="preserve">Was your work emotionally exhausting?</w:t>
-            </w:r>
-          </w:p>
-        </w:tc>
-        <w:tc>
-          <w:tcPr>
-            <w:tcW w:type="dxa" w:w="640"/>
-            <w:tcBorders>
-              <w:top w:val="single" w:color="A6A6A6" w:sz="4"/>
-              <w:left w:val="single" w:color="A6A6A6" w:sz="4"/>
-              <w:bottom w:val="single" w:color="A6A6A6" w:sz="4"/>
-              <w:right w:val="single" w:color="A6A6A6" w:sz="4"/>
-            </w:tcBorders>
-            <w:tcMar>
-              <w:top w:type="dxa" w:w="50"/>
-              <w:left w:type="dxa" w:w="60"/>
-              <w:bottom w:type="dxa" w:w="50"/>
-              <w:right w:type="dxa" w:w="60"/>
-            </w:tcMar>
-          </w:tcPr>
-          <w:p>
-            <w:pPr>
-              <w:bidi w:val="false"/>
-              <w:spacing w:after="0" w:line="260"/>
-              <w:jc w:val="center"/>
-            </w:pPr>
-            <w:r>
-              <w:rPr>
-                <w:rFonts w:ascii="Arial" w:cs="Arial" w:eastAsia="Arial" w:hAnsi="Arial"/>
-                <w:b w:val="false"/>
-                <w:bCs w:val="false"/>
-                <w:sz w:val="19"/>
-                <w:szCs w:val="19"/>
-                <w:rtl w:val="false"/>
-              </w:rPr>
-              <w:t xml:space="preserve">☐</w:t>
-            </w:r>
-          </w:p>
-        </w:tc>
-        <w:tc>
-          <w:tcPr>
-            <w:tcW w:type="dxa" w:w="640"/>
-            <w:tcBorders>
-              <w:top w:val="single" w:color="A6A6A6" w:sz="4"/>
-              <w:left w:val="single" w:color="A6A6A6" w:sz="4"/>
-              <w:bottom w:val="single" w:color="A6A6A6" w:sz="4"/>
-              <w:right w:val="single" w:color="A6A6A6" w:sz="4"/>
-            </w:tcBorders>
-            <w:tcMar>
-              <w:top w:type="dxa" w:w="50"/>
-              <w:left w:type="dxa" w:w="60"/>
-              <w:bottom w:type="dxa" w:w="50"/>
-              <w:right w:type="dxa" w:w="60"/>
-            </w:tcMar>
-          </w:tcPr>
-          <w:p>
-            <w:pPr>
-              <w:bidi w:val="false"/>
-              <w:spacing w:after="0" w:line="260"/>
-              <w:jc w:val="center"/>
-            </w:pPr>
-            <w:r>
-              <w:rPr>
-                <w:rFonts w:ascii="Arial" w:cs="Arial" w:eastAsia="Arial" w:hAnsi="Arial"/>
-                <w:b w:val="false"/>
-                <w:bCs w:val="false"/>
-                <w:sz w:val="19"/>
-                <w:szCs w:val="19"/>
-                <w:rtl w:val="false"/>
-              </w:rPr>
-              <w:t xml:space="preserve">☐</w:t>
-            </w:r>
-          </w:p>
-        </w:tc>
-        <w:tc>
-          <w:tcPr>
-            <w:tcW w:type="dxa" w:w="640"/>
-            <w:tcBorders>
-              <w:top w:val="single" w:color="A6A6A6" w:sz="4"/>
-              <w:left w:val="single" w:color="A6A6A6" w:sz="4"/>
-              <w:bottom w:val="single" w:color="A6A6A6" w:sz="4"/>
-              <w:right w:val="single" w:color="A6A6A6" w:sz="4"/>
-            </w:tcBorders>
-            <w:tcMar>
-              <w:top w:type="dxa" w:w="50"/>
-              <w:left w:type="dxa" w:w="60"/>
-              <w:bottom w:type="dxa" w:w="50"/>
-              <w:right w:type="dxa" w:w="60"/>
-            </w:tcMar>
-          </w:tcPr>
-          <w:p>
-            <w:pPr>
-              <w:bidi w:val="false"/>
-              <w:spacing w:after="0" w:line="260"/>
-              <w:jc w:val="center"/>
-            </w:pPr>
-            <w:r>
-              <w:rPr>
-                <w:rFonts w:ascii="Arial" w:cs="Arial" w:eastAsia="Arial" w:hAnsi="Arial"/>
-                <w:b w:val="false"/>
-                <w:bCs w:val="false"/>
-                <w:sz w:val="19"/>
-                <w:szCs w:val="19"/>
-                <w:rtl w:val="false"/>
-              </w:rPr>
-              <w:t xml:space="preserve">☐</w:t>
-            </w:r>
-          </w:p>
-        </w:tc>
-        <w:tc>
-          <w:tcPr>
-            <w:tcW w:type="dxa" w:w="640"/>
-            <w:tcBorders>
-              <w:top w:val="single" w:color="A6A6A6" w:sz="4"/>
-              <w:left w:val="single" w:color="A6A6A6" w:sz="4"/>
-              <w:bottom w:val="single" w:color="A6A6A6" w:sz="4"/>
-              <w:right w:val="single" w:color="A6A6A6" w:sz="4"/>
-            </w:tcBorders>
-            <w:tcMar>
-              <w:top w:type="dxa" w:w="50"/>
-              <w:left w:type="dxa" w:w="60"/>
-              <w:bottom w:type="dxa" w:w="50"/>
-              <w:right w:type="dxa" w:w="60"/>
-            </w:tcMar>
-          </w:tcPr>
-          <w:p>
-            <w:pPr>
-              <w:bidi w:val="false"/>
-              <w:spacing w:after="0" w:line="260"/>
-              <w:jc w:val="center"/>
-            </w:pPr>
-            <w:r>
-              <w:rPr>
-                <w:rFonts w:ascii="Arial" w:cs="Arial" w:eastAsia="Arial" w:hAnsi="Arial"/>
-                <w:b w:val="false"/>
-                <w:bCs w:val="false"/>
-                <w:sz w:val="19"/>
-                <w:szCs w:val="19"/>
-                <w:rtl w:val="false"/>
-              </w:rPr>
-              <w:t xml:space="preserve">☐</w:t>
-            </w:r>
-          </w:p>
-        </w:tc>
-        <w:tc>
-          <w:tcPr>
-            <w:tcW w:type="dxa" w:w="640"/>
+            <w:tcW w:type="dxa" w:w="3850"/>
+            <w:tcBorders>
+              <w:top w:val="single" w:color="A6A6A6" w:sz="4"/>
+              <w:left w:val="single" w:color="A6A6A6" w:sz="4"/>
+              <w:bottom w:val="single" w:color="A6A6A6" w:sz="4"/>
+              <w:right w:val="single" w:color="A6A6A6" w:sz="4"/>
+            </w:tcBorders>
+            <w:tcMar>
+              <w:top w:type="dxa" w:w="50"/>
+              <w:left w:type="dxa" w:w="60"/>
+              <w:bottom w:type="dxa" w:w="50"/>
+              <w:right w:type="dxa" w:w="60"/>
+            </w:tcMar>
+          </w:tcPr>
+          <w:p>
+            <w:pPr>
+              <w:bidi w:val="false"/>
+              <w:spacing w:after="0" w:line="260"/>
+            </w:pPr>
+            <w:r>
+              <w:rPr>
+                <w:rFonts w:ascii="Arial" w:cs="Arial" w:eastAsia="Arial" w:hAnsi="Arial"/>
+                <w:b w:val="false"/>
+                <w:bCs w:val="false"/>
+                <w:sz w:val="19"/>
+                <w:szCs w:val="19"/>
+                <w:rtl w:val="false"/>
+              </w:rPr>
+              <w:t xml:space="preserve">Is your work emotionally exhausting?</w:t>
+            </w:r>
+          </w:p>
+        </w:tc>
+        <w:tc>
+          <w:tcPr>
+            <w:tcW w:type="dxa" w:w="1000"/>
+            <w:tcBorders>
+              <w:top w:val="single" w:color="A6A6A6" w:sz="4"/>
+              <w:left w:val="single" w:color="A6A6A6" w:sz="4"/>
+              <w:bottom w:val="single" w:color="A6A6A6" w:sz="4"/>
+              <w:right w:val="single" w:color="A6A6A6" w:sz="4"/>
+            </w:tcBorders>
+            <w:tcMar>
+              <w:top w:type="dxa" w:w="50"/>
+              <w:left w:type="dxa" w:w="60"/>
+              <w:bottom w:type="dxa" w:w="50"/>
+              <w:right w:type="dxa" w:w="60"/>
+            </w:tcMar>
+          </w:tcPr>
+          <w:p>
+            <w:pPr>
+              <w:bidi w:val="false"/>
+              <w:spacing w:after="0" w:line="260"/>
+              <w:jc w:val="center"/>
+            </w:pPr>
+            <w:r>
+              <w:rPr>
+                <w:rFonts w:ascii="Arial" w:cs="Arial" w:eastAsia="Arial" w:hAnsi="Arial"/>
+                <w:b w:val="false"/>
+                <w:bCs w:val="false"/>
+                <w:sz w:val="19"/>
+                <w:szCs w:val="19"/>
+                <w:rtl w:val="false"/>
+              </w:rPr>
+              <w:t xml:space="preserve">☐</w:t>
+            </w:r>
+          </w:p>
+        </w:tc>
+        <w:tc>
+          <w:tcPr>
+            <w:tcW w:type="dxa" w:w="1000"/>
+            <w:tcBorders>
+              <w:top w:val="single" w:color="A6A6A6" w:sz="4"/>
+              <w:left w:val="single" w:color="A6A6A6" w:sz="4"/>
+              <w:bottom w:val="single" w:color="A6A6A6" w:sz="4"/>
+              <w:right w:val="single" w:color="A6A6A6" w:sz="4"/>
+            </w:tcBorders>
+            <w:tcMar>
+              <w:top w:type="dxa" w:w="50"/>
+              <w:left w:type="dxa" w:w="60"/>
+              <w:bottom w:type="dxa" w:w="50"/>
+              <w:right w:type="dxa" w:w="60"/>
+            </w:tcMar>
+          </w:tcPr>
+          <w:p>
+            <w:pPr>
+              <w:bidi w:val="false"/>
+              <w:spacing w:after="0" w:line="260"/>
+              <w:jc w:val="center"/>
+            </w:pPr>
+            <w:r>
+              <w:rPr>
+                <w:rFonts w:ascii="Arial" w:cs="Arial" w:eastAsia="Arial" w:hAnsi="Arial"/>
+                <w:b w:val="false"/>
+                <w:bCs w:val="false"/>
+                <w:sz w:val="19"/>
+                <w:szCs w:val="19"/>
+                <w:rtl w:val="false"/>
+              </w:rPr>
+              <w:t xml:space="preserve">☐</w:t>
+            </w:r>
+          </w:p>
+        </w:tc>
+        <w:tc>
+          <w:tcPr>
+            <w:tcW w:type="dxa" w:w="1000"/>
+            <w:tcBorders>
+              <w:top w:val="single" w:color="A6A6A6" w:sz="4"/>
+              <w:left w:val="single" w:color="A6A6A6" w:sz="4"/>
+              <w:bottom w:val="single" w:color="A6A6A6" w:sz="4"/>
+              <w:right w:val="single" w:color="A6A6A6" w:sz="4"/>
+            </w:tcBorders>
+            <w:tcMar>
+              <w:top w:type="dxa" w:w="50"/>
+              <w:left w:type="dxa" w:w="60"/>
+              <w:bottom w:type="dxa" w:w="50"/>
+              <w:right w:type="dxa" w:w="60"/>
+            </w:tcMar>
+          </w:tcPr>
+          <w:p>
+            <w:pPr>
+              <w:bidi w:val="false"/>
+              <w:spacing w:after="0" w:line="260"/>
+              <w:jc w:val="center"/>
+            </w:pPr>
+            <w:r>
+              <w:rPr>
+                <w:rFonts w:ascii="Arial" w:cs="Arial" w:eastAsia="Arial" w:hAnsi="Arial"/>
+                <w:b w:val="false"/>
+                <w:bCs w:val="false"/>
+                <w:sz w:val="19"/>
+                <w:szCs w:val="19"/>
+                <w:rtl w:val="false"/>
+              </w:rPr>
+              <w:t xml:space="preserve">☐</w:t>
+            </w:r>
+          </w:p>
+        </w:tc>
+        <w:tc>
+          <w:tcPr>
+            <w:tcW w:type="dxa" w:w="1000"/>
+            <w:tcBorders>
+              <w:top w:val="single" w:color="A6A6A6" w:sz="4"/>
+              <w:left w:val="single" w:color="A6A6A6" w:sz="4"/>
+              <w:bottom w:val="single" w:color="A6A6A6" w:sz="4"/>
+              <w:right w:val="single" w:color="A6A6A6" w:sz="4"/>
+            </w:tcBorders>
+            <w:tcMar>
+              <w:top w:type="dxa" w:w="50"/>
+              <w:left w:type="dxa" w:w="60"/>
+              <w:bottom w:type="dxa" w:w="50"/>
+              <w:right w:type="dxa" w:w="60"/>
+            </w:tcMar>
+          </w:tcPr>
+          <w:p>
+            <w:pPr>
+              <w:bidi w:val="false"/>
+              <w:spacing w:after="0" w:line="260"/>
+              <w:jc w:val="center"/>
+            </w:pPr>
+            <w:r>
+              <w:rPr>
+                <w:rFonts w:ascii="Arial" w:cs="Arial" w:eastAsia="Arial" w:hAnsi="Arial"/>
+                <w:b w:val="false"/>
+                <w:bCs w:val="false"/>
+                <w:sz w:val="19"/>
+                <w:szCs w:val="19"/>
+                <w:rtl w:val="false"/>
+              </w:rPr>
+              <w:t xml:space="preserve">☐</w:t>
+            </w:r>
+          </w:p>
+        </w:tc>
+        <w:tc>
+          <w:tcPr>
+            <w:tcW w:type="dxa" w:w="1000"/>
             <w:tcBorders>
               <w:top w:val="single" w:color="A6A6A6" w:sz="4"/>
               <w:left w:val="single" w:color="A6A6A6" w:sz="4"/>
@@ -11228,181 +11228,181 @@
         </w:tc>
         <w:tc>
           <w:tcPr>
-            <w:tcW w:type="dxa" w:w="5650"/>
-            <w:tcBorders>
-              <w:top w:val="single" w:color="A6A6A6" w:sz="4"/>
-              <w:left w:val="single" w:color="A6A6A6" w:sz="4"/>
-              <w:bottom w:val="single" w:color="A6A6A6" w:sz="4"/>
-              <w:right w:val="single" w:color="A6A6A6" w:sz="4"/>
-            </w:tcBorders>
-            <w:tcMar>
-              <w:top w:type="dxa" w:w="50"/>
-              <w:left w:type="dxa" w:w="60"/>
-              <w:bottom w:type="dxa" w:w="50"/>
-              <w:right w:type="dxa" w:w="60"/>
-            </w:tcMar>
-          </w:tcPr>
-          <w:p>
-            <w:pPr>
-              <w:bidi w:val="false"/>
-              <w:spacing w:after="0" w:line="260"/>
-            </w:pPr>
-            <w:r>
-              <w:rPr>
-                <w:rFonts w:ascii="Arial" w:cs="Arial" w:eastAsia="Arial" w:hAnsi="Arial"/>
-                <w:b w:val="false"/>
-                <w:bCs w:val="false"/>
-                <w:sz w:val="19"/>
-                <w:szCs w:val="19"/>
-                <w:rtl w:val="false"/>
-              </w:rPr>
-              <w:t xml:space="preserve">Did you feel burnt out because of your work?</w:t>
-            </w:r>
-          </w:p>
-        </w:tc>
-        <w:tc>
-          <w:tcPr>
-            <w:tcW w:type="dxa" w:w="640"/>
-            <w:tcBorders>
-              <w:top w:val="single" w:color="A6A6A6" w:sz="4"/>
-              <w:left w:val="single" w:color="A6A6A6" w:sz="4"/>
-              <w:bottom w:val="single" w:color="A6A6A6" w:sz="4"/>
-              <w:right w:val="single" w:color="A6A6A6" w:sz="4"/>
-            </w:tcBorders>
-            <w:tcMar>
-              <w:top w:type="dxa" w:w="50"/>
-              <w:left w:type="dxa" w:w="60"/>
-              <w:bottom w:type="dxa" w:w="50"/>
-              <w:right w:type="dxa" w:w="60"/>
-            </w:tcMar>
-          </w:tcPr>
-          <w:p>
-            <w:pPr>
-              <w:bidi w:val="false"/>
-              <w:spacing w:after="0" w:line="260"/>
-              <w:jc w:val="center"/>
-            </w:pPr>
-            <w:r>
-              <w:rPr>
-                <w:rFonts w:ascii="Arial" w:cs="Arial" w:eastAsia="Arial" w:hAnsi="Arial"/>
-                <w:b w:val="false"/>
-                <w:bCs w:val="false"/>
-                <w:sz w:val="19"/>
-                <w:szCs w:val="19"/>
-                <w:rtl w:val="false"/>
-              </w:rPr>
-              <w:t xml:space="preserve">☐</w:t>
-            </w:r>
-          </w:p>
-        </w:tc>
-        <w:tc>
-          <w:tcPr>
-            <w:tcW w:type="dxa" w:w="640"/>
-            <w:tcBorders>
-              <w:top w:val="single" w:color="A6A6A6" w:sz="4"/>
-              <w:left w:val="single" w:color="A6A6A6" w:sz="4"/>
-              <w:bottom w:val="single" w:color="A6A6A6" w:sz="4"/>
-              <w:right w:val="single" w:color="A6A6A6" w:sz="4"/>
-            </w:tcBorders>
-            <w:tcMar>
-              <w:top w:type="dxa" w:w="50"/>
-              <w:left w:type="dxa" w:w="60"/>
-              <w:bottom w:type="dxa" w:w="50"/>
-              <w:right w:type="dxa" w:w="60"/>
-            </w:tcMar>
-          </w:tcPr>
-          <w:p>
-            <w:pPr>
-              <w:bidi w:val="false"/>
-              <w:spacing w:after="0" w:line="260"/>
-              <w:jc w:val="center"/>
-            </w:pPr>
-            <w:r>
-              <w:rPr>
-                <w:rFonts w:ascii="Arial" w:cs="Arial" w:eastAsia="Arial" w:hAnsi="Arial"/>
-                <w:b w:val="false"/>
-                <w:bCs w:val="false"/>
-                <w:sz w:val="19"/>
-                <w:szCs w:val="19"/>
-                <w:rtl w:val="false"/>
-              </w:rPr>
-              <w:t xml:space="preserve">☐</w:t>
-            </w:r>
-          </w:p>
-        </w:tc>
-        <w:tc>
-          <w:tcPr>
-            <w:tcW w:type="dxa" w:w="640"/>
-            <w:tcBorders>
-              <w:top w:val="single" w:color="A6A6A6" w:sz="4"/>
-              <w:left w:val="single" w:color="A6A6A6" w:sz="4"/>
-              <w:bottom w:val="single" w:color="A6A6A6" w:sz="4"/>
-              <w:right w:val="single" w:color="A6A6A6" w:sz="4"/>
-            </w:tcBorders>
-            <w:tcMar>
-              <w:top w:type="dxa" w:w="50"/>
-              <w:left w:type="dxa" w:w="60"/>
-              <w:bottom w:type="dxa" w:w="50"/>
-              <w:right w:type="dxa" w:w="60"/>
-            </w:tcMar>
-          </w:tcPr>
-          <w:p>
-            <w:pPr>
-              <w:bidi w:val="false"/>
-              <w:spacing w:after="0" w:line="260"/>
-              <w:jc w:val="center"/>
-            </w:pPr>
-            <w:r>
-              <w:rPr>
-                <w:rFonts w:ascii="Arial" w:cs="Arial" w:eastAsia="Arial" w:hAnsi="Arial"/>
-                <w:b w:val="false"/>
-                <w:bCs w:val="false"/>
-                <w:sz w:val="19"/>
-                <w:szCs w:val="19"/>
-                <w:rtl w:val="false"/>
-              </w:rPr>
-              <w:t xml:space="preserve">☐</w:t>
-            </w:r>
-          </w:p>
-        </w:tc>
-        <w:tc>
-          <w:tcPr>
-            <w:tcW w:type="dxa" w:w="640"/>
-            <w:tcBorders>
-              <w:top w:val="single" w:color="A6A6A6" w:sz="4"/>
-              <w:left w:val="single" w:color="A6A6A6" w:sz="4"/>
-              <w:bottom w:val="single" w:color="A6A6A6" w:sz="4"/>
-              <w:right w:val="single" w:color="A6A6A6" w:sz="4"/>
-            </w:tcBorders>
-            <w:tcMar>
-              <w:top w:type="dxa" w:w="50"/>
-              <w:left w:type="dxa" w:w="60"/>
-              <w:bottom w:type="dxa" w:w="50"/>
-              <w:right w:type="dxa" w:w="60"/>
-            </w:tcMar>
-          </w:tcPr>
-          <w:p>
-            <w:pPr>
-              <w:bidi w:val="false"/>
-              <w:spacing w:after="0" w:line="260"/>
-              <w:jc w:val="center"/>
-            </w:pPr>
-            <w:r>
-              <w:rPr>
-                <w:rFonts w:ascii="Arial" w:cs="Arial" w:eastAsia="Arial" w:hAnsi="Arial"/>
-                <w:b w:val="false"/>
-                <w:bCs w:val="false"/>
-                <w:sz w:val="19"/>
-                <w:szCs w:val="19"/>
-                <w:rtl w:val="false"/>
-              </w:rPr>
-              <w:t xml:space="preserve">☐</w:t>
-            </w:r>
-          </w:p>
-        </w:tc>
-        <w:tc>
-          <w:tcPr>
-            <w:tcW w:type="dxa" w:w="640"/>
+            <w:tcW w:type="dxa" w:w="3850"/>
+            <w:tcBorders>
+              <w:top w:val="single" w:color="A6A6A6" w:sz="4"/>
+              <w:left w:val="single" w:color="A6A6A6" w:sz="4"/>
+              <w:bottom w:val="single" w:color="A6A6A6" w:sz="4"/>
+              <w:right w:val="single" w:color="A6A6A6" w:sz="4"/>
+            </w:tcBorders>
+            <w:tcMar>
+              <w:top w:type="dxa" w:w="50"/>
+              <w:left w:type="dxa" w:w="60"/>
+              <w:bottom w:type="dxa" w:w="50"/>
+              <w:right w:type="dxa" w:w="60"/>
+            </w:tcMar>
+          </w:tcPr>
+          <w:p>
+            <w:pPr>
+              <w:bidi w:val="false"/>
+              <w:spacing w:after="0" w:line="260"/>
+            </w:pPr>
+            <w:r>
+              <w:rPr>
+                <w:rFonts w:ascii="Arial" w:cs="Arial" w:eastAsia="Arial" w:hAnsi="Arial"/>
+                <w:b w:val="false"/>
+                <w:bCs w:val="false"/>
+                <w:sz w:val="19"/>
+                <w:szCs w:val="19"/>
+                <w:rtl w:val="false"/>
+              </w:rPr>
+              <w:t xml:space="preserve">Do you feel burnt out because of your work?</w:t>
+            </w:r>
+          </w:p>
+        </w:tc>
+        <w:tc>
+          <w:tcPr>
+            <w:tcW w:type="dxa" w:w="1000"/>
+            <w:tcBorders>
+              <w:top w:val="single" w:color="A6A6A6" w:sz="4"/>
+              <w:left w:val="single" w:color="A6A6A6" w:sz="4"/>
+              <w:bottom w:val="single" w:color="A6A6A6" w:sz="4"/>
+              <w:right w:val="single" w:color="A6A6A6" w:sz="4"/>
+            </w:tcBorders>
+            <w:tcMar>
+              <w:top w:type="dxa" w:w="50"/>
+              <w:left w:type="dxa" w:w="60"/>
+              <w:bottom w:type="dxa" w:w="50"/>
+              <w:right w:type="dxa" w:w="60"/>
+            </w:tcMar>
+          </w:tcPr>
+          <w:p>
+            <w:pPr>
+              <w:bidi w:val="false"/>
+              <w:spacing w:after="0" w:line="260"/>
+              <w:jc w:val="center"/>
+            </w:pPr>
+            <w:r>
+              <w:rPr>
+                <w:rFonts w:ascii="Arial" w:cs="Arial" w:eastAsia="Arial" w:hAnsi="Arial"/>
+                <w:b w:val="false"/>
+                <w:bCs w:val="false"/>
+                <w:sz w:val="19"/>
+                <w:szCs w:val="19"/>
+                <w:rtl w:val="false"/>
+              </w:rPr>
+              <w:t xml:space="preserve">☐</w:t>
+            </w:r>
+          </w:p>
+        </w:tc>
+        <w:tc>
+          <w:tcPr>
+            <w:tcW w:type="dxa" w:w="1000"/>
+            <w:tcBorders>
+              <w:top w:val="single" w:color="A6A6A6" w:sz="4"/>
+              <w:left w:val="single" w:color="A6A6A6" w:sz="4"/>
+              <w:bottom w:val="single" w:color="A6A6A6" w:sz="4"/>
+              <w:right w:val="single" w:color="A6A6A6" w:sz="4"/>
+            </w:tcBorders>
+            <w:tcMar>
+              <w:top w:type="dxa" w:w="50"/>
+              <w:left w:type="dxa" w:w="60"/>
+              <w:bottom w:type="dxa" w:w="50"/>
+              <w:right w:type="dxa" w:w="60"/>
+            </w:tcMar>
+          </w:tcPr>
+          <w:p>
+            <w:pPr>
+              <w:bidi w:val="false"/>
+              <w:spacing w:after="0" w:line="260"/>
+              <w:jc w:val="center"/>
+            </w:pPr>
+            <w:r>
+              <w:rPr>
+                <w:rFonts w:ascii="Arial" w:cs="Arial" w:eastAsia="Arial" w:hAnsi="Arial"/>
+                <w:b w:val="false"/>
+                <w:bCs w:val="false"/>
+                <w:sz w:val="19"/>
+                <w:szCs w:val="19"/>
+                <w:rtl w:val="false"/>
+              </w:rPr>
+              <w:t xml:space="preserve">☐</w:t>
+            </w:r>
+          </w:p>
+        </w:tc>
+        <w:tc>
+          <w:tcPr>
+            <w:tcW w:type="dxa" w:w="1000"/>
+            <w:tcBorders>
+              <w:top w:val="single" w:color="A6A6A6" w:sz="4"/>
+              <w:left w:val="single" w:color="A6A6A6" w:sz="4"/>
+              <w:bottom w:val="single" w:color="A6A6A6" w:sz="4"/>
+              <w:right w:val="single" w:color="A6A6A6" w:sz="4"/>
+            </w:tcBorders>
+            <w:tcMar>
+              <w:top w:type="dxa" w:w="50"/>
+              <w:left w:type="dxa" w:w="60"/>
+              <w:bottom w:type="dxa" w:w="50"/>
+              <w:right w:type="dxa" w:w="60"/>
+            </w:tcMar>
+          </w:tcPr>
+          <w:p>
+            <w:pPr>
+              <w:bidi w:val="false"/>
+              <w:spacing w:after="0" w:line="260"/>
+              <w:jc w:val="center"/>
+            </w:pPr>
+            <w:r>
+              <w:rPr>
+                <w:rFonts w:ascii="Arial" w:cs="Arial" w:eastAsia="Arial" w:hAnsi="Arial"/>
+                <w:b w:val="false"/>
+                <w:bCs w:val="false"/>
+                <w:sz w:val="19"/>
+                <w:szCs w:val="19"/>
+                <w:rtl w:val="false"/>
+              </w:rPr>
+              <w:t xml:space="preserve">☐</w:t>
+            </w:r>
+          </w:p>
+        </w:tc>
+        <w:tc>
+          <w:tcPr>
+            <w:tcW w:type="dxa" w:w="1000"/>
+            <w:tcBorders>
+              <w:top w:val="single" w:color="A6A6A6" w:sz="4"/>
+              <w:left w:val="single" w:color="A6A6A6" w:sz="4"/>
+              <w:bottom w:val="single" w:color="A6A6A6" w:sz="4"/>
+              <w:right w:val="single" w:color="A6A6A6" w:sz="4"/>
+            </w:tcBorders>
+            <w:tcMar>
+              <w:top w:type="dxa" w:w="50"/>
+              <w:left w:type="dxa" w:w="60"/>
+              <w:bottom w:type="dxa" w:w="50"/>
+              <w:right w:type="dxa" w:w="60"/>
+            </w:tcMar>
+          </w:tcPr>
+          <w:p>
+            <w:pPr>
+              <w:bidi w:val="false"/>
+              <w:spacing w:after="0" w:line="260"/>
+              <w:jc w:val="center"/>
+            </w:pPr>
+            <w:r>
+              <w:rPr>
+                <w:rFonts w:ascii="Arial" w:cs="Arial" w:eastAsia="Arial" w:hAnsi="Arial"/>
+                <w:b w:val="false"/>
+                <w:bCs w:val="false"/>
+                <w:sz w:val="19"/>
+                <w:szCs w:val="19"/>
+                <w:rtl w:val="false"/>
+              </w:rPr>
+              <w:t xml:space="preserve">☐</w:t>
+            </w:r>
+          </w:p>
+        </w:tc>
+        <w:tc>
+          <w:tcPr>
+            <w:tcW w:type="dxa" w:w="1000"/>
             <w:tcBorders>
               <w:top w:val="single" w:color="A6A6A6" w:sz="4"/>
               <w:left w:val="single" w:color="A6A6A6" w:sz="4"/>
@@ -11478,210 +11478,495 @@
         </w:tc>
         <w:tc>
           <w:tcPr>
-            <w:tcW w:type="dxa" w:w="5650"/>
-            <w:tcBorders>
-              <w:top w:val="single" w:color="A6A6A6" w:sz="4"/>
-              <w:left w:val="single" w:color="A6A6A6" w:sz="4"/>
-              <w:bottom w:val="single" w:color="A6A6A6" w:sz="4"/>
-              <w:right w:val="single" w:color="A6A6A6" w:sz="4"/>
-            </w:tcBorders>
-            <w:tcMar>
-              <w:top w:type="dxa" w:w="50"/>
-              <w:left w:type="dxa" w:w="60"/>
-              <w:bottom w:type="dxa" w:w="50"/>
-              <w:right w:type="dxa" w:w="60"/>
-            </w:tcMar>
-          </w:tcPr>
-          <w:p>
-            <w:pPr>
-              <w:bidi w:val="false"/>
-              <w:spacing w:after="0" w:line="260"/>
-            </w:pPr>
-            <w:r>
-              <w:rPr>
-                <w:rFonts w:ascii="Arial" w:cs="Arial" w:eastAsia="Arial" w:hAnsi="Arial"/>
-                <w:b w:val="false"/>
-                <w:bCs w:val="false"/>
-                <w:sz w:val="19"/>
-                <w:szCs w:val="19"/>
-                <w:rtl w:val="false"/>
-              </w:rPr>
-              <w:t xml:space="preserve">Did your work frustrate you?</w:t>
-            </w:r>
-          </w:p>
-        </w:tc>
-        <w:tc>
-          <w:tcPr>
-            <w:tcW w:type="dxa" w:w="640"/>
-            <w:tcBorders>
-              <w:top w:val="single" w:color="A6A6A6" w:sz="4"/>
-              <w:left w:val="single" w:color="A6A6A6" w:sz="4"/>
-              <w:bottom w:val="single" w:color="A6A6A6" w:sz="4"/>
-              <w:right w:val="single" w:color="A6A6A6" w:sz="4"/>
-            </w:tcBorders>
-            <w:tcMar>
-              <w:top w:type="dxa" w:w="50"/>
-              <w:left w:type="dxa" w:w="60"/>
-              <w:bottom w:type="dxa" w:w="50"/>
-              <w:right w:type="dxa" w:w="60"/>
-            </w:tcMar>
-          </w:tcPr>
-          <w:p>
-            <w:pPr>
-              <w:bidi w:val="false"/>
-              <w:spacing w:after="0" w:line="260"/>
-              <w:jc w:val="center"/>
-            </w:pPr>
-            <w:r>
-              <w:rPr>
-                <w:rFonts w:ascii="Arial" w:cs="Arial" w:eastAsia="Arial" w:hAnsi="Arial"/>
-                <w:b w:val="false"/>
-                <w:bCs w:val="false"/>
-                <w:sz w:val="19"/>
-                <w:szCs w:val="19"/>
-                <w:rtl w:val="false"/>
-              </w:rPr>
-              <w:t xml:space="preserve">☐</w:t>
-            </w:r>
-          </w:p>
-        </w:tc>
-        <w:tc>
-          <w:tcPr>
-            <w:tcW w:type="dxa" w:w="640"/>
-            <w:tcBorders>
-              <w:top w:val="single" w:color="A6A6A6" w:sz="4"/>
-              <w:left w:val="single" w:color="A6A6A6" w:sz="4"/>
-              <w:bottom w:val="single" w:color="A6A6A6" w:sz="4"/>
-              <w:right w:val="single" w:color="A6A6A6" w:sz="4"/>
-            </w:tcBorders>
-            <w:tcMar>
-              <w:top w:type="dxa" w:w="50"/>
-              <w:left w:type="dxa" w:w="60"/>
-              <w:bottom w:type="dxa" w:w="50"/>
-              <w:right w:type="dxa" w:w="60"/>
-            </w:tcMar>
-          </w:tcPr>
-          <w:p>
-            <w:pPr>
-              <w:bidi w:val="false"/>
-              <w:spacing w:after="0" w:line="260"/>
-              <w:jc w:val="center"/>
-            </w:pPr>
-            <w:r>
-              <w:rPr>
-                <w:rFonts w:ascii="Arial" w:cs="Arial" w:eastAsia="Arial" w:hAnsi="Arial"/>
-                <w:b w:val="false"/>
-                <w:bCs w:val="false"/>
-                <w:sz w:val="19"/>
-                <w:szCs w:val="19"/>
-                <w:rtl w:val="false"/>
-              </w:rPr>
-              <w:t xml:space="preserve">☐</w:t>
-            </w:r>
-          </w:p>
-        </w:tc>
-        <w:tc>
-          <w:tcPr>
-            <w:tcW w:type="dxa" w:w="640"/>
-            <w:tcBorders>
-              <w:top w:val="single" w:color="A6A6A6" w:sz="4"/>
-              <w:left w:val="single" w:color="A6A6A6" w:sz="4"/>
-              <w:bottom w:val="single" w:color="A6A6A6" w:sz="4"/>
-              <w:right w:val="single" w:color="A6A6A6" w:sz="4"/>
-            </w:tcBorders>
-            <w:tcMar>
-              <w:top w:type="dxa" w:w="50"/>
-              <w:left w:type="dxa" w:w="60"/>
-              <w:bottom w:type="dxa" w:w="50"/>
-              <w:right w:type="dxa" w:w="60"/>
-            </w:tcMar>
-          </w:tcPr>
-          <w:p>
-            <w:pPr>
-              <w:bidi w:val="false"/>
-              <w:spacing w:after="0" w:line="260"/>
-              <w:jc w:val="center"/>
-            </w:pPr>
-            <w:r>
-              <w:rPr>
-                <w:rFonts w:ascii="Arial" w:cs="Arial" w:eastAsia="Arial" w:hAnsi="Arial"/>
-                <w:b w:val="false"/>
-                <w:bCs w:val="false"/>
-                <w:sz w:val="19"/>
-                <w:szCs w:val="19"/>
-                <w:rtl w:val="false"/>
-              </w:rPr>
-              <w:t xml:space="preserve">☐</w:t>
-            </w:r>
-          </w:p>
-        </w:tc>
-        <w:tc>
-          <w:tcPr>
-            <w:tcW w:type="dxa" w:w="640"/>
-            <w:tcBorders>
-              <w:top w:val="single" w:color="A6A6A6" w:sz="4"/>
-              <w:left w:val="single" w:color="A6A6A6" w:sz="4"/>
-              <w:bottom w:val="single" w:color="A6A6A6" w:sz="4"/>
-              <w:right w:val="single" w:color="A6A6A6" w:sz="4"/>
-            </w:tcBorders>
-            <w:tcMar>
-              <w:top w:type="dxa" w:w="50"/>
-              <w:left w:type="dxa" w:w="60"/>
-              <w:bottom w:type="dxa" w:w="50"/>
-              <w:right w:type="dxa" w:w="60"/>
-            </w:tcMar>
-          </w:tcPr>
-          <w:p>
-            <w:pPr>
-              <w:bidi w:val="false"/>
-              <w:spacing w:after="0" w:line="260"/>
-              <w:jc w:val="center"/>
-            </w:pPr>
-            <w:r>
-              <w:rPr>
-                <w:rFonts w:ascii="Arial" w:cs="Arial" w:eastAsia="Arial" w:hAnsi="Arial"/>
-                <w:b w:val="false"/>
-                <w:bCs w:val="false"/>
-                <w:sz w:val="19"/>
-                <w:szCs w:val="19"/>
-                <w:rtl w:val="false"/>
-              </w:rPr>
-              <w:t xml:space="preserve">☐</w:t>
-            </w:r>
-          </w:p>
-        </w:tc>
-        <w:tc>
-          <w:tcPr>
-            <w:tcW w:type="dxa" w:w="640"/>
-            <w:tcBorders>
-              <w:top w:val="single" w:color="A6A6A6" w:sz="4"/>
-              <w:left w:val="single" w:color="A6A6A6" w:sz="4"/>
-              <w:bottom w:val="single" w:color="A6A6A6" w:sz="4"/>
-              <w:right w:val="single" w:color="A6A6A6" w:sz="4"/>
-            </w:tcBorders>
-            <w:tcMar>
-              <w:top w:type="dxa" w:w="50"/>
-              <w:left w:type="dxa" w:w="60"/>
-              <w:bottom w:type="dxa" w:w="50"/>
-              <w:right w:type="dxa" w:w="60"/>
-            </w:tcMar>
-          </w:tcPr>
-          <w:p>
-            <w:pPr>
-              <w:bidi w:val="false"/>
-              <w:spacing w:after="0" w:line="260"/>
-              <w:jc w:val="center"/>
-            </w:pPr>
-            <w:r>
-              <w:rPr>
-                <w:rFonts w:ascii="Arial" w:cs="Arial" w:eastAsia="Arial" w:hAnsi="Arial"/>
-                <w:b w:val="false"/>
-                <w:bCs w:val="false"/>
-                <w:sz w:val="19"/>
-                <w:szCs w:val="19"/>
-                <w:rtl w:val="false"/>
-              </w:rPr>
-              <w:t xml:space="preserve">☐</w:t>
+            <w:tcW w:type="dxa" w:w="3850"/>
+            <w:tcBorders>
+              <w:top w:val="single" w:color="A6A6A6" w:sz="4"/>
+              <w:left w:val="single" w:color="A6A6A6" w:sz="4"/>
+              <w:bottom w:val="single" w:color="A6A6A6" w:sz="4"/>
+              <w:right w:val="single" w:color="A6A6A6" w:sz="4"/>
+            </w:tcBorders>
+            <w:tcMar>
+              <w:top w:type="dxa" w:w="50"/>
+              <w:left w:type="dxa" w:w="60"/>
+              <w:bottom w:type="dxa" w:w="50"/>
+              <w:right w:type="dxa" w:w="60"/>
+            </w:tcMar>
+          </w:tcPr>
+          <w:p>
+            <w:pPr>
+              <w:bidi w:val="false"/>
+              <w:spacing w:after="0" w:line="260"/>
+            </w:pPr>
+            <w:r>
+              <w:rPr>
+                <w:rFonts w:ascii="Arial" w:cs="Arial" w:eastAsia="Arial" w:hAnsi="Arial"/>
+                <w:b w:val="false"/>
+                <w:bCs w:val="false"/>
+                <w:sz w:val="19"/>
+                <w:szCs w:val="19"/>
+                <w:rtl w:val="false"/>
+              </w:rPr>
+              <w:t xml:space="preserve">Does your work frustrate you?</w:t>
+            </w:r>
+          </w:p>
+        </w:tc>
+        <w:tc>
+          <w:tcPr>
+            <w:tcW w:type="dxa" w:w="1000"/>
+            <w:tcBorders>
+              <w:top w:val="single" w:color="A6A6A6" w:sz="4"/>
+              <w:left w:val="single" w:color="A6A6A6" w:sz="4"/>
+              <w:bottom w:val="single" w:color="A6A6A6" w:sz="4"/>
+              <w:right w:val="single" w:color="A6A6A6" w:sz="4"/>
+            </w:tcBorders>
+            <w:tcMar>
+              <w:top w:type="dxa" w:w="50"/>
+              <w:left w:type="dxa" w:w="60"/>
+              <w:bottom w:type="dxa" w:w="50"/>
+              <w:right w:type="dxa" w:w="60"/>
+            </w:tcMar>
+          </w:tcPr>
+          <w:p>
+            <w:pPr>
+              <w:bidi w:val="false"/>
+              <w:spacing w:after="0" w:line="260"/>
+              <w:jc w:val="center"/>
+            </w:pPr>
+            <w:r>
+              <w:rPr>
+                <w:rFonts w:ascii="Arial" w:cs="Arial" w:eastAsia="Arial" w:hAnsi="Arial"/>
+                <w:b w:val="false"/>
+                <w:bCs w:val="false"/>
+                <w:sz w:val="19"/>
+                <w:szCs w:val="19"/>
+                <w:rtl w:val="false"/>
+              </w:rPr>
+              <w:t xml:space="preserve">☐</w:t>
+            </w:r>
+          </w:p>
+        </w:tc>
+        <w:tc>
+          <w:tcPr>
+            <w:tcW w:type="dxa" w:w="1000"/>
+            <w:tcBorders>
+              <w:top w:val="single" w:color="A6A6A6" w:sz="4"/>
+              <w:left w:val="single" w:color="A6A6A6" w:sz="4"/>
+              <w:bottom w:val="single" w:color="A6A6A6" w:sz="4"/>
+              <w:right w:val="single" w:color="A6A6A6" w:sz="4"/>
+            </w:tcBorders>
+            <w:tcMar>
+              <w:top w:type="dxa" w:w="50"/>
+              <w:left w:type="dxa" w:w="60"/>
+              <w:bottom w:type="dxa" w:w="50"/>
+              <w:right w:type="dxa" w:w="60"/>
+            </w:tcMar>
+          </w:tcPr>
+          <w:p>
+            <w:pPr>
+              <w:bidi w:val="false"/>
+              <w:spacing w:after="0" w:line="260"/>
+              <w:jc w:val="center"/>
+            </w:pPr>
+            <w:r>
+              <w:rPr>
+                <w:rFonts w:ascii="Arial" w:cs="Arial" w:eastAsia="Arial" w:hAnsi="Arial"/>
+                <w:b w:val="false"/>
+                <w:bCs w:val="false"/>
+                <w:sz w:val="19"/>
+                <w:szCs w:val="19"/>
+                <w:rtl w:val="false"/>
+              </w:rPr>
+              <w:t xml:space="preserve">☐</w:t>
+            </w:r>
+          </w:p>
+        </w:tc>
+        <w:tc>
+          <w:tcPr>
+            <w:tcW w:type="dxa" w:w="1000"/>
+            <w:tcBorders>
+              <w:top w:val="single" w:color="A6A6A6" w:sz="4"/>
+              <w:left w:val="single" w:color="A6A6A6" w:sz="4"/>
+              <w:bottom w:val="single" w:color="A6A6A6" w:sz="4"/>
+              <w:right w:val="single" w:color="A6A6A6" w:sz="4"/>
+            </w:tcBorders>
+            <w:tcMar>
+              <w:top w:type="dxa" w:w="50"/>
+              <w:left w:type="dxa" w:w="60"/>
+              <w:bottom w:type="dxa" w:w="50"/>
+              <w:right w:type="dxa" w:w="60"/>
+            </w:tcMar>
+          </w:tcPr>
+          <w:p>
+            <w:pPr>
+              <w:bidi w:val="false"/>
+              <w:spacing w:after="0" w:line="260"/>
+              <w:jc w:val="center"/>
+            </w:pPr>
+            <w:r>
+              <w:rPr>
+                <w:rFonts w:ascii="Arial" w:cs="Arial" w:eastAsia="Arial" w:hAnsi="Arial"/>
+                <w:b w:val="false"/>
+                <w:bCs w:val="false"/>
+                <w:sz w:val="19"/>
+                <w:szCs w:val="19"/>
+                <w:rtl w:val="false"/>
+              </w:rPr>
+              <w:t xml:space="preserve">☐</w:t>
+            </w:r>
+          </w:p>
+        </w:tc>
+        <w:tc>
+          <w:tcPr>
+            <w:tcW w:type="dxa" w:w="1000"/>
+            <w:tcBorders>
+              <w:top w:val="single" w:color="A6A6A6" w:sz="4"/>
+              <w:left w:val="single" w:color="A6A6A6" w:sz="4"/>
+              <w:bottom w:val="single" w:color="A6A6A6" w:sz="4"/>
+              <w:right w:val="single" w:color="A6A6A6" w:sz="4"/>
+            </w:tcBorders>
+            <w:tcMar>
+              <w:top w:type="dxa" w:w="50"/>
+              <w:left w:type="dxa" w:w="60"/>
+              <w:bottom w:type="dxa" w:w="50"/>
+              <w:right w:type="dxa" w:w="60"/>
+            </w:tcMar>
+          </w:tcPr>
+          <w:p>
+            <w:pPr>
+              <w:bidi w:val="false"/>
+              <w:spacing w:after="0" w:line="260"/>
+              <w:jc w:val="center"/>
+            </w:pPr>
+            <w:r>
+              <w:rPr>
+                <w:rFonts w:ascii="Arial" w:cs="Arial" w:eastAsia="Arial" w:hAnsi="Arial"/>
+                <w:b w:val="false"/>
+                <w:bCs w:val="false"/>
+                <w:sz w:val="19"/>
+                <w:szCs w:val="19"/>
+                <w:rtl w:val="false"/>
+              </w:rPr>
+              <w:t xml:space="preserve">☐</w:t>
+            </w:r>
+          </w:p>
+        </w:tc>
+        <w:tc>
+          <w:tcPr>
+            <w:tcW w:type="dxa" w:w="1000"/>
+            <w:tcBorders>
+              <w:top w:val="single" w:color="A6A6A6" w:sz="4"/>
+              <w:left w:val="single" w:color="A6A6A6" w:sz="4"/>
+              <w:bottom w:val="single" w:color="A6A6A6" w:sz="4"/>
+              <w:right w:val="single" w:color="A6A6A6" w:sz="4"/>
+            </w:tcBorders>
+            <w:tcMar>
+              <w:top w:type="dxa" w:w="50"/>
+              <w:left w:type="dxa" w:w="60"/>
+              <w:bottom w:type="dxa" w:w="50"/>
+              <w:right w:type="dxa" w:w="60"/>
+            </w:tcMar>
+          </w:tcPr>
+          <w:p>
+            <w:pPr>
+              <w:bidi w:val="false"/>
+              <w:spacing w:after="0" w:line="260"/>
+              <w:jc w:val="center"/>
+            </w:pPr>
+            <w:r>
+              <w:rPr>
+                <w:rFonts w:ascii="Arial" w:cs="Arial" w:eastAsia="Arial" w:hAnsi="Arial"/>
+                <w:b w:val="false"/>
+                <w:bCs w:val="false"/>
+                <w:sz w:val="19"/>
+                <w:szCs w:val="19"/>
+                <w:rtl w:val="false"/>
+              </w:rPr>
+              <w:t xml:space="preserve">☐</w:t>
+            </w:r>
+          </w:p>
+        </w:tc>
+      </w:tr>
+    </w:tbl>
+    <w:p>
+      <w:pPr>
+        <w:spacing w:after="80"/>
+      </w:pPr>
+    </w:p>
+    <w:tbl>
+      <w:tblPr>
+        <w:bidiVisual w:val="false"/>
+        <w:tblW w:type="dxa" w:w="9500"/>
+        <w:tblBorders>
+          <w:top w:val="single" w:color="auto" w:sz="4"/>
+          <w:left w:val="single" w:color="auto" w:sz="4"/>
+          <w:bottom w:val="single" w:color="auto" w:sz="4"/>
+          <w:right w:val="single" w:color="auto" w:sz="4"/>
+          <w:insideH w:val="single" w:color="auto" w:sz="4"/>
+          <w:insideV w:val="single" w:color="auto" w:sz="4"/>
+        </w:tblBorders>
+      </w:tblPr>
+      <w:tblGrid>
+        <w:gridCol w:w="650"/>
+        <w:gridCol w:w="3850"/>
+        <w:gridCol w:w="1000"/>
+        <w:gridCol w:w="1000"/>
+        <w:gridCol w:w="1000"/>
+        <w:gridCol w:w="1000"/>
+        <w:gridCol w:w="1000"/>
+      </w:tblGrid>
+      <w:tr>
+        <w:trPr>
+          <w:cantSplit/>
+          <w:tblHeader/>
+        </w:trPr>
+        <w:tc>
+          <w:tcPr>
+            <w:tcW w:type="dxa" w:w="650"/>
+            <w:tcBorders>
+              <w:top w:val="single" w:color="A6A6A6" w:sz="4"/>
+              <w:left w:val="single" w:color="A6A6A6" w:sz="4"/>
+              <w:bottom w:val="single" w:color="A6A6A6" w:sz="4"/>
+              <w:right w:val="single" w:color="A6A6A6" w:sz="4"/>
+            </w:tcBorders>
+            <w:shd w:fill="D9E2F3" w:color="auto" w:val="clear"/>
+            <w:tcMar>
+              <w:top w:type="dxa" w:w="50"/>
+              <w:left w:type="dxa" w:w="60"/>
+              <w:bottom w:type="dxa" w:w="50"/>
+              <w:right w:type="dxa" w:w="60"/>
+            </w:tcMar>
+          </w:tcPr>
+          <w:p>
+            <w:pPr>
+              <w:bidi w:val="false"/>
+              <w:spacing w:after="0" w:line="260"/>
+              <w:jc w:val="center"/>
+            </w:pPr>
+            <w:r>
+              <w:rPr>
+                <w:rFonts w:ascii="Arial" w:cs="Arial" w:eastAsia="Arial" w:hAnsi="Arial"/>
+                <w:b/>
+                <w:bCs/>
+                <w:sz w:val="19"/>
+                <w:szCs w:val="19"/>
+                <w:rtl w:val="false"/>
+              </w:rPr>
+              <w:t xml:space="preserve"/>
+            </w:r>
+          </w:p>
+        </w:tc>
+        <w:tc>
+          <w:tcPr>
+            <w:tcW w:type="dxa" w:w="3850"/>
+            <w:tcBorders>
+              <w:top w:val="single" w:color="A6A6A6" w:sz="4"/>
+              <w:left w:val="single" w:color="A6A6A6" w:sz="4"/>
+              <w:bottom w:val="single" w:color="A6A6A6" w:sz="4"/>
+              <w:right w:val="single" w:color="A6A6A6" w:sz="4"/>
+            </w:tcBorders>
+            <w:shd w:fill="D9E2F3" w:color="auto" w:val="clear"/>
+            <w:tcMar>
+              <w:top w:type="dxa" w:w="50"/>
+              <w:left w:type="dxa" w:w="60"/>
+              <w:bottom w:type="dxa" w:w="50"/>
+              <w:right w:type="dxa" w:w="60"/>
+            </w:tcMar>
+          </w:tcPr>
+          <w:p>
+            <w:pPr>
+              <w:bidi w:val="false"/>
+              <w:spacing w:after="0" w:line="260"/>
+            </w:pPr>
+            <w:r>
+              <w:rPr>
+                <w:rFonts w:ascii="Arial" w:cs="Arial" w:eastAsia="Arial" w:hAnsi="Arial"/>
+                <w:b/>
+                <w:bCs/>
+                <w:sz w:val="19"/>
+                <w:szCs w:val="19"/>
+                <w:rtl w:val="false"/>
+              </w:rPr>
+              <w:t xml:space="preserve">Statement</w:t>
+            </w:r>
+          </w:p>
+        </w:tc>
+        <w:tc>
+          <w:tcPr>
+            <w:tcW w:type="dxa" w:w="1000"/>
+            <w:tcBorders>
+              <w:top w:val="single" w:color="A6A6A6" w:sz="4"/>
+              <w:left w:val="single" w:color="A6A6A6" w:sz="4"/>
+              <w:bottom w:val="single" w:color="A6A6A6" w:sz="4"/>
+              <w:right w:val="single" w:color="A6A6A6" w:sz="4"/>
+            </w:tcBorders>
+            <w:shd w:fill="D9E2F3" w:color="auto" w:val="clear"/>
+            <w:tcMar>
+              <w:top w:type="dxa" w:w="50"/>
+              <w:left w:type="dxa" w:w="60"/>
+              <w:bottom w:type="dxa" w:w="50"/>
+              <w:right w:type="dxa" w:w="60"/>
+            </w:tcMar>
+          </w:tcPr>
+          <w:p>
+            <w:pPr>
+              <w:bidi w:val="false"/>
+              <w:spacing w:after="0" w:line="260"/>
+              <w:jc w:val="center"/>
+            </w:pPr>
+            <w:r>
+              <w:rPr>
+                <w:rFonts w:ascii="Arial" w:cs="Arial" w:eastAsia="Arial" w:hAnsi="Arial"/>
+                <w:b/>
+                <w:bCs/>
+                <w:sz w:val="15"/>
+                <w:szCs w:val="15"/>
+                <w:rtl w:val="false"/>
+              </w:rPr>
+              <w:t xml:space="preserve">Never/almost never</w:t>
+            </w:r>
+          </w:p>
+        </w:tc>
+        <w:tc>
+          <w:tcPr>
+            <w:tcW w:type="dxa" w:w="1000"/>
+            <w:tcBorders>
+              <w:top w:val="single" w:color="A6A6A6" w:sz="4"/>
+              <w:left w:val="single" w:color="A6A6A6" w:sz="4"/>
+              <w:bottom w:val="single" w:color="A6A6A6" w:sz="4"/>
+              <w:right w:val="single" w:color="A6A6A6" w:sz="4"/>
+            </w:tcBorders>
+            <w:shd w:fill="D9E2F3" w:color="auto" w:val="clear"/>
+            <w:tcMar>
+              <w:top w:type="dxa" w:w="50"/>
+              <w:left w:type="dxa" w:w="60"/>
+              <w:bottom w:type="dxa" w:w="50"/>
+              <w:right w:type="dxa" w:w="60"/>
+            </w:tcMar>
+          </w:tcPr>
+          <w:p>
+            <w:pPr>
+              <w:bidi w:val="false"/>
+              <w:spacing w:after="0" w:line="260"/>
+              <w:jc w:val="center"/>
+            </w:pPr>
+            <w:r>
+              <w:rPr>
+                <w:rFonts w:ascii="Arial" w:cs="Arial" w:eastAsia="Arial" w:hAnsi="Arial"/>
+                <w:b/>
+                <w:bCs/>
+                <w:sz w:val="15"/>
+                <w:szCs w:val="15"/>
+                <w:rtl w:val="false"/>
+              </w:rPr>
+              <w:t xml:space="preserve">Seldom</w:t>
+            </w:r>
+          </w:p>
+        </w:tc>
+        <w:tc>
+          <w:tcPr>
+            <w:tcW w:type="dxa" w:w="1000"/>
+            <w:tcBorders>
+              <w:top w:val="single" w:color="A6A6A6" w:sz="4"/>
+              <w:left w:val="single" w:color="A6A6A6" w:sz="4"/>
+              <w:bottom w:val="single" w:color="A6A6A6" w:sz="4"/>
+              <w:right w:val="single" w:color="A6A6A6" w:sz="4"/>
+            </w:tcBorders>
+            <w:shd w:fill="D9E2F3" w:color="auto" w:val="clear"/>
+            <w:tcMar>
+              <w:top w:type="dxa" w:w="50"/>
+              <w:left w:type="dxa" w:w="60"/>
+              <w:bottom w:type="dxa" w:w="50"/>
+              <w:right w:type="dxa" w:w="60"/>
+            </w:tcMar>
+          </w:tcPr>
+          <w:p>
+            <w:pPr>
+              <w:bidi w:val="false"/>
+              <w:spacing w:after="0" w:line="260"/>
+              <w:jc w:val="center"/>
+            </w:pPr>
+            <w:r>
+              <w:rPr>
+                <w:rFonts w:ascii="Arial" w:cs="Arial" w:eastAsia="Arial" w:hAnsi="Arial"/>
+                <w:b/>
+                <w:bCs/>
+                <w:sz w:val="15"/>
+                <w:szCs w:val="15"/>
+                <w:rtl w:val="false"/>
+              </w:rPr>
+              <w:t xml:space="preserve">Sometimes</w:t>
+            </w:r>
+          </w:p>
+        </w:tc>
+        <w:tc>
+          <w:tcPr>
+            <w:tcW w:type="dxa" w:w="1000"/>
+            <w:tcBorders>
+              <w:top w:val="single" w:color="A6A6A6" w:sz="4"/>
+              <w:left w:val="single" w:color="A6A6A6" w:sz="4"/>
+              <w:bottom w:val="single" w:color="A6A6A6" w:sz="4"/>
+              <w:right w:val="single" w:color="A6A6A6" w:sz="4"/>
+            </w:tcBorders>
+            <w:shd w:fill="D9E2F3" w:color="auto" w:val="clear"/>
+            <w:tcMar>
+              <w:top w:type="dxa" w:w="50"/>
+              <w:left w:type="dxa" w:w="60"/>
+              <w:bottom w:type="dxa" w:w="50"/>
+              <w:right w:type="dxa" w:w="60"/>
+            </w:tcMar>
+          </w:tcPr>
+          <w:p>
+            <w:pPr>
+              <w:bidi w:val="false"/>
+              <w:spacing w:after="0" w:line="260"/>
+              <w:jc w:val="center"/>
+            </w:pPr>
+            <w:r>
+              <w:rPr>
+                <w:rFonts w:ascii="Arial" w:cs="Arial" w:eastAsia="Arial" w:hAnsi="Arial"/>
+                <w:b/>
+                <w:bCs/>
+                <w:sz w:val="15"/>
+                <w:szCs w:val="15"/>
+                <w:rtl w:val="false"/>
+              </w:rPr>
+              <w:t xml:space="preserve">Often</w:t>
+            </w:r>
+          </w:p>
+        </w:tc>
+        <w:tc>
+          <w:tcPr>
+            <w:tcW w:type="dxa" w:w="1000"/>
+            <w:tcBorders>
+              <w:top w:val="single" w:color="A6A6A6" w:sz="4"/>
+              <w:left w:val="single" w:color="A6A6A6" w:sz="4"/>
+              <w:bottom w:val="single" w:color="A6A6A6" w:sz="4"/>
+              <w:right w:val="single" w:color="A6A6A6" w:sz="4"/>
+            </w:tcBorders>
+            <w:shd w:fill="D9E2F3" w:color="auto" w:val="clear"/>
+            <w:tcMar>
+              <w:top w:type="dxa" w:w="50"/>
+              <w:left w:type="dxa" w:w="60"/>
+              <w:bottom w:type="dxa" w:w="50"/>
+              <w:right w:type="dxa" w:w="60"/>
+            </w:tcMar>
+          </w:tcPr>
+          <w:p>
+            <w:pPr>
+              <w:bidi w:val="false"/>
+              <w:spacing w:after="0" w:line="260"/>
+              <w:jc w:val="center"/>
+            </w:pPr>
+            <w:r>
+              <w:rPr>
+                <w:rFonts w:ascii="Arial" w:cs="Arial" w:eastAsia="Arial" w:hAnsi="Arial"/>
+                <w:b/>
+                <w:bCs/>
+                <w:sz w:val="15"/>
+                <w:szCs w:val="15"/>
+                <w:rtl w:val="false"/>
+              </w:rPr>
+              <w:t xml:space="preserve">Always</w:t>
             </w:r>
           </w:p>
         </w:tc>
@@ -11728,181 +12013,181 @@
         </w:tc>
         <w:tc>
           <w:tcPr>
-            <w:tcW w:type="dxa" w:w="5650"/>
-            <w:tcBorders>
-              <w:top w:val="single" w:color="A6A6A6" w:sz="4"/>
-              <w:left w:val="single" w:color="A6A6A6" w:sz="4"/>
-              <w:bottom w:val="single" w:color="A6A6A6" w:sz="4"/>
-              <w:right w:val="single" w:color="A6A6A6" w:sz="4"/>
-            </w:tcBorders>
-            <w:tcMar>
-              <w:top w:type="dxa" w:w="50"/>
-              <w:left w:type="dxa" w:w="60"/>
-              <w:bottom w:type="dxa" w:w="50"/>
-              <w:right w:type="dxa" w:w="60"/>
-            </w:tcMar>
-          </w:tcPr>
-          <w:p>
-            <w:pPr>
-              <w:bidi w:val="false"/>
-              <w:spacing w:after="0" w:line="260"/>
-            </w:pPr>
-            <w:r>
-              <w:rPr>
-                <w:rFonts w:ascii="Arial" w:cs="Arial" w:eastAsia="Arial" w:hAnsi="Arial"/>
-                <w:b w:val="false"/>
-                <w:bCs w:val="false"/>
-                <w:sz w:val="19"/>
-                <w:szCs w:val="19"/>
-                <w:rtl w:val="false"/>
-              </w:rPr>
-              <w:t xml:space="preserve">Did you feel worn out at the end of the working day?</w:t>
-            </w:r>
-          </w:p>
-        </w:tc>
-        <w:tc>
-          <w:tcPr>
-            <w:tcW w:type="dxa" w:w="640"/>
-            <w:tcBorders>
-              <w:top w:val="single" w:color="A6A6A6" w:sz="4"/>
-              <w:left w:val="single" w:color="A6A6A6" w:sz="4"/>
-              <w:bottom w:val="single" w:color="A6A6A6" w:sz="4"/>
-              <w:right w:val="single" w:color="A6A6A6" w:sz="4"/>
-            </w:tcBorders>
-            <w:tcMar>
-              <w:top w:type="dxa" w:w="50"/>
-              <w:left w:type="dxa" w:w="60"/>
-              <w:bottom w:type="dxa" w:w="50"/>
-              <w:right w:type="dxa" w:w="60"/>
-            </w:tcMar>
-          </w:tcPr>
-          <w:p>
-            <w:pPr>
-              <w:bidi w:val="false"/>
-              <w:spacing w:after="0" w:line="260"/>
-              <w:jc w:val="center"/>
-            </w:pPr>
-            <w:r>
-              <w:rPr>
-                <w:rFonts w:ascii="Arial" w:cs="Arial" w:eastAsia="Arial" w:hAnsi="Arial"/>
-                <w:b w:val="false"/>
-                <w:bCs w:val="false"/>
-                <w:sz w:val="19"/>
-                <w:szCs w:val="19"/>
-                <w:rtl w:val="false"/>
-              </w:rPr>
-              <w:t xml:space="preserve">☐</w:t>
-            </w:r>
-          </w:p>
-        </w:tc>
-        <w:tc>
-          <w:tcPr>
-            <w:tcW w:type="dxa" w:w="640"/>
-            <w:tcBorders>
-              <w:top w:val="single" w:color="A6A6A6" w:sz="4"/>
-              <w:left w:val="single" w:color="A6A6A6" w:sz="4"/>
-              <w:bottom w:val="single" w:color="A6A6A6" w:sz="4"/>
-              <w:right w:val="single" w:color="A6A6A6" w:sz="4"/>
-            </w:tcBorders>
-            <w:tcMar>
-              <w:top w:type="dxa" w:w="50"/>
-              <w:left w:type="dxa" w:w="60"/>
-              <w:bottom w:type="dxa" w:w="50"/>
-              <w:right w:type="dxa" w:w="60"/>
-            </w:tcMar>
-          </w:tcPr>
-          <w:p>
-            <w:pPr>
-              <w:bidi w:val="false"/>
-              <w:spacing w:after="0" w:line="260"/>
-              <w:jc w:val="center"/>
-            </w:pPr>
-            <w:r>
-              <w:rPr>
-                <w:rFonts w:ascii="Arial" w:cs="Arial" w:eastAsia="Arial" w:hAnsi="Arial"/>
-                <w:b w:val="false"/>
-                <w:bCs w:val="false"/>
-                <w:sz w:val="19"/>
-                <w:szCs w:val="19"/>
-                <w:rtl w:val="false"/>
-              </w:rPr>
-              <w:t xml:space="preserve">☐</w:t>
-            </w:r>
-          </w:p>
-        </w:tc>
-        <w:tc>
-          <w:tcPr>
-            <w:tcW w:type="dxa" w:w="640"/>
-            <w:tcBorders>
-              <w:top w:val="single" w:color="A6A6A6" w:sz="4"/>
-              <w:left w:val="single" w:color="A6A6A6" w:sz="4"/>
-              <w:bottom w:val="single" w:color="A6A6A6" w:sz="4"/>
-              <w:right w:val="single" w:color="A6A6A6" w:sz="4"/>
-            </w:tcBorders>
-            <w:tcMar>
-              <w:top w:type="dxa" w:w="50"/>
-              <w:left w:type="dxa" w:w="60"/>
-              <w:bottom w:type="dxa" w:w="50"/>
-              <w:right w:type="dxa" w:w="60"/>
-            </w:tcMar>
-          </w:tcPr>
-          <w:p>
-            <w:pPr>
-              <w:bidi w:val="false"/>
-              <w:spacing w:after="0" w:line="260"/>
-              <w:jc w:val="center"/>
-            </w:pPr>
-            <w:r>
-              <w:rPr>
-                <w:rFonts w:ascii="Arial" w:cs="Arial" w:eastAsia="Arial" w:hAnsi="Arial"/>
-                <w:b w:val="false"/>
-                <w:bCs w:val="false"/>
-                <w:sz w:val="19"/>
-                <w:szCs w:val="19"/>
-                <w:rtl w:val="false"/>
-              </w:rPr>
-              <w:t xml:space="preserve">☐</w:t>
-            </w:r>
-          </w:p>
-        </w:tc>
-        <w:tc>
-          <w:tcPr>
-            <w:tcW w:type="dxa" w:w="640"/>
-            <w:tcBorders>
-              <w:top w:val="single" w:color="A6A6A6" w:sz="4"/>
-              <w:left w:val="single" w:color="A6A6A6" w:sz="4"/>
-              <w:bottom w:val="single" w:color="A6A6A6" w:sz="4"/>
-              <w:right w:val="single" w:color="A6A6A6" w:sz="4"/>
-            </w:tcBorders>
-            <w:tcMar>
-              <w:top w:type="dxa" w:w="50"/>
-              <w:left w:type="dxa" w:w="60"/>
-              <w:bottom w:type="dxa" w:w="50"/>
-              <w:right w:type="dxa" w:w="60"/>
-            </w:tcMar>
-          </w:tcPr>
-          <w:p>
-            <w:pPr>
-              <w:bidi w:val="false"/>
-              <w:spacing w:after="0" w:line="260"/>
-              <w:jc w:val="center"/>
-            </w:pPr>
-            <w:r>
-              <w:rPr>
-                <w:rFonts w:ascii="Arial" w:cs="Arial" w:eastAsia="Arial" w:hAnsi="Arial"/>
-                <w:b w:val="false"/>
-                <w:bCs w:val="false"/>
-                <w:sz w:val="19"/>
-                <w:szCs w:val="19"/>
-                <w:rtl w:val="false"/>
-              </w:rPr>
-              <w:t xml:space="preserve">☐</w:t>
-            </w:r>
-          </w:p>
-        </w:tc>
-        <w:tc>
-          <w:tcPr>
-            <w:tcW w:type="dxa" w:w="640"/>
+            <w:tcW w:type="dxa" w:w="3850"/>
+            <w:tcBorders>
+              <w:top w:val="single" w:color="A6A6A6" w:sz="4"/>
+              <w:left w:val="single" w:color="A6A6A6" w:sz="4"/>
+              <w:bottom w:val="single" w:color="A6A6A6" w:sz="4"/>
+              <w:right w:val="single" w:color="A6A6A6" w:sz="4"/>
+            </w:tcBorders>
+            <w:tcMar>
+              <w:top w:type="dxa" w:w="50"/>
+              <w:left w:type="dxa" w:w="60"/>
+              <w:bottom w:type="dxa" w:w="50"/>
+              <w:right w:type="dxa" w:w="60"/>
+            </w:tcMar>
+          </w:tcPr>
+          <w:p>
+            <w:pPr>
+              <w:bidi w:val="false"/>
+              <w:spacing w:after="0" w:line="260"/>
+            </w:pPr>
+            <w:r>
+              <w:rPr>
+                <w:rFonts w:ascii="Arial" w:cs="Arial" w:eastAsia="Arial" w:hAnsi="Arial"/>
+                <w:b w:val="false"/>
+                <w:bCs w:val="false"/>
+                <w:sz w:val="19"/>
+                <w:szCs w:val="19"/>
+                <w:rtl w:val="false"/>
+              </w:rPr>
+              <w:t xml:space="preserve">Do you feel worn out at the end of the working day?</w:t>
+            </w:r>
+          </w:p>
+        </w:tc>
+        <w:tc>
+          <w:tcPr>
+            <w:tcW w:type="dxa" w:w="1000"/>
+            <w:tcBorders>
+              <w:top w:val="single" w:color="A6A6A6" w:sz="4"/>
+              <w:left w:val="single" w:color="A6A6A6" w:sz="4"/>
+              <w:bottom w:val="single" w:color="A6A6A6" w:sz="4"/>
+              <w:right w:val="single" w:color="A6A6A6" w:sz="4"/>
+            </w:tcBorders>
+            <w:tcMar>
+              <w:top w:type="dxa" w:w="50"/>
+              <w:left w:type="dxa" w:w="60"/>
+              <w:bottom w:type="dxa" w:w="50"/>
+              <w:right w:type="dxa" w:w="60"/>
+            </w:tcMar>
+          </w:tcPr>
+          <w:p>
+            <w:pPr>
+              <w:bidi w:val="false"/>
+              <w:spacing w:after="0" w:line="260"/>
+              <w:jc w:val="center"/>
+            </w:pPr>
+            <w:r>
+              <w:rPr>
+                <w:rFonts w:ascii="Arial" w:cs="Arial" w:eastAsia="Arial" w:hAnsi="Arial"/>
+                <w:b w:val="false"/>
+                <w:bCs w:val="false"/>
+                <w:sz w:val="19"/>
+                <w:szCs w:val="19"/>
+                <w:rtl w:val="false"/>
+              </w:rPr>
+              <w:t xml:space="preserve">☐</w:t>
+            </w:r>
+          </w:p>
+        </w:tc>
+        <w:tc>
+          <w:tcPr>
+            <w:tcW w:type="dxa" w:w="1000"/>
+            <w:tcBorders>
+              <w:top w:val="single" w:color="A6A6A6" w:sz="4"/>
+              <w:left w:val="single" w:color="A6A6A6" w:sz="4"/>
+              <w:bottom w:val="single" w:color="A6A6A6" w:sz="4"/>
+              <w:right w:val="single" w:color="A6A6A6" w:sz="4"/>
+            </w:tcBorders>
+            <w:tcMar>
+              <w:top w:type="dxa" w:w="50"/>
+              <w:left w:type="dxa" w:w="60"/>
+              <w:bottom w:type="dxa" w:w="50"/>
+              <w:right w:type="dxa" w:w="60"/>
+            </w:tcMar>
+          </w:tcPr>
+          <w:p>
+            <w:pPr>
+              <w:bidi w:val="false"/>
+              <w:spacing w:after="0" w:line="260"/>
+              <w:jc w:val="center"/>
+            </w:pPr>
+            <w:r>
+              <w:rPr>
+                <w:rFonts w:ascii="Arial" w:cs="Arial" w:eastAsia="Arial" w:hAnsi="Arial"/>
+                <w:b w:val="false"/>
+                <w:bCs w:val="false"/>
+                <w:sz w:val="19"/>
+                <w:szCs w:val="19"/>
+                <w:rtl w:val="false"/>
+              </w:rPr>
+              <w:t xml:space="preserve">☐</w:t>
+            </w:r>
+          </w:p>
+        </w:tc>
+        <w:tc>
+          <w:tcPr>
+            <w:tcW w:type="dxa" w:w="1000"/>
+            <w:tcBorders>
+              <w:top w:val="single" w:color="A6A6A6" w:sz="4"/>
+              <w:left w:val="single" w:color="A6A6A6" w:sz="4"/>
+              <w:bottom w:val="single" w:color="A6A6A6" w:sz="4"/>
+              <w:right w:val="single" w:color="A6A6A6" w:sz="4"/>
+            </w:tcBorders>
+            <w:tcMar>
+              <w:top w:type="dxa" w:w="50"/>
+              <w:left w:type="dxa" w:w="60"/>
+              <w:bottom w:type="dxa" w:w="50"/>
+              <w:right w:type="dxa" w:w="60"/>
+            </w:tcMar>
+          </w:tcPr>
+          <w:p>
+            <w:pPr>
+              <w:bidi w:val="false"/>
+              <w:spacing w:after="0" w:line="260"/>
+              <w:jc w:val="center"/>
+            </w:pPr>
+            <w:r>
+              <w:rPr>
+                <w:rFonts w:ascii="Arial" w:cs="Arial" w:eastAsia="Arial" w:hAnsi="Arial"/>
+                <w:b w:val="false"/>
+                <w:bCs w:val="false"/>
+                <w:sz w:val="19"/>
+                <w:szCs w:val="19"/>
+                <w:rtl w:val="false"/>
+              </w:rPr>
+              <w:t xml:space="preserve">☐</w:t>
+            </w:r>
+          </w:p>
+        </w:tc>
+        <w:tc>
+          <w:tcPr>
+            <w:tcW w:type="dxa" w:w="1000"/>
+            <w:tcBorders>
+              <w:top w:val="single" w:color="A6A6A6" w:sz="4"/>
+              <w:left w:val="single" w:color="A6A6A6" w:sz="4"/>
+              <w:bottom w:val="single" w:color="A6A6A6" w:sz="4"/>
+              <w:right w:val="single" w:color="A6A6A6" w:sz="4"/>
+            </w:tcBorders>
+            <w:tcMar>
+              <w:top w:type="dxa" w:w="50"/>
+              <w:left w:type="dxa" w:w="60"/>
+              <w:bottom w:type="dxa" w:w="50"/>
+              <w:right w:type="dxa" w:w="60"/>
+            </w:tcMar>
+          </w:tcPr>
+          <w:p>
+            <w:pPr>
+              <w:bidi w:val="false"/>
+              <w:spacing w:after="0" w:line="260"/>
+              <w:jc w:val="center"/>
+            </w:pPr>
+            <w:r>
+              <w:rPr>
+                <w:rFonts w:ascii="Arial" w:cs="Arial" w:eastAsia="Arial" w:hAnsi="Arial"/>
+                <w:b w:val="false"/>
+                <w:bCs w:val="false"/>
+                <w:sz w:val="19"/>
+                <w:szCs w:val="19"/>
+                <w:rtl w:val="false"/>
+              </w:rPr>
+              <w:t xml:space="preserve">☐</w:t>
+            </w:r>
+          </w:p>
+        </w:tc>
+        <w:tc>
+          <w:tcPr>
+            <w:tcW w:type="dxa" w:w="1000"/>
             <w:tcBorders>
               <w:top w:val="single" w:color="A6A6A6" w:sz="4"/>
               <w:left w:val="single" w:color="A6A6A6" w:sz="4"/>
@@ -11978,181 +12263,181 @@
         </w:tc>
         <w:tc>
           <w:tcPr>
-            <w:tcW w:type="dxa" w:w="5650"/>
-            <w:tcBorders>
-              <w:top w:val="single" w:color="A6A6A6" w:sz="4"/>
-              <w:left w:val="single" w:color="A6A6A6" w:sz="4"/>
-              <w:bottom w:val="single" w:color="A6A6A6" w:sz="4"/>
-              <w:right w:val="single" w:color="A6A6A6" w:sz="4"/>
-            </w:tcBorders>
-            <w:tcMar>
-              <w:top w:type="dxa" w:w="50"/>
-              <w:left w:type="dxa" w:w="60"/>
-              <w:bottom w:type="dxa" w:w="50"/>
-              <w:right w:type="dxa" w:w="60"/>
-            </w:tcMar>
-          </w:tcPr>
-          <w:p>
-            <w:pPr>
-              <w:bidi w:val="false"/>
-              <w:spacing w:after="0" w:line="260"/>
-            </w:pPr>
-            <w:r>
-              <w:rPr>
-                <w:rFonts w:ascii="Arial" w:cs="Arial" w:eastAsia="Arial" w:hAnsi="Arial"/>
-                <w:b w:val="false"/>
-                <w:bCs w:val="false"/>
-                <w:sz w:val="19"/>
-                <w:szCs w:val="19"/>
-                <w:rtl w:val="false"/>
-              </w:rPr>
-              <w:t xml:space="preserve">Were you exhausted in the morning at the thought of another day at work?</w:t>
-            </w:r>
-          </w:p>
-        </w:tc>
-        <w:tc>
-          <w:tcPr>
-            <w:tcW w:type="dxa" w:w="640"/>
-            <w:tcBorders>
-              <w:top w:val="single" w:color="A6A6A6" w:sz="4"/>
-              <w:left w:val="single" w:color="A6A6A6" w:sz="4"/>
-              <w:bottom w:val="single" w:color="A6A6A6" w:sz="4"/>
-              <w:right w:val="single" w:color="A6A6A6" w:sz="4"/>
-            </w:tcBorders>
-            <w:tcMar>
-              <w:top w:type="dxa" w:w="50"/>
-              <w:left w:type="dxa" w:w="60"/>
-              <w:bottom w:type="dxa" w:w="50"/>
-              <w:right w:type="dxa" w:w="60"/>
-            </w:tcMar>
-          </w:tcPr>
-          <w:p>
-            <w:pPr>
-              <w:bidi w:val="false"/>
-              <w:spacing w:after="0" w:line="260"/>
-              <w:jc w:val="center"/>
-            </w:pPr>
-            <w:r>
-              <w:rPr>
-                <w:rFonts w:ascii="Arial" w:cs="Arial" w:eastAsia="Arial" w:hAnsi="Arial"/>
-                <w:b w:val="false"/>
-                <w:bCs w:val="false"/>
-                <w:sz w:val="19"/>
-                <w:szCs w:val="19"/>
-                <w:rtl w:val="false"/>
-              </w:rPr>
-              <w:t xml:space="preserve">☐</w:t>
-            </w:r>
-          </w:p>
-        </w:tc>
-        <w:tc>
-          <w:tcPr>
-            <w:tcW w:type="dxa" w:w="640"/>
-            <w:tcBorders>
-              <w:top w:val="single" w:color="A6A6A6" w:sz="4"/>
-              <w:left w:val="single" w:color="A6A6A6" w:sz="4"/>
-              <w:bottom w:val="single" w:color="A6A6A6" w:sz="4"/>
-              <w:right w:val="single" w:color="A6A6A6" w:sz="4"/>
-            </w:tcBorders>
-            <w:tcMar>
-              <w:top w:type="dxa" w:w="50"/>
-              <w:left w:type="dxa" w:w="60"/>
-              <w:bottom w:type="dxa" w:w="50"/>
-              <w:right w:type="dxa" w:w="60"/>
-            </w:tcMar>
-          </w:tcPr>
-          <w:p>
-            <w:pPr>
-              <w:bidi w:val="false"/>
-              <w:spacing w:after="0" w:line="260"/>
-              <w:jc w:val="center"/>
-            </w:pPr>
-            <w:r>
-              <w:rPr>
-                <w:rFonts w:ascii="Arial" w:cs="Arial" w:eastAsia="Arial" w:hAnsi="Arial"/>
-                <w:b w:val="false"/>
-                <w:bCs w:val="false"/>
-                <w:sz w:val="19"/>
-                <w:szCs w:val="19"/>
-                <w:rtl w:val="false"/>
-              </w:rPr>
-              <w:t xml:space="preserve">☐</w:t>
-            </w:r>
-          </w:p>
-        </w:tc>
-        <w:tc>
-          <w:tcPr>
-            <w:tcW w:type="dxa" w:w="640"/>
-            <w:tcBorders>
-              <w:top w:val="single" w:color="A6A6A6" w:sz="4"/>
-              <w:left w:val="single" w:color="A6A6A6" w:sz="4"/>
-              <w:bottom w:val="single" w:color="A6A6A6" w:sz="4"/>
-              <w:right w:val="single" w:color="A6A6A6" w:sz="4"/>
-            </w:tcBorders>
-            <w:tcMar>
-              <w:top w:type="dxa" w:w="50"/>
-              <w:left w:type="dxa" w:w="60"/>
-              <w:bottom w:type="dxa" w:w="50"/>
-              <w:right w:type="dxa" w:w="60"/>
-            </w:tcMar>
-          </w:tcPr>
-          <w:p>
-            <w:pPr>
-              <w:bidi w:val="false"/>
-              <w:spacing w:after="0" w:line="260"/>
-              <w:jc w:val="center"/>
-            </w:pPr>
-            <w:r>
-              <w:rPr>
-                <w:rFonts w:ascii="Arial" w:cs="Arial" w:eastAsia="Arial" w:hAnsi="Arial"/>
-                <w:b w:val="false"/>
-                <w:bCs w:val="false"/>
-                <w:sz w:val="19"/>
-                <w:szCs w:val="19"/>
-                <w:rtl w:val="false"/>
-              </w:rPr>
-              <w:t xml:space="preserve">☐</w:t>
-            </w:r>
-          </w:p>
-        </w:tc>
-        <w:tc>
-          <w:tcPr>
-            <w:tcW w:type="dxa" w:w="640"/>
-            <w:tcBorders>
-              <w:top w:val="single" w:color="A6A6A6" w:sz="4"/>
-              <w:left w:val="single" w:color="A6A6A6" w:sz="4"/>
-              <w:bottom w:val="single" w:color="A6A6A6" w:sz="4"/>
-              <w:right w:val="single" w:color="A6A6A6" w:sz="4"/>
-            </w:tcBorders>
-            <w:tcMar>
-              <w:top w:type="dxa" w:w="50"/>
-              <w:left w:type="dxa" w:w="60"/>
-              <w:bottom w:type="dxa" w:w="50"/>
-              <w:right w:type="dxa" w:w="60"/>
-            </w:tcMar>
-          </w:tcPr>
-          <w:p>
-            <w:pPr>
-              <w:bidi w:val="false"/>
-              <w:spacing w:after="0" w:line="260"/>
-              <w:jc w:val="center"/>
-            </w:pPr>
-            <w:r>
-              <w:rPr>
-                <w:rFonts w:ascii="Arial" w:cs="Arial" w:eastAsia="Arial" w:hAnsi="Arial"/>
-                <w:b w:val="false"/>
-                <w:bCs w:val="false"/>
-                <w:sz w:val="19"/>
-                <w:szCs w:val="19"/>
-                <w:rtl w:val="false"/>
-              </w:rPr>
-              <w:t xml:space="preserve">☐</w:t>
-            </w:r>
-          </w:p>
-        </w:tc>
-        <w:tc>
-          <w:tcPr>
-            <w:tcW w:type="dxa" w:w="640"/>
+            <w:tcW w:type="dxa" w:w="3850"/>
+            <w:tcBorders>
+              <w:top w:val="single" w:color="A6A6A6" w:sz="4"/>
+              <w:left w:val="single" w:color="A6A6A6" w:sz="4"/>
+              <w:bottom w:val="single" w:color="A6A6A6" w:sz="4"/>
+              <w:right w:val="single" w:color="A6A6A6" w:sz="4"/>
+            </w:tcBorders>
+            <w:tcMar>
+              <w:top w:type="dxa" w:w="50"/>
+              <w:left w:type="dxa" w:w="60"/>
+              <w:bottom w:type="dxa" w:w="50"/>
+              <w:right w:type="dxa" w:w="60"/>
+            </w:tcMar>
+          </w:tcPr>
+          <w:p>
+            <w:pPr>
+              <w:bidi w:val="false"/>
+              <w:spacing w:after="0" w:line="260"/>
+            </w:pPr>
+            <w:r>
+              <w:rPr>
+                <w:rFonts w:ascii="Arial" w:cs="Arial" w:eastAsia="Arial" w:hAnsi="Arial"/>
+                <w:b w:val="false"/>
+                <w:bCs w:val="false"/>
+                <w:sz w:val="19"/>
+                <w:szCs w:val="19"/>
+                <w:rtl w:val="false"/>
+              </w:rPr>
+              <w:t xml:space="preserve">Are you exhausted in the morning at the thought of another day at work?</w:t>
+            </w:r>
+          </w:p>
+        </w:tc>
+        <w:tc>
+          <w:tcPr>
+            <w:tcW w:type="dxa" w:w="1000"/>
+            <w:tcBorders>
+              <w:top w:val="single" w:color="A6A6A6" w:sz="4"/>
+              <w:left w:val="single" w:color="A6A6A6" w:sz="4"/>
+              <w:bottom w:val="single" w:color="A6A6A6" w:sz="4"/>
+              <w:right w:val="single" w:color="A6A6A6" w:sz="4"/>
+            </w:tcBorders>
+            <w:tcMar>
+              <w:top w:type="dxa" w:w="50"/>
+              <w:left w:type="dxa" w:w="60"/>
+              <w:bottom w:type="dxa" w:w="50"/>
+              <w:right w:type="dxa" w:w="60"/>
+            </w:tcMar>
+          </w:tcPr>
+          <w:p>
+            <w:pPr>
+              <w:bidi w:val="false"/>
+              <w:spacing w:after="0" w:line="260"/>
+              <w:jc w:val="center"/>
+            </w:pPr>
+            <w:r>
+              <w:rPr>
+                <w:rFonts w:ascii="Arial" w:cs="Arial" w:eastAsia="Arial" w:hAnsi="Arial"/>
+                <w:b w:val="false"/>
+                <w:bCs w:val="false"/>
+                <w:sz w:val="19"/>
+                <w:szCs w:val="19"/>
+                <w:rtl w:val="false"/>
+              </w:rPr>
+              <w:t xml:space="preserve">☐</w:t>
+            </w:r>
+          </w:p>
+        </w:tc>
+        <w:tc>
+          <w:tcPr>
+            <w:tcW w:type="dxa" w:w="1000"/>
+            <w:tcBorders>
+              <w:top w:val="single" w:color="A6A6A6" w:sz="4"/>
+              <w:left w:val="single" w:color="A6A6A6" w:sz="4"/>
+              <w:bottom w:val="single" w:color="A6A6A6" w:sz="4"/>
+              <w:right w:val="single" w:color="A6A6A6" w:sz="4"/>
+            </w:tcBorders>
+            <w:tcMar>
+              <w:top w:type="dxa" w:w="50"/>
+              <w:left w:type="dxa" w:w="60"/>
+              <w:bottom w:type="dxa" w:w="50"/>
+              <w:right w:type="dxa" w:w="60"/>
+            </w:tcMar>
+          </w:tcPr>
+          <w:p>
+            <w:pPr>
+              <w:bidi w:val="false"/>
+              <w:spacing w:after="0" w:line="260"/>
+              <w:jc w:val="center"/>
+            </w:pPr>
+            <w:r>
+              <w:rPr>
+                <w:rFonts w:ascii="Arial" w:cs="Arial" w:eastAsia="Arial" w:hAnsi="Arial"/>
+                <w:b w:val="false"/>
+                <w:bCs w:val="false"/>
+                <w:sz w:val="19"/>
+                <w:szCs w:val="19"/>
+                <w:rtl w:val="false"/>
+              </w:rPr>
+              <w:t xml:space="preserve">☐</w:t>
+            </w:r>
+          </w:p>
+        </w:tc>
+        <w:tc>
+          <w:tcPr>
+            <w:tcW w:type="dxa" w:w="1000"/>
+            <w:tcBorders>
+              <w:top w:val="single" w:color="A6A6A6" w:sz="4"/>
+              <w:left w:val="single" w:color="A6A6A6" w:sz="4"/>
+              <w:bottom w:val="single" w:color="A6A6A6" w:sz="4"/>
+              <w:right w:val="single" w:color="A6A6A6" w:sz="4"/>
+            </w:tcBorders>
+            <w:tcMar>
+              <w:top w:type="dxa" w:w="50"/>
+              <w:left w:type="dxa" w:w="60"/>
+              <w:bottom w:type="dxa" w:w="50"/>
+              <w:right w:type="dxa" w:w="60"/>
+            </w:tcMar>
+          </w:tcPr>
+          <w:p>
+            <w:pPr>
+              <w:bidi w:val="false"/>
+              <w:spacing w:after="0" w:line="260"/>
+              <w:jc w:val="center"/>
+            </w:pPr>
+            <w:r>
+              <w:rPr>
+                <w:rFonts w:ascii="Arial" w:cs="Arial" w:eastAsia="Arial" w:hAnsi="Arial"/>
+                <w:b w:val="false"/>
+                <w:bCs w:val="false"/>
+                <w:sz w:val="19"/>
+                <w:szCs w:val="19"/>
+                <w:rtl w:val="false"/>
+              </w:rPr>
+              <w:t xml:space="preserve">☐</w:t>
+            </w:r>
+          </w:p>
+        </w:tc>
+        <w:tc>
+          <w:tcPr>
+            <w:tcW w:type="dxa" w:w="1000"/>
+            <w:tcBorders>
+              <w:top w:val="single" w:color="A6A6A6" w:sz="4"/>
+              <w:left w:val="single" w:color="A6A6A6" w:sz="4"/>
+              <w:bottom w:val="single" w:color="A6A6A6" w:sz="4"/>
+              <w:right w:val="single" w:color="A6A6A6" w:sz="4"/>
+            </w:tcBorders>
+            <w:tcMar>
+              <w:top w:type="dxa" w:w="50"/>
+              <w:left w:type="dxa" w:w="60"/>
+              <w:bottom w:type="dxa" w:w="50"/>
+              <w:right w:type="dxa" w:w="60"/>
+            </w:tcMar>
+          </w:tcPr>
+          <w:p>
+            <w:pPr>
+              <w:bidi w:val="false"/>
+              <w:spacing w:after="0" w:line="260"/>
+              <w:jc w:val="center"/>
+            </w:pPr>
+            <w:r>
+              <w:rPr>
+                <w:rFonts w:ascii="Arial" w:cs="Arial" w:eastAsia="Arial" w:hAnsi="Arial"/>
+                <w:b w:val="false"/>
+                <w:bCs w:val="false"/>
+                <w:sz w:val="19"/>
+                <w:szCs w:val="19"/>
+                <w:rtl w:val="false"/>
+              </w:rPr>
+              <w:t xml:space="preserve">☐</w:t>
+            </w:r>
+          </w:p>
+        </w:tc>
+        <w:tc>
+          <w:tcPr>
+            <w:tcW w:type="dxa" w:w="1000"/>
             <w:tcBorders>
               <w:top w:val="single" w:color="A6A6A6" w:sz="4"/>
               <w:left w:val="single" w:color="A6A6A6" w:sz="4"/>
@@ -12228,181 +12513,181 @@
         </w:tc>
         <w:tc>
           <w:tcPr>
-            <w:tcW w:type="dxa" w:w="5650"/>
-            <w:tcBorders>
-              <w:top w:val="single" w:color="A6A6A6" w:sz="4"/>
-              <w:left w:val="single" w:color="A6A6A6" w:sz="4"/>
-              <w:bottom w:val="single" w:color="A6A6A6" w:sz="4"/>
-              <w:right w:val="single" w:color="A6A6A6" w:sz="4"/>
-            </w:tcBorders>
-            <w:tcMar>
-              <w:top w:type="dxa" w:w="50"/>
-              <w:left w:type="dxa" w:w="60"/>
-              <w:bottom w:type="dxa" w:w="50"/>
-              <w:right w:type="dxa" w:w="60"/>
-            </w:tcMar>
-          </w:tcPr>
-          <w:p>
-            <w:pPr>
-              <w:bidi w:val="false"/>
-              <w:spacing w:after="0" w:line="260"/>
-            </w:pPr>
-            <w:r>
-              <w:rPr>
-                <w:rFonts w:ascii="Arial" w:cs="Arial" w:eastAsia="Arial" w:hAnsi="Arial"/>
-                <w:b w:val="false"/>
-                <w:bCs w:val="false"/>
-                <w:sz w:val="19"/>
-                <w:szCs w:val="19"/>
-                <w:rtl w:val="false"/>
-              </w:rPr>
-              <w:t xml:space="preserve">Did you feel that every working hour was tiring for you?</w:t>
-            </w:r>
-          </w:p>
-        </w:tc>
-        <w:tc>
-          <w:tcPr>
-            <w:tcW w:type="dxa" w:w="640"/>
-            <w:tcBorders>
-              <w:top w:val="single" w:color="A6A6A6" w:sz="4"/>
-              <w:left w:val="single" w:color="A6A6A6" w:sz="4"/>
-              <w:bottom w:val="single" w:color="A6A6A6" w:sz="4"/>
-              <w:right w:val="single" w:color="A6A6A6" w:sz="4"/>
-            </w:tcBorders>
-            <w:tcMar>
-              <w:top w:type="dxa" w:w="50"/>
-              <w:left w:type="dxa" w:w="60"/>
-              <w:bottom w:type="dxa" w:w="50"/>
-              <w:right w:type="dxa" w:w="60"/>
-            </w:tcMar>
-          </w:tcPr>
-          <w:p>
-            <w:pPr>
-              <w:bidi w:val="false"/>
-              <w:spacing w:after="0" w:line="260"/>
-              <w:jc w:val="center"/>
-            </w:pPr>
-            <w:r>
-              <w:rPr>
-                <w:rFonts w:ascii="Arial" w:cs="Arial" w:eastAsia="Arial" w:hAnsi="Arial"/>
-                <w:b w:val="false"/>
-                <w:bCs w:val="false"/>
-                <w:sz w:val="19"/>
-                <w:szCs w:val="19"/>
-                <w:rtl w:val="false"/>
-              </w:rPr>
-              <w:t xml:space="preserve">☐</w:t>
-            </w:r>
-          </w:p>
-        </w:tc>
-        <w:tc>
-          <w:tcPr>
-            <w:tcW w:type="dxa" w:w="640"/>
-            <w:tcBorders>
-              <w:top w:val="single" w:color="A6A6A6" w:sz="4"/>
-              <w:left w:val="single" w:color="A6A6A6" w:sz="4"/>
-              <w:bottom w:val="single" w:color="A6A6A6" w:sz="4"/>
-              <w:right w:val="single" w:color="A6A6A6" w:sz="4"/>
-            </w:tcBorders>
-            <w:tcMar>
-              <w:top w:type="dxa" w:w="50"/>
-              <w:left w:type="dxa" w:w="60"/>
-              <w:bottom w:type="dxa" w:w="50"/>
-              <w:right w:type="dxa" w:w="60"/>
-            </w:tcMar>
-          </w:tcPr>
-          <w:p>
-            <w:pPr>
-              <w:bidi w:val="false"/>
-              <w:spacing w:after="0" w:line="260"/>
-              <w:jc w:val="center"/>
-            </w:pPr>
-            <w:r>
-              <w:rPr>
-                <w:rFonts w:ascii="Arial" w:cs="Arial" w:eastAsia="Arial" w:hAnsi="Arial"/>
-                <w:b w:val="false"/>
-                <w:bCs w:val="false"/>
-                <w:sz w:val="19"/>
-                <w:szCs w:val="19"/>
-                <w:rtl w:val="false"/>
-              </w:rPr>
-              <w:t xml:space="preserve">☐</w:t>
-            </w:r>
-          </w:p>
-        </w:tc>
-        <w:tc>
-          <w:tcPr>
-            <w:tcW w:type="dxa" w:w="640"/>
-            <w:tcBorders>
-              <w:top w:val="single" w:color="A6A6A6" w:sz="4"/>
-              <w:left w:val="single" w:color="A6A6A6" w:sz="4"/>
-              <w:bottom w:val="single" w:color="A6A6A6" w:sz="4"/>
-              <w:right w:val="single" w:color="A6A6A6" w:sz="4"/>
-            </w:tcBorders>
-            <w:tcMar>
-              <w:top w:type="dxa" w:w="50"/>
-              <w:left w:type="dxa" w:w="60"/>
-              <w:bottom w:type="dxa" w:w="50"/>
-              <w:right w:type="dxa" w:w="60"/>
-            </w:tcMar>
-          </w:tcPr>
-          <w:p>
-            <w:pPr>
-              <w:bidi w:val="false"/>
-              <w:spacing w:after="0" w:line="260"/>
-              <w:jc w:val="center"/>
-            </w:pPr>
-            <w:r>
-              <w:rPr>
-                <w:rFonts w:ascii="Arial" w:cs="Arial" w:eastAsia="Arial" w:hAnsi="Arial"/>
-                <w:b w:val="false"/>
-                <w:bCs w:val="false"/>
-                <w:sz w:val="19"/>
-                <w:szCs w:val="19"/>
-                <w:rtl w:val="false"/>
-              </w:rPr>
-              <w:t xml:space="preserve">☐</w:t>
-            </w:r>
-          </w:p>
-        </w:tc>
-        <w:tc>
-          <w:tcPr>
-            <w:tcW w:type="dxa" w:w="640"/>
-            <w:tcBorders>
-              <w:top w:val="single" w:color="A6A6A6" w:sz="4"/>
-              <w:left w:val="single" w:color="A6A6A6" w:sz="4"/>
-              <w:bottom w:val="single" w:color="A6A6A6" w:sz="4"/>
-              <w:right w:val="single" w:color="A6A6A6" w:sz="4"/>
-            </w:tcBorders>
-            <w:tcMar>
-              <w:top w:type="dxa" w:w="50"/>
-              <w:left w:type="dxa" w:w="60"/>
-              <w:bottom w:type="dxa" w:w="50"/>
-              <w:right w:type="dxa" w:w="60"/>
-            </w:tcMar>
-          </w:tcPr>
-          <w:p>
-            <w:pPr>
-              <w:bidi w:val="false"/>
-              <w:spacing w:after="0" w:line="260"/>
-              <w:jc w:val="center"/>
-            </w:pPr>
-            <w:r>
-              <w:rPr>
-                <w:rFonts w:ascii="Arial" w:cs="Arial" w:eastAsia="Arial" w:hAnsi="Arial"/>
-                <w:b w:val="false"/>
-                <w:bCs w:val="false"/>
-                <w:sz w:val="19"/>
-                <w:szCs w:val="19"/>
-                <w:rtl w:val="false"/>
-              </w:rPr>
-              <w:t xml:space="preserve">☐</w:t>
-            </w:r>
-          </w:p>
-        </w:tc>
-        <w:tc>
-          <w:tcPr>
-            <w:tcW w:type="dxa" w:w="640"/>
+            <w:tcW w:type="dxa" w:w="3850"/>
+            <w:tcBorders>
+              <w:top w:val="single" w:color="A6A6A6" w:sz="4"/>
+              <w:left w:val="single" w:color="A6A6A6" w:sz="4"/>
+              <w:bottom w:val="single" w:color="A6A6A6" w:sz="4"/>
+              <w:right w:val="single" w:color="A6A6A6" w:sz="4"/>
+            </w:tcBorders>
+            <w:tcMar>
+              <w:top w:type="dxa" w:w="50"/>
+              <w:left w:type="dxa" w:w="60"/>
+              <w:bottom w:type="dxa" w:w="50"/>
+              <w:right w:type="dxa" w:w="60"/>
+            </w:tcMar>
+          </w:tcPr>
+          <w:p>
+            <w:pPr>
+              <w:bidi w:val="false"/>
+              <w:spacing w:after="0" w:line="260"/>
+            </w:pPr>
+            <w:r>
+              <w:rPr>
+                <w:rFonts w:ascii="Arial" w:cs="Arial" w:eastAsia="Arial" w:hAnsi="Arial"/>
+                <w:b w:val="false"/>
+                <w:bCs w:val="false"/>
+                <w:sz w:val="19"/>
+                <w:szCs w:val="19"/>
+                <w:rtl w:val="false"/>
+              </w:rPr>
+              <w:t xml:space="preserve">Do you feel that every working hour is tiring for you?</w:t>
+            </w:r>
+          </w:p>
+        </w:tc>
+        <w:tc>
+          <w:tcPr>
+            <w:tcW w:type="dxa" w:w="1000"/>
+            <w:tcBorders>
+              <w:top w:val="single" w:color="A6A6A6" w:sz="4"/>
+              <w:left w:val="single" w:color="A6A6A6" w:sz="4"/>
+              <w:bottom w:val="single" w:color="A6A6A6" w:sz="4"/>
+              <w:right w:val="single" w:color="A6A6A6" w:sz="4"/>
+            </w:tcBorders>
+            <w:tcMar>
+              <w:top w:type="dxa" w:w="50"/>
+              <w:left w:type="dxa" w:w="60"/>
+              <w:bottom w:type="dxa" w:w="50"/>
+              <w:right w:type="dxa" w:w="60"/>
+            </w:tcMar>
+          </w:tcPr>
+          <w:p>
+            <w:pPr>
+              <w:bidi w:val="false"/>
+              <w:spacing w:after="0" w:line="260"/>
+              <w:jc w:val="center"/>
+            </w:pPr>
+            <w:r>
+              <w:rPr>
+                <w:rFonts w:ascii="Arial" w:cs="Arial" w:eastAsia="Arial" w:hAnsi="Arial"/>
+                <w:b w:val="false"/>
+                <w:bCs w:val="false"/>
+                <w:sz w:val="19"/>
+                <w:szCs w:val="19"/>
+                <w:rtl w:val="false"/>
+              </w:rPr>
+              <w:t xml:space="preserve">☐</w:t>
+            </w:r>
+          </w:p>
+        </w:tc>
+        <w:tc>
+          <w:tcPr>
+            <w:tcW w:type="dxa" w:w="1000"/>
+            <w:tcBorders>
+              <w:top w:val="single" w:color="A6A6A6" w:sz="4"/>
+              <w:left w:val="single" w:color="A6A6A6" w:sz="4"/>
+              <w:bottom w:val="single" w:color="A6A6A6" w:sz="4"/>
+              <w:right w:val="single" w:color="A6A6A6" w:sz="4"/>
+            </w:tcBorders>
+            <w:tcMar>
+              <w:top w:type="dxa" w:w="50"/>
+              <w:left w:type="dxa" w:w="60"/>
+              <w:bottom w:type="dxa" w:w="50"/>
+              <w:right w:type="dxa" w:w="60"/>
+            </w:tcMar>
+          </w:tcPr>
+          <w:p>
+            <w:pPr>
+              <w:bidi w:val="false"/>
+              <w:spacing w:after="0" w:line="260"/>
+              <w:jc w:val="center"/>
+            </w:pPr>
+            <w:r>
+              <w:rPr>
+                <w:rFonts w:ascii="Arial" w:cs="Arial" w:eastAsia="Arial" w:hAnsi="Arial"/>
+                <w:b w:val="false"/>
+                <w:bCs w:val="false"/>
+                <w:sz w:val="19"/>
+                <w:szCs w:val="19"/>
+                <w:rtl w:val="false"/>
+              </w:rPr>
+              <w:t xml:space="preserve">☐</w:t>
+            </w:r>
+          </w:p>
+        </w:tc>
+        <w:tc>
+          <w:tcPr>
+            <w:tcW w:type="dxa" w:w="1000"/>
+            <w:tcBorders>
+              <w:top w:val="single" w:color="A6A6A6" w:sz="4"/>
+              <w:left w:val="single" w:color="A6A6A6" w:sz="4"/>
+              <w:bottom w:val="single" w:color="A6A6A6" w:sz="4"/>
+              <w:right w:val="single" w:color="A6A6A6" w:sz="4"/>
+            </w:tcBorders>
+            <w:tcMar>
+              <w:top w:type="dxa" w:w="50"/>
+              <w:left w:type="dxa" w:w="60"/>
+              <w:bottom w:type="dxa" w:w="50"/>
+              <w:right w:type="dxa" w:w="60"/>
+            </w:tcMar>
+          </w:tcPr>
+          <w:p>
+            <w:pPr>
+              <w:bidi w:val="false"/>
+              <w:spacing w:after="0" w:line="260"/>
+              <w:jc w:val="center"/>
+            </w:pPr>
+            <w:r>
+              <w:rPr>
+                <w:rFonts w:ascii="Arial" w:cs="Arial" w:eastAsia="Arial" w:hAnsi="Arial"/>
+                <w:b w:val="false"/>
+                <w:bCs w:val="false"/>
+                <w:sz w:val="19"/>
+                <w:szCs w:val="19"/>
+                <w:rtl w:val="false"/>
+              </w:rPr>
+              <w:t xml:space="preserve">☐</w:t>
+            </w:r>
+          </w:p>
+        </w:tc>
+        <w:tc>
+          <w:tcPr>
+            <w:tcW w:type="dxa" w:w="1000"/>
+            <w:tcBorders>
+              <w:top w:val="single" w:color="A6A6A6" w:sz="4"/>
+              <w:left w:val="single" w:color="A6A6A6" w:sz="4"/>
+              <w:bottom w:val="single" w:color="A6A6A6" w:sz="4"/>
+              <w:right w:val="single" w:color="A6A6A6" w:sz="4"/>
+            </w:tcBorders>
+            <w:tcMar>
+              <w:top w:type="dxa" w:w="50"/>
+              <w:left w:type="dxa" w:w="60"/>
+              <w:bottom w:type="dxa" w:w="50"/>
+              <w:right w:type="dxa" w:w="60"/>
+            </w:tcMar>
+          </w:tcPr>
+          <w:p>
+            <w:pPr>
+              <w:bidi w:val="false"/>
+              <w:spacing w:after="0" w:line="260"/>
+              <w:jc w:val="center"/>
+            </w:pPr>
+            <w:r>
+              <w:rPr>
+                <w:rFonts w:ascii="Arial" w:cs="Arial" w:eastAsia="Arial" w:hAnsi="Arial"/>
+                <w:b w:val="false"/>
+                <w:bCs w:val="false"/>
+                <w:sz w:val="19"/>
+                <w:szCs w:val="19"/>
+                <w:rtl w:val="false"/>
+              </w:rPr>
+              <w:t xml:space="preserve">☐</w:t>
+            </w:r>
+          </w:p>
+        </w:tc>
+        <w:tc>
+          <w:tcPr>
+            <w:tcW w:type="dxa" w:w="1000"/>
             <w:tcBorders>
               <w:top w:val="single" w:color="A6A6A6" w:sz="4"/>
               <w:left w:val="single" w:color="A6A6A6" w:sz="4"/>
@@ -12478,181 +12763,181 @@
         </w:tc>
         <w:tc>
           <w:tcPr>
-            <w:tcW w:type="dxa" w:w="5650"/>
-            <w:tcBorders>
-              <w:top w:val="single" w:color="A6A6A6" w:sz="4"/>
-              <w:left w:val="single" w:color="A6A6A6" w:sz="4"/>
-              <w:bottom w:val="single" w:color="A6A6A6" w:sz="4"/>
-              <w:right w:val="single" w:color="A6A6A6" w:sz="4"/>
-            </w:tcBorders>
-            <w:tcMar>
-              <w:top w:type="dxa" w:w="50"/>
-              <w:left w:type="dxa" w:w="60"/>
-              <w:bottom w:type="dxa" w:w="50"/>
-              <w:right w:type="dxa" w:w="60"/>
-            </w:tcMar>
-          </w:tcPr>
-          <w:p>
-            <w:pPr>
-              <w:bidi w:val="false"/>
-              <w:spacing w:after="0" w:line="260"/>
-            </w:pPr>
-            <w:r>
-              <w:rPr>
-                <w:rFonts w:ascii="Arial" w:cs="Arial" w:eastAsia="Arial" w:hAnsi="Arial"/>
-                <w:b w:val="false"/>
-                <w:bCs w:val="false"/>
-                <w:sz w:val="19"/>
-                <w:szCs w:val="19"/>
-                <w:rtl w:val="false"/>
-              </w:rPr>
-              <w:t xml:space="preserve">Did you have enough energy for family and friends during leisure time?</w:t>
-            </w:r>
-          </w:p>
-        </w:tc>
-        <w:tc>
-          <w:tcPr>
-            <w:tcW w:type="dxa" w:w="640"/>
-            <w:tcBorders>
-              <w:top w:val="single" w:color="A6A6A6" w:sz="4"/>
-              <w:left w:val="single" w:color="A6A6A6" w:sz="4"/>
-              <w:bottom w:val="single" w:color="A6A6A6" w:sz="4"/>
-              <w:right w:val="single" w:color="A6A6A6" w:sz="4"/>
-            </w:tcBorders>
-            <w:tcMar>
-              <w:top w:type="dxa" w:w="50"/>
-              <w:left w:type="dxa" w:w="60"/>
-              <w:bottom w:type="dxa" w:w="50"/>
-              <w:right w:type="dxa" w:w="60"/>
-            </w:tcMar>
-          </w:tcPr>
-          <w:p>
-            <w:pPr>
-              <w:bidi w:val="false"/>
-              <w:spacing w:after="0" w:line="260"/>
-              <w:jc w:val="center"/>
-            </w:pPr>
-            <w:r>
-              <w:rPr>
-                <w:rFonts w:ascii="Arial" w:cs="Arial" w:eastAsia="Arial" w:hAnsi="Arial"/>
-                <w:b w:val="false"/>
-                <w:bCs w:val="false"/>
-                <w:sz w:val="19"/>
-                <w:szCs w:val="19"/>
-                <w:rtl w:val="false"/>
-              </w:rPr>
-              <w:t xml:space="preserve">☐</w:t>
-            </w:r>
-          </w:p>
-        </w:tc>
-        <w:tc>
-          <w:tcPr>
-            <w:tcW w:type="dxa" w:w="640"/>
-            <w:tcBorders>
-              <w:top w:val="single" w:color="A6A6A6" w:sz="4"/>
-              <w:left w:val="single" w:color="A6A6A6" w:sz="4"/>
-              <w:bottom w:val="single" w:color="A6A6A6" w:sz="4"/>
-              <w:right w:val="single" w:color="A6A6A6" w:sz="4"/>
-            </w:tcBorders>
-            <w:tcMar>
-              <w:top w:type="dxa" w:w="50"/>
-              <w:left w:type="dxa" w:w="60"/>
-              <w:bottom w:type="dxa" w:w="50"/>
-              <w:right w:type="dxa" w:w="60"/>
-            </w:tcMar>
-          </w:tcPr>
-          <w:p>
-            <w:pPr>
-              <w:bidi w:val="false"/>
-              <w:spacing w:after="0" w:line="260"/>
-              <w:jc w:val="center"/>
-            </w:pPr>
-            <w:r>
-              <w:rPr>
-                <w:rFonts w:ascii="Arial" w:cs="Arial" w:eastAsia="Arial" w:hAnsi="Arial"/>
-                <w:b w:val="false"/>
-                <w:bCs w:val="false"/>
-                <w:sz w:val="19"/>
-                <w:szCs w:val="19"/>
-                <w:rtl w:val="false"/>
-              </w:rPr>
-              <w:t xml:space="preserve">☐</w:t>
-            </w:r>
-          </w:p>
-        </w:tc>
-        <w:tc>
-          <w:tcPr>
-            <w:tcW w:type="dxa" w:w="640"/>
-            <w:tcBorders>
-              <w:top w:val="single" w:color="A6A6A6" w:sz="4"/>
-              <w:left w:val="single" w:color="A6A6A6" w:sz="4"/>
-              <w:bottom w:val="single" w:color="A6A6A6" w:sz="4"/>
-              <w:right w:val="single" w:color="A6A6A6" w:sz="4"/>
-            </w:tcBorders>
-            <w:tcMar>
-              <w:top w:type="dxa" w:w="50"/>
-              <w:left w:type="dxa" w:w="60"/>
-              <w:bottom w:type="dxa" w:w="50"/>
-              <w:right w:type="dxa" w:w="60"/>
-            </w:tcMar>
-          </w:tcPr>
-          <w:p>
-            <w:pPr>
-              <w:bidi w:val="false"/>
-              <w:spacing w:after="0" w:line="260"/>
-              <w:jc w:val="center"/>
-            </w:pPr>
-            <w:r>
-              <w:rPr>
-                <w:rFonts w:ascii="Arial" w:cs="Arial" w:eastAsia="Arial" w:hAnsi="Arial"/>
-                <w:b w:val="false"/>
-                <w:bCs w:val="false"/>
-                <w:sz w:val="19"/>
-                <w:szCs w:val="19"/>
-                <w:rtl w:val="false"/>
-              </w:rPr>
-              <w:t xml:space="preserve">☐</w:t>
-            </w:r>
-          </w:p>
-        </w:tc>
-        <w:tc>
-          <w:tcPr>
-            <w:tcW w:type="dxa" w:w="640"/>
-            <w:tcBorders>
-              <w:top w:val="single" w:color="A6A6A6" w:sz="4"/>
-              <w:left w:val="single" w:color="A6A6A6" w:sz="4"/>
-              <w:bottom w:val="single" w:color="A6A6A6" w:sz="4"/>
-              <w:right w:val="single" w:color="A6A6A6" w:sz="4"/>
-            </w:tcBorders>
-            <w:tcMar>
-              <w:top w:type="dxa" w:w="50"/>
-              <w:left w:type="dxa" w:w="60"/>
-              <w:bottom w:type="dxa" w:w="50"/>
-              <w:right w:type="dxa" w:w="60"/>
-            </w:tcMar>
-          </w:tcPr>
-          <w:p>
-            <w:pPr>
-              <w:bidi w:val="false"/>
-              <w:spacing w:after="0" w:line="260"/>
-              <w:jc w:val="center"/>
-            </w:pPr>
-            <w:r>
-              <w:rPr>
-                <w:rFonts w:ascii="Arial" w:cs="Arial" w:eastAsia="Arial" w:hAnsi="Arial"/>
-                <w:b w:val="false"/>
-                <w:bCs w:val="false"/>
-                <w:sz w:val="19"/>
-                <w:szCs w:val="19"/>
-                <w:rtl w:val="false"/>
-              </w:rPr>
-              <w:t xml:space="preserve">☐</w:t>
-            </w:r>
-          </w:p>
-        </w:tc>
-        <w:tc>
-          <w:tcPr>
-            <w:tcW w:type="dxa" w:w="640"/>
+            <w:tcW w:type="dxa" w:w="3850"/>
+            <w:tcBorders>
+              <w:top w:val="single" w:color="A6A6A6" w:sz="4"/>
+              <w:left w:val="single" w:color="A6A6A6" w:sz="4"/>
+              <w:bottom w:val="single" w:color="A6A6A6" w:sz="4"/>
+              <w:right w:val="single" w:color="A6A6A6" w:sz="4"/>
+            </w:tcBorders>
+            <w:tcMar>
+              <w:top w:type="dxa" w:w="50"/>
+              <w:left w:type="dxa" w:w="60"/>
+              <w:bottom w:type="dxa" w:w="50"/>
+              <w:right w:type="dxa" w:w="60"/>
+            </w:tcMar>
+          </w:tcPr>
+          <w:p>
+            <w:pPr>
+              <w:bidi w:val="false"/>
+              <w:spacing w:after="0" w:line="260"/>
+            </w:pPr>
+            <w:r>
+              <w:rPr>
+                <w:rFonts w:ascii="Arial" w:cs="Arial" w:eastAsia="Arial" w:hAnsi="Arial"/>
+                <w:b w:val="false"/>
+                <w:bCs w:val="false"/>
+                <w:sz w:val="19"/>
+                <w:szCs w:val="19"/>
+                <w:rtl w:val="false"/>
+              </w:rPr>
+              <w:t xml:space="preserve">Do you have enough energy for family and friends during leisure time?</w:t>
+            </w:r>
+          </w:p>
+        </w:tc>
+        <w:tc>
+          <w:tcPr>
+            <w:tcW w:type="dxa" w:w="1000"/>
+            <w:tcBorders>
+              <w:top w:val="single" w:color="A6A6A6" w:sz="4"/>
+              <w:left w:val="single" w:color="A6A6A6" w:sz="4"/>
+              <w:bottom w:val="single" w:color="A6A6A6" w:sz="4"/>
+              <w:right w:val="single" w:color="A6A6A6" w:sz="4"/>
+            </w:tcBorders>
+            <w:tcMar>
+              <w:top w:type="dxa" w:w="50"/>
+              <w:left w:type="dxa" w:w="60"/>
+              <w:bottom w:type="dxa" w:w="50"/>
+              <w:right w:type="dxa" w:w="60"/>
+            </w:tcMar>
+          </w:tcPr>
+          <w:p>
+            <w:pPr>
+              <w:bidi w:val="false"/>
+              <w:spacing w:after="0" w:line="260"/>
+              <w:jc w:val="center"/>
+            </w:pPr>
+            <w:r>
+              <w:rPr>
+                <w:rFonts w:ascii="Arial" w:cs="Arial" w:eastAsia="Arial" w:hAnsi="Arial"/>
+                <w:b w:val="false"/>
+                <w:bCs w:val="false"/>
+                <w:sz w:val="19"/>
+                <w:szCs w:val="19"/>
+                <w:rtl w:val="false"/>
+              </w:rPr>
+              <w:t xml:space="preserve">☐</w:t>
+            </w:r>
+          </w:p>
+        </w:tc>
+        <w:tc>
+          <w:tcPr>
+            <w:tcW w:type="dxa" w:w="1000"/>
+            <w:tcBorders>
+              <w:top w:val="single" w:color="A6A6A6" w:sz="4"/>
+              <w:left w:val="single" w:color="A6A6A6" w:sz="4"/>
+              <w:bottom w:val="single" w:color="A6A6A6" w:sz="4"/>
+              <w:right w:val="single" w:color="A6A6A6" w:sz="4"/>
+            </w:tcBorders>
+            <w:tcMar>
+              <w:top w:type="dxa" w:w="50"/>
+              <w:left w:type="dxa" w:w="60"/>
+              <w:bottom w:type="dxa" w:w="50"/>
+              <w:right w:type="dxa" w:w="60"/>
+            </w:tcMar>
+          </w:tcPr>
+          <w:p>
+            <w:pPr>
+              <w:bidi w:val="false"/>
+              <w:spacing w:after="0" w:line="260"/>
+              <w:jc w:val="center"/>
+            </w:pPr>
+            <w:r>
+              <w:rPr>
+                <w:rFonts w:ascii="Arial" w:cs="Arial" w:eastAsia="Arial" w:hAnsi="Arial"/>
+                <w:b w:val="false"/>
+                <w:bCs w:val="false"/>
+                <w:sz w:val="19"/>
+                <w:szCs w:val="19"/>
+                <w:rtl w:val="false"/>
+              </w:rPr>
+              <w:t xml:space="preserve">☐</w:t>
+            </w:r>
+          </w:p>
+        </w:tc>
+        <w:tc>
+          <w:tcPr>
+            <w:tcW w:type="dxa" w:w="1000"/>
+            <w:tcBorders>
+              <w:top w:val="single" w:color="A6A6A6" w:sz="4"/>
+              <w:left w:val="single" w:color="A6A6A6" w:sz="4"/>
+              <w:bottom w:val="single" w:color="A6A6A6" w:sz="4"/>
+              <w:right w:val="single" w:color="A6A6A6" w:sz="4"/>
+            </w:tcBorders>
+            <w:tcMar>
+              <w:top w:type="dxa" w:w="50"/>
+              <w:left w:type="dxa" w:w="60"/>
+              <w:bottom w:type="dxa" w:w="50"/>
+              <w:right w:type="dxa" w:w="60"/>
+            </w:tcMar>
+          </w:tcPr>
+          <w:p>
+            <w:pPr>
+              <w:bidi w:val="false"/>
+              <w:spacing w:after="0" w:line="260"/>
+              <w:jc w:val="center"/>
+            </w:pPr>
+            <w:r>
+              <w:rPr>
+                <w:rFonts w:ascii="Arial" w:cs="Arial" w:eastAsia="Arial" w:hAnsi="Arial"/>
+                <w:b w:val="false"/>
+                <w:bCs w:val="false"/>
+                <w:sz w:val="19"/>
+                <w:szCs w:val="19"/>
+                <w:rtl w:val="false"/>
+              </w:rPr>
+              <w:t xml:space="preserve">☐</w:t>
+            </w:r>
+          </w:p>
+        </w:tc>
+        <w:tc>
+          <w:tcPr>
+            <w:tcW w:type="dxa" w:w="1000"/>
+            <w:tcBorders>
+              <w:top w:val="single" w:color="A6A6A6" w:sz="4"/>
+              <w:left w:val="single" w:color="A6A6A6" w:sz="4"/>
+              <w:bottom w:val="single" w:color="A6A6A6" w:sz="4"/>
+              <w:right w:val="single" w:color="A6A6A6" w:sz="4"/>
+            </w:tcBorders>
+            <w:tcMar>
+              <w:top w:type="dxa" w:w="50"/>
+              <w:left w:type="dxa" w:w="60"/>
+              <w:bottom w:type="dxa" w:w="50"/>
+              <w:right w:type="dxa" w:w="60"/>
+            </w:tcMar>
+          </w:tcPr>
+          <w:p>
+            <w:pPr>
+              <w:bidi w:val="false"/>
+              <w:spacing w:after="0" w:line="260"/>
+              <w:jc w:val="center"/>
+            </w:pPr>
+            <w:r>
+              <w:rPr>
+                <w:rFonts w:ascii="Arial" w:cs="Arial" w:eastAsia="Arial" w:hAnsi="Arial"/>
+                <w:b w:val="false"/>
+                <w:bCs w:val="false"/>
+                <w:sz w:val="19"/>
+                <w:szCs w:val="19"/>
+                <w:rtl w:val="false"/>
+              </w:rPr>
+              <w:t xml:space="preserve">☐</w:t>
+            </w:r>
+          </w:p>
+        </w:tc>
+        <w:tc>
+          <w:tcPr>
+            <w:tcW w:type="dxa" w:w="1000"/>
             <w:tcBorders>
               <w:top w:val="single" w:color="A6A6A6" w:sz="4"/>
               <w:left w:val="single" w:color="A6A6A6" w:sz="4"/>
@@ -12691,6 +12976,11 @@
       <w:pPr>
         <w:spacing w:after="80"/>
       </w:pPr>
+    </w:p>
+    <w:p>
+      <w:r>
+        <w:br w:type="page"/>
+      </w:r>
     </w:p>
     <w:p>
       <w:pPr>
@@ -27910,7 +28200,7 @@
                 <w:szCs w:val="19"/>
                 <w:rtl w:val="false"/>
               </w:rPr>
-              <w:t xml:space="preserve">Wording and reverse keys (1, 3, 5) match your report of the paper's appendix (Survey Scales and Item Correlations). Secondhand. Replacing "team" with "audit team" is an adaptation and must be reported as such. Response scale not given in the report</w:t>
+              <w:t xml:space="preserve">Wording and reverse keys (1, 3, 5) match your report. Scale: 7-point, Very inaccurate to Very accurate (per republication evidence; the scale paragraph of the paper itself not directly seen). team → audit team is an adaptation</w:t>
             </w:r>
           </w:p>
         </w:tc>
@@ -27944,7 +28234,7 @@
                 <w:szCs w:val="19"/>
                 <w:rtl w:val="false"/>
               </w:rPr>
-              <w:t xml:space="preserve">Report adaptation; confirm response scale in the paper</w:t>
+              <w:t xml:space="preserve">Confirm the scale paragraph in Methods; report adaptation</w:t>
             </w:r>
           </w:p>
         </w:tc>
@@ -28018,7 +28308,7 @@
                 <w:szCs w:val="19"/>
                 <w:rtl w:val="false"/>
               </w:rPr>
-              <w:t xml:space="preserve">Jehn (1995)</w:t>
+              <w:t xml:space="preserve">Jehn (1995), Table 1 (Factor Analysis of Intragroup Conflict Items)</w:t>
             </w:r>
           </w:p>
         </w:tc>
@@ -28086,7 +28376,7 @@
                 <w:szCs w:val="19"/>
                 <w:rtl w:val="false"/>
               </w:rPr>
-              <w:t xml:space="preserve">Unverified; versions differ (6/8/9 items; 5- or 7-point)</w:t>
+              <w:t xml:space="preserve">7 of 8 verified (4 relationship + 3 task: TC1, TC2, TC4). TC3 ("To what extent are there differences of opinion…") is unverified. 5-point: 1 = None to 5 = A lot; midpoint labels not reported</w:t>
             </w:r>
           </w:p>
         </w:tc>
@@ -28120,7 +28410,7 @@
                 <w:szCs w:val="19"/>
                 <w:rtl w:val="false"/>
               </w:rPr>
-              <w:t xml:space="preserve">Match to paper</w:t>
+              <w:t xml:space="preserve">See row 8 of Table 1</w:t>
             </w:r>
           </w:p>
         </w:tc>
@@ -28160,7 +28450,7 @@
                 <w:szCs w:val="19"/>
                 <w:rtl w:val="false"/>
               </w:rPr>
-              <w:t xml:space="preserve">Burnout</w:t>
+              <w:t xml:space="preserve">Work-related burnout</w:t>
             </w:r>
           </w:p>
         </w:tc>
@@ -28194,7 +28484,7 @@
                 <w:szCs w:val="19"/>
                 <w:rtl w:val="false"/>
               </w:rPr>
-              <w:t xml:space="preserve">Kristensen et al. (2005) CBI, work-related</w:t>
+              <w:t xml:space="preserve">Kristensen et al. (2005) CBI, Work-related burnout</w:t>
             </w:r>
           </w:p>
         </w:tc>
@@ -28262,7 +28552,7 @@
                 <w:szCs w:val="19"/>
                 <w:rtl w:val="false"/>
               </w:rPr>
-              <w:t xml:space="preserve">All 7 work-related items match the EMERGE (UCSD) university version you supplied; the reverse-keyed item is the "energy for family and friends" item (EX7). Response options per item (frequency vs intensity) are not confirmed; we use frequency anchors for all seven. Source is a university re-publication, not the 2005 table</w:t>
+              <w:t xml:space="preserve">Seven items and response type per item established: EX1–EX3 intensity (To a very high degree … To a very low degree), EX4–EX7 frequency (Always … Never/almost never), EX7 reversed. Source is a republication of the English form, not the 2005 table. Do not rename the subscale "emotional exhaustion"</w:t>
             </w:r>
           </w:p>
         </w:tc>
@@ -28296,7 +28586,7 @@
                 <w:szCs w:val="19"/>
                 <w:rtl w:val="false"/>
               </w:rPr>
-              <w:t xml:space="preserve">Match options to the 2005 paper; check terms</w:t>
+              <w:t xml:space="preserve">Match to the 2005 table; check terms</w:t>
             </w:r>
           </w:p>
         </w:tc>
@@ -28614,7 +28904,7 @@
                 <w:szCs w:val="19"/>
                 <w:rtl w:val="false"/>
               </w:rPr>
-              <w:t xml:space="preserve">Unverified; versions have 10 or 13 items</w:t>
+              <w:t xml:space="preserve">VERIFIED against the original paper (Table 3, p. 1428): nine traits, 10 final items (5 internalization + 5 symbolization); items 1, 2, 4(R), 5(R), 7 = MI1–MI5. 5-point, strongly disagree to strongly agree. Only internalization is used here</w:t>
             </w:r>
           </w:p>
         </w:tc>
@@ -28648,7 +28938,7 @@
                 <w:szCs w:val="19"/>
                 <w:rtl w:val="false"/>
               </w:rPr>
-              <w:t xml:space="preserve">Match</w:t>
+              <w:t xml:space="preserve">Report that only the internalization subscale was used</w:t>
             </w:r>
           </w:p>
         </w:tc>
@@ -28722,7 +29012,7 @@
                 <w:szCs w:val="19"/>
                 <w:rtl w:val="false"/>
               </w:rPr>
-              <w:t xml:space="preserve">Lord &amp; DeZoort (2001); Tsunogaya et al. (2017)</w:t>
+              <w:t xml:space="preserve">DeZoort &amp; Lord (1994); Lord &amp; DeZoort (2001); Tsunogaya et al. (2017)</w:t>
             </w:r>
           </w:p>
         </w:tc>
@@ -28790,7 +29080,7 @@
                 <w:szCs w:val="19"/>
                 <w:rtl w:val="false"/>
               </w:rPr>
-              <w:t xml:space="preserve">Item text not available</w:t>
+              <w:t xml:space="preserve">Items not found. The Tsunogaya abstract only confirms the construct. In this literature obedience pressure is often manipulated through scenarios</w:t>
             </w:r>
           </w:p>
         </w:tc>
@@ -28824,7 +29114,7 @@
                 <w:szCs w:val="19"/>
                 <w:rtl w:val="false"/>
               </w:rPr>
-              <w:t xml:space="preserve">Need source text</w:t>
+              <w:t xml:space="preserve">Check the Tsunogaya Methods; Situation 2 may suffice</w:t>
             </w:r>
           </w:p>
         </w:tc>
@@ -30331,7 +30621,7 @@
                 <w:szCs w:val="19"/>
                 <w:rtl w:val="false"/>
               </w:rPr>
-              <w:t xml:space="preserve">Burnout</w:t>
+              <w:t xml:space="preserve">Work-related burnout</w:t>
             </w:r>
           </w:p>
         </w:tc>
@@ -30433,7 +30723,7 @@
                 <w:szCs w:val="19"/>
                 <w:rtl w:val="false"/>
               </w:rPr>
-              <w:t xml:space="preserve">5-pt frequency</w:t>
+              <w:t xml:space="preserve">5-pt (intensity/frequency)</w:t>
             </w:r>
           </w:p>
         </w:tc>
@@ -30501,7 +30791,7 @@
                 <w:szCs w:val="19"/>
                 <w:rtl w:val="false"/>
               </w:rPr>
-              <w:t xml:space="preserve">EX7 reversed</w:t>
+              <w:t xml:space="preserve">EX7 reversed; 1–5 ≈ 0–100</w:t>
             </w:r>
           </w:p>
         </w:tc>
@@ -32436,7 +32726,7 @@
           <w:sz w:val="20"/>
           <w:szCs w:val="20"/>
         </w:rPr>
-        <w:t xml:space="preserve">Lord, A. T., &amp; DeZoort, F. T. (2001). The impact of commitment and moral reasoning on auditors' responses to social influence pressure. Accounting, Organizations and Society, 26(3), 215–235. (?)</w:t>
+        <w:t xml:space="preserve">Lord, A. T., &amp; DeZoort, F. T. (2001). The impact of commitment and moral reasoning on auditors' responses to social influence pressure. Accounting, Organizations and Society, 26(3), 215–235. https://doi.org/10.1016/S0361-3682(00)00022-2 (DOI per your note; ?)</w:t>
       </w:r>
     </w:p>
     <w:p>
@@ -32541,7 +32831,7 @@
           <w:sz w:val="20"/>
           <w:szCs w:val="20"/>
         </w:rPr>
-        <w:t xml:space="preserve">Tsunogaya, N., Sugahara, S., &amp; Chand, P. (2017). The impact of social influence pressures, commitment, and personality on judgments by auditors: Evidence from Japan. Journal of International Accounting Research, 16(3), 17–34. (title as given in your note; ?)</w:t>
+        <w:t xml:space="preserve">Tsunogaya, N., Sugahara, S., &amp; Chand, P. (2017). The impact of social influence pressures, commitment, and personality on judgments by auditors: Evidence from Japan. Journal of International Accounting Research, 16(3), 17–34. </w:t>
       </w:r>
     </w:p>
     <w:sectPr>

</xml_diff>

<commit_message>
Add DOIs for Moore, Tsunogaya, Kristensen and Lord & DeZoort
Co-Authored-By: Claude Sonnet 5.5 <noreply@anthropic.com>
Claude-Session: https://claude.ai/code/session_0117HPg2G3CcnRnb2QXnVBy9
</commit_message>
<xml_diff>
--- a/questionnaire-v3-en.docx
+++ b/questionnaire-v3-en.docx
@@ -32696,7 +32696,7 @@
           <w:sz w:val="20"/>
           <w:szCs w:val="20"/>
         </w:rPr>
-        <w:t xml:space="preserve">Kristensen, T. S., Borritz, M., Villadsen, E., &amp; Christensen, K. B. (2005). The Copenhagen Burnout Inventory: A new tool for the assessment of burnout. Work &amp; Stress, 19(3), 192–207.</w:t>
+        <w:t xml:space="preserve">Kristensen, T. S., Borritz, M., Villadsen, E., &amp; Christensen, K. B. (2005). The Copenhagen Burnout Inventory: A new tool for the assessment of burnout. Work &amp; Stress, 19(3), 192–207. https://doi.org/10.1080/02678370500297720</w:t>
       </w:r>
     </w:p>
     <w:p>
@@ -32726,7 +32726,7 @@
           <w:sz w:val="20"/>
           <w:szCs w:val="20"/>
         </w:rPr>
-        <w:t xml:space="preserve">Lord, A. T., &amp; DeZoort, F. T. (2001). The impact of commitment and moral reasoning on auditors' responses to social influence pressure. Accounting, Organizations and Society, 26(3), 215–235. https://doi.org/10.1016/S0361-3682(00)00022-2 (DOI per your note; ?)</w:t>
+        <w:t xml:space="preserve">Lord, A. T., &amp; DeZoort, F. T. (2001). The impact of commitment and moral reasoning on auditors' responses to social influence pressure. Accounting, Organizations and Society, 26(3), 215–235. https://doi.org/10.1016/S0361-3682(00)00022-2</w:t>
       </w:r>
     </w:p>
     <w:p>
@@ -32771,7 +32771,7 @@
           <w:sz w:val="20"/>
           <w:szCs w:val="20"/>
         </w:rPr>
-        <w:t xml:space="preserve">Moore, C., Detert, J. R., Treviño, L. K., Baker, V. L., &amp; Mayer, D. M. (2012). Why employees do bad things: Moral disengagement and unethical organizational behavior. Personnel Psychology, 65(1), 1–48.</w:t>
+        <w:t xml:space="preserve">Moore, C., Detert, J. R., Treviño, L. K., Baker, V. L., &amp; Mayer, D. M. (2012). Why employees do bad things: Moral disengagement and unethical organizational behavior. Personnel Psychology, 65(1), 1–48. https://doi.org/10.1111/j.1744-6570.2011.01237.x</w:t>
       </w:r>
     </w:p>
     <w:p>
@@ -32831,7 +32831,7 @@
           <w:sz w:val="20"/>
           <w:szCs w:val="20"/>
         </w:rPr>
-        <w:t xml:space="preserve">Tsunogaya, N., Sugahara, S., &amp; Chand, P. (2017). The impact of social influence pressures, commitment, and personality on judgments by auditors: Evidence from Japan. Journal of International Accounting Research, 16(3), 17–34. </w:t>
+        <w:t xml:space="preserve">Tsunogaya, N., Sugahara, S., &amp; Chand, P. (2017). The impact of social influence pressures, commitment, and personality on judgments by auditors: Evidence from Japan. Journal of International Accounting Research, 16(3), 17–34. https://doi.org/10.2308/jiar-51761</w:t>
       </w:r>
     </w:p>
     <w:sectPr>

</xml_diff>